<commit_message>
Estratégia fornecedor distribui / feirante usa grátis: documentação (seções 7 e 8 + PDF), submissão, guia e trecho do piloto no vídeo
</commit_message>
<xml_diff>
--- a/Documentacao/GIRO - Receitas programaveis e confianca comercial para pequenos negocios.docx
+++ b/Documentacao/GIRO - Receitas programaveis e confianca comercial para pequenos negocios.docx
@@ -1447,7 +1447,7 @@
         <w:rPr>
           <w:rFonts w:ascii="Times New Roman" w:eastAsia="Times New Roman" w:hAnsi="Times New Roman" w:cs="Times New Roman"/>
         </w:rPr>
-        <w:t>&gt; 18 acordos concluídos;</w:t>
+        <w:t>18 acordos concluídos;</w:t>
       </w:r>
     </w:p>
     <w:p>
@@ -1641,7 +1641,7 @@
         <w:rPr>
           <w:rFonts w:ascii="Times New Roman" w:eastAsia="Times New Roman" w:hAnsi="Times New Roman" w:cs="Times New Roman"/>
         </w:rPr>
-        <w:t>&gt; “Pode vender para ela, ela sempre paga.”</w:t>
+        <w:t>“Pode vender para ela, ela sempre paga.”</w:t>
       </w:r>
     </w:p>
     <w:p>
@@ -1826,7 +1826,7 @@
         <w:rPr>
           <w:rFonts w:ascii="Times New Roman" w:eastAsia="Times New Roman" w:hAnsi="Times New Roman" w:cs="Times New Roman"/>
         </w:rPr>
-        <w:t>&gt; Quanto eu recebi?</w:t>
+        <w:t>Quanto eu recebi?</w:t>
       </w:r>
     </w:p>
     <w:p>
@@ -2101,277 +2101,417 @@
         <w:rPr>
           <w:rFonts w:ascii="Times New Roman" w:eastAsia="Times New Roman" w:hAnsi="Times New Roman" w:cs="Times New Roman"/>
         </w:rPr>
-        <w:t>\[</w:t>
-      </w:r>
-    </w:p>
-    <w:p>
-      <w:pPr>
-        <w:rPr>
-          <w:rFonts w:ascii="Times New Roman" w:eastAsia="Times New Roman" w:hAnsi="Times New Roman" w:cs="Times New Roman"/>
-        </w:rPr>
-      </w:pPr>
-      <w:r>
-        <w:rPr>
-          <w:rFonts w:ascii="Times New Roman" w:eastAsia="Times New Roman" w:hAnsi="Times New Roman" w:cs="Times New Roman"/>
-        </w:rPr>
-        <w:t>trabalho</w:t>
-      </w:r>
-    </w:p>
-    <w:p>
-      <w:pPr>
-        <w:rPr>
-          <w:rFonts w:ascii="Times New Roman" w:eastAsia="Times New Roman" w:hAnsi="Times New Roman" w:cs="Times New Roman"/>
-        </w:rPr>
-      </w:pPr>
-      <w:r>
-        <w:rPr>
-          <w:rFonts w:ascii="Times New Roman" w:eastAsia="Times New Roman" w:hAnsi="Times New Roman" w:cs="Times New Roman"/>
-        </w:rPr>
-        <w:t>\</w:t>
+        <w:t>trabalho → vendas → compromissos cumpridos → histórico verificável → maior confiança em futuras negociações</w:t>
+      </w:r>
+    </w:p>
+    <w:p>
+      <w:pPr>
+        <w:rPr>
+          <w:rFonts w:ascii="Times New Roman" w:eastAsia="Times New Roman" w:hAnsi="Times New Roman" w:cs="Times New Roman"/>
+        </w:rPr>
+      </w:pPr>
+    </w:p>
+    <w:p>
+      <w:pPr>
+        <w:rPr>
+          <w:rFonts w:ascii="Times New Roman" w:eastAsia="Times New Roman" w:hAnsi="Times New Roman" w:cs="Times New Roman"/>
+        </w:rPr>
+      </w:pPr>
+      <w:r>
+        <w:rPr>
+          <w:rFonts w:ascii="Times New Roman" w:eastAsia="Times New Roman" w:hAnsi="Times New Roman" w:cs="Times New Roman"/>
+        </w:rPr>
+        <w:t>Isso pode reduzir a dependência exclusiva de relações pessoais para demonstrar confiabilidade.</w:t>
+      </w:r>
+    </w:p>
+    <w:p>
+      <w:pPr>
+        <w:rPr>
+          <w:rFonts w:ascii="Times New Roman" w:eastAsia="Times New Roman" w:hAnsi="Times New Roman" w:cs="Times New Roman"/>
+        </w:rPr>
+      </w:pPr>
+    </w:p>
+    <w:p>
+      <w:pPr>
+        <w:rPr>
+          <w:rFonts w:ascii="Times New Roman" w:eastAsia="Times New Roman" w:hAnsi="Times New Roman" w:cs="Times New Roman"/>
+        </w:rPr>
+      </w:pPr>
+      <w:r>
+        <w:rPr>
+          <w:rFonts w:ascii="Times New Roman" w:eastAsia="Times New Roman" w:hAnsi="Times New Roman" w:cs="Times New Roman"/>
+        </w:rPr>
+        <w:t>Também ajuda o pequeno empreendedor a distinguir dinheiro que entrou de dinheiro realmente disponível, reduzindo um problema comum de organização financeira.</w:t>
+      </w:r>
+    </w:p>
+    <w:p>
+      <w:pPr>
+        <w:rPr>
+          <w:rFonts w:ascii="Times New Roman" w:eastAsia="Times New Roman" w:hAnsi="Times New Roman" w:cs="Times New Roman"/>
+        </w:rPr>
+      </w:pPr>
+    </w:p>
+    <w:p>
+      <w:pPr>
+        <w:rPr>
+          <w:rFonts w:ascii="Times New Roman" w:eastAsia="Times New Roman" w:hAnsi="Times New Roman" w:cs="Times New Roman"/>
+        </w:rPr>
+      </w:pPr>
+      <w:r>
+        <w:rPr>
+          <w:rFonts w:ascii="Times New Roman" w:eastAsia="Times New Roman" w:hAnsi="Times New Roman" w:cs="Times New Roman"/>
+        </w:rPr>
+        <w:t>O projeto não promete conceder crédito automaticamente nem substituir a análise do fornecedor. A decisão de vender a prazo continua pertencendo às partes.</w:t>
+      </w:r>
+    </w:p>
+    <w:p>
+      <w:pPr>
+        <w:rPr>
+          <w:rFonts w:ascii="Times New Roman" w:eastAsia="Times New Roman" w:hAnsi="Times New Roman" w:cs="Times New Roman"/>
+        </w:rPr>
+      </w:pPr>
+    </w:p>
+    <w:p>
+      <w:pPr>
+        <w:rPr>
+          <w:rFonts w:ascii="Times New Roman" w:eastAsia="Times New Roman" w:hAnsi="Times New Roman" w:cs="Times New Roman"/>
+        </w:rPr>
+      </w:pPr>
+      <w:r>
+        <w:rPr>
+          <w:rFonts w:ascii="Times New Roman" w:eastAsia="Times New Roman" w:hAnsi="Times New Roman" w:cs="Times New Roman"/>
+        </w:rPr>
+        <w:t>O que o GIRO oferece é informação verificável para que essa decisão seja tomada com mais evidências.</w:t>
+      </w:r>
+    </w:p>
+    <w:p>
+      <w:pPr>
+        <w:rPr>
+          <w:rFonts w:ascii="Times New Roman" w:eastAsia="Times New Roman" w:hAnsi="Times New Roman" w:cs="Times New Roman"/>
+        </w:rPr>
+      </w:pPr>
+    </w:p>
+    <w:p>
+      <w:pPr>
+        <w:numPr>
+          <w:ilvl w:val="0"/>
+          <w:numId w:val="2"/>
+        </w:numPr>
+        <w:rPr>
+          <w:rFonts w:ascii="Times New Roman" w:eastAsia="Times New Roman" w:hAnsi="Times New Roman" w:cs="Times New Roman"/>
+          <w:b/>
+          <w:bCs/>
+        </w:rPr>
+      </w:pPr>
+      <w:r>
+        <w:rPr>
+          <w:rFonts w:ascii="Times New Roman" w:eastAsia="Times New Roman" w:hAnsi="Times New Roman" w:cs="Times New Roman"/>
+          <w:b/>
+          <w:bCs/>
+        </w:rPr>
+        <w:t>Quem ganha, quem adota e quem paga</w:t>
+      </w:r>
+    </w:p>
+    <w:p>
+      <w:pPr>
+        <w:rPr>
+          <w:rFonts w:ascii="Times New Roman" w:eastAsia="Times New Roman" w:hAnsi="Times New Roman" w:cs="Times New Roman"/>
+        </w:rPr>
+      </w:pPr>
+    </w:p>
+    <w:p>
+      <w:pPr>
+        <w:rPr>
+          <w:rFonts w:ascii="Times New Roman" w:eastAsia="Times New Roman" w:hAnsi="Times New Roman" w:cs="Times New Roman"/>
+        </w:rPr>
+      </w:pPr>
+      <w:r>
+        <w:rPr>
+          <w:rFonts w:ascii="Times New Roman" w:eastAsia="Times New Roman" w:hAnsi="Times New Roman" w:cs="Times New Roman"/>
+        </w:rPr>
+        <w:t>O GIRO tem dois lados, e cada um ganha algo diferente.</w:t>
+      </w:r>
+    </w:p>
+    <w:p>
+      <w:pPr>
+        <w:rPr>
+          <w:rFonts w:ascii="Times New Roman" w:eastAsia="Times New Roman" w:hAnsi="Times New Roman" w:cs="Times New Roman"/>
+        </w:rPr>
+      </w:pPr>
+    </w:p>
+    <w:p>
+      <w:pPr>
+        <w:rPr>
+          <w:rFonts w:ascii="Times New Roman" w:eastAsia="Times New Roman" w:hAnsi="Times New Roman" w:cs="Times New Roman"/>
+        </w:rPr>
+      </w:pPr>
+      <w:r>
+        <w:rPr>
+          <w:rFonts w:ascii="Times New Roman" w:eastAsia="Times New Roman" w:hAnsi="Times New Roman" w:cs="Times New Roman"/>
+        </w:rPr>
+        <w:t>O fornecedor ganha o benefício mais direto: recebe no prazo combinado, sem precisar cobrar, e enxerga com evidências quem cumpre os compromissos. É ele quem sente a dor do atraso e do calote.</w:t>
+      </w:r>
+    </w:p>
+    <w:p>
+      <w:pPr>
+        <w:rPr>
+          <w:rFonts w:ascii="Times New Roman" w:eastAsia="Times New Roman" w:hAnsi="Times New Roman" w:cs="Times New Roman"/>
+        </w:rPr>
+      </w:pPr>
+    </w:p>
+    <w:p>
+      <w:pPr>
+        <w:rPr>
+          <w:rFonts w:ascii="Times New Roman" w:eastAsia="Times New Roman" w:hAnsi="Times New Roman" w:cs="Times New Roman"/>
+        </w:rPr>
+      </w:pPr>
+      <w:r>
+        <w:rPr>
+          <w:rFonts w:ascii="Times New Roman" w:eastAsia="Times New Roman" w:hAnsi="Times New Roman" w:cs="Times New Roman"/>
+        </w:rPr>
+        <w:t>O feirante ganha organização desde o primeiro dia, mesmo sozinho: saber quanto entrou, quanto já tem destino e quanto está realmente livre. Com o tempo, ganha também um histórico que pode virar condições melhores: mais prazo, mais limite, preço melhor ou a confiança de um fornecedor novo.</w:t>
+      </w:r>
+    </w:p>
+    <w:p>
+      <w:pPr>
+        <w:rPr>
+          <w:rFonts w:ascii="Times New Roman" w:eastAsia="Times New Roman" w:hAnsi="Times New Roman" w:cs="Times New Roman"/>
+        </w:rPr>
+      </w:pPr>
+    </w:p>
+    <w:p>
+      <w:pPr>
+        <w:rPr>
+          <w:rFonts w:ascii="Times New Roman" w:eastAsia="Times New Roman" w:hAnsi="Times New Roman" w:cs="Times New Roman"/>
+        </w:rPr>
+      </w:pPr>
+      <w:r>
+        <w:rPr>
+          <w:rFonts w:ascii="Times New Roman" w:eastAsia="Times New Roman" w:hAnsi="Times New Roman" w:cs="Times New Roman"/>
+        </w:rPr>
+        <w:t>Por isso a estratégia de entrada é: o fornecedor distribui, o feirante cria o hábito.</w:t>
+      </w:r>
+    </w:p>
+    <w:p>
+      <w:pPr>
+        <w:rPr>
+          <w:rFonts w:ascii="Times New Roman" w:eastAsia="Times New Roman" w:hAnsi="Times New Roman" w:cs="Times New Roman"/>
+        </w:rPr>
+      </w:pPr>
+    </w:p>
+    <w:p>
+      <w:pPr>
+        <w:rPr>
+          <w:rFonts w:ascii="Times New Roman" w:eastAsia="Times New Roman" w:hAnsi="Times New Roman" w:cs="Times New Roman"/>
+        </w:rPr>
+      </w:pPr>
+      <w:r>
+        <w:rPr>
+          <w:rFonts w:ascii="Times New Roman" w:eastAsia="Times New Roman" w:hAnsi="Times New Roman" w:cs="Times New Roman"/>
+        </w:rPr>
+        <w:t>•  Um fornecedor atende dezenas de feirantes. Convencer um fornecedor traz vários usuários de uma vez, e é ele quem convida: “use o GIRO comigo”.</w:t>
+      </w:r>
+    </w:p>
+    <w:p>
+      <w:pPr>
+        <w:rPr>
+          <w:rFonts w:ascii="Times New Roman" w:eastAsia="Times New Roman" w:hAnsi="Times New Roman" w:cs="Times New Roman"/>
+        </w:rPr>
+      </w:pPr>
+      <w:r>
+        <w:rPr>
+          <w:rFonts w:ascii="Times New Roman" w:eastAsia="Times New Roman" w:hAnsi="Times New Roman" w:cs="Times New Roman"/>
+        </w:rPr>
+        <w:t>•  O feirante permanece porque a parte de organização é útil sem depender do fornecedor.</w:t>
+      </w:r>
+    </w:p>
+    <w:p>
+      <w:pPr>
+        <w:rPr>
+          <w:rFonts w:ascii="Times New Roman" w:eastAsia="Times New Roman" w:hAnsi="Times New Roman" w:cs="Times New Roman"/>
+        </w:rPr>
+      </w:pPr>
+      <w:r>
+        <w:rPr>
+          <w:rFonts w:ascii="Times New Roman" w:eastAsia="Times New Roman" w:hAnsi="Times New Roman" w:cs="Times New Roman"/>
+        </w:rPr>
+        <w:t>•  O fornecedor oferece uma vantagem concreta a quem usa o GIRO, como alguns dias a mais de prazo, limite maior ou um pequeno desconto.</w:t>
+      </w:r>
+    </w:p>
+    <w:p>
+      <w:pPr>
+        <w:rPr>
+          <w:rFonts w:ascii="Times New Roman" w:eastAsia="Times New Roman" w:hAnsi="Times New Roman" w:cs="Times New Roman"/>
+        </w:rPr>
+      </w:pPr>
+      <w:r>
+        <w:rPr>
+          <w:rFonts w:ascii="Times New Roman" w:eastAsia="Times New Roman" w:hAnsi="Times New Roman" w:cs="Times New Roman"/>
+        </w:rPr>
+        <w:t>•  Quem paga é o fornecedor (assinatura ou valor por acordo acompanhado), porque é ele quem reduz atrasos e custo de cobrança. Para o feirante, o GIRO é gratuito.</w:t>
+      </w:r>
+    </w:p>
+    <w:p>
+      <w:pPr>
+        <w:rPr>
+          <w:rFonts w:ascii="Times New Roman" w:eastAsia="Times New Roman" w:hAnsi="Times New Roman" w:cs="Times New Roman"/>
+        </w:rPr>
+      </w:pPr>
+    </w:p>
+    <w:p>
+      <w:pPr>
+        <w:numPr>
+          <w:ilvl w:val="0"/>
+          <w:numId w:val="2"/>
+        </w:numPr>
+        <w:rPr>
+          <w:rFonts w:ascii="Times New Roman" w:eastAsia="Times New Roman" w:hAnsi="Times New Roman" w:cs="Times New Roman"/>
+          <w:b/>
+          <w:bCs/>
+        </w:rPr>
+      </w:pPr>
+      <w:r>
+        <w:rPr>
+          <w:rFonts w:ascii="Times New Roman" w:eastAsia="Times New Roman" w:hAnsi="Times New Roman" w:cs="Times New Roman"/>
+          <w:b/>
+          <w:bCs/>
+        </w:rPr>
+        <w:t>Projeto piloto</w:t>
+      </w:r>
+    </w:p>
+    <w:p>
+      <w:pPr>
+        <w:rPr>
+          <w:rFonts w:ascii="Times New Roman" w:eastAsia="Times New Roman" w:hAnsi="Times New Roman" w:cs="Times New Roman"/>
+        </w:rPr>
+      </w:pPr>
+    </w:p>
+    <w:p>
+      <w:pPr>
+        <w:rPr>
+          <w:rFonts w:ascii="Times New Roman" w:eastAsia="Times New Roman" w:hAnsi="Times New Roman" w:cs="Times New Roman"/>
+        </w:rPr>
+      </w:pPr>
+      <w:r>
+        <w:rPr>
+          <w:rFonts w:ascii="Times New Roman" w:eastAsia="Times New Roman" w:hAnsi="Times New Roman" w:cs="Times New Roman"/>
+        </w:rPr>
+        <w:t>•  Duração: 2 meses, em 3 feiras.</w:t>
+      </w:r>
+    </w:p>
+    <w:p>
+      <w:pPr>
+        <w:rPr>
+          <w:rFonts w:ascii="Times New Roman" w:eastAsia="Times New Roman" w:hAnsi="Times New Roman" w:cs="Times New Roman"/>
+        </w:rPr>
+      </w:pPr>
+      <w:r>
+        <w:rPr>
+          <w:rFonts w:ascii="Times New Roman" w:eastAsia="Times New Roman" w:hAnsi="Times New Roman" w:cs="Times New Roman"/>
+        </w:rPr>
+        <w:t>•  Participantes: 3 fornecedores e 12 feirantes clientes deles (4 por fornecedor).</w:t>
+      </w:r>
+    </w:p>
+    <w:p>
+      <w:pPr>
+        <w:rPr>
+          <w:rFonts w:ascii="Times New Roman" w:eastAsia="Times New Roman" w:hAnsi="Times New Roman" w:cs="Times New Roman"/>
+        </w:rPr>
+      </w:pPr>
+      <w:r>
+        <w:rPr>
+          <w:rFonts w:ascii="Times New Roman" w:eastAsia="Times New Roman" w:hAnsi="Times New Roman" w:cs="Times New Roman"/>
+        </w:rPr>
+        <w:t>•  Oferta: gratuito durante o piloto, com acompanhamento de perto; cada fornecedor oferece uma condição melhor para quem usar o GIRO.</w:t>
+      </w:r>
+    </w:p>
+    <w:p>
+      <w:pPr>
+        <w:rPr>
+          <w:rFonts w:ascii="Times New Roman" w:eastAsia="Times New Roman" w:hAnsi="Times New Roman" w:cs="Times New Roman"/>
+        </w:rPr>
+      </w:pPr>
+      <w:r>
+        <w:rPr>
+          <w:rFonts w:ascii="Times New Roman" w:eastAsia="Times New Roman" w:hAnsi="Times New Roman" w:cs="Times New Roman"/>
+        </w:rPr>
+        <w:t>•  O que medir no fornecedor: atraso médio antes e depois, tempo gasto cobrando, se concederia mais prazo ou limite com base no histórico e quanto pagaria pelo serviço.</w:t>
+      </w:r>
+    </w:p>
+    <w:p>
+      <w:pPr>
+        <w:rPr>
+          <w:rFonts w:ascii="Times New Roman" w:eastAsia="Times New Roman" w:hAnsi="Times New Roman" w:cs="Times New Roman"/>
+        </w:rPr>
+      </w:pPr>
+      <w:r>
+        <w:rPr>
+          <w:rFonts w:ascii="Times New Roman" w:eastAsia="Times New Roman" w:hAnsi="Times New Roman" w:cs="Times New Roman"/>
+        </w:rPr>
+        <w:t>•  O que medir no feirante: uso semanal sem pedido do fornecedor, se sabe dizer quanto pode gastar, se obteve condição melhor e se indicou outra pessoa.</w:t>
+      </w:r>
+    </w:p>
+    <w:p>
+      <w:pPr>
+        <w:rPr>
+          <w:rFonts w:ascii="Times New Roman" w:eastAsia="Times New Roman" w:hAnsi="Times New Roman" w:cs="Times New Roman"/>
+        </w:rPr>
+      </w:pPr>
+    </w:p>
+    <w:p>
+      <w:pPr>
+        <w:rPr>
+          <w:rFonts w:ascii="Times New Roman" w:eastAsia="Times New Roman" w:hAnsi="Times New Roman" w:cs="Times New Roman"/>
+        </w:rPr>
+      </w:pPr>
+      <w:r>
+        <w:rPr>
+          <w:rFonts w:ascii="Times New Roman" w:eastAsia="Times New Roman" w:hAnsi="Times New Roman" w:cs="Times New Roman"/>
+        </w:rPr>
+        <w:t>Hipótese principal: um fornecedor melhora as condições comerciais com base no histórico do GIRO. Se isso se confirmar, o modelo se sustenta: o fornecedor paga pelo valor que recebe e o feirante ganha acesso a condições melhores.</w:t>
+      </w:r>
+    </w:p>
+    <w:p>
+      <w:pPr>
+        <w:rPr>
+          <w:rFonts w:ascii="Times New Roman" w:eastAsia="Times New Roman" w:hAnsi="Times New Roman" w:cs="Times New Roman"/>
+        </w:rPr>
+      </w:pPr>
+    </w:p>
+    <w:p>
+      <w:pPr>
+        <w:rPr>
+          <w:rFonts w:ascii="Times New Roman" w:eastAsia="Times New Roman" w:hAnsi="Times New Roman" w:cs="Times New Roman"/>
+        </w:rPr>
+      </w:pPr>
+    </w:p>
+    <w:p>
+      <w:pPr>
+        <w:rPr>
+          <w:rFonts w:ascii="Times New Roman" w:eastAsia="Times New Roman" w:hAnsi="Times New Roman" w:cs="Times New Roman"/>
+        </w:rPr>
+      </w:pPr>
+    </w:p>
+    <w:p>
+      <w:pPr>
+        <w:rPr>
+          <w:rFonts w:ascii="Times New Roman" w:eastAsia="Times New Roman" w:hAnsi="Times New Roman" w:cs="Times New Roman"/>
+        </w:rPr>
+      </w:pPr>
+      <w:r>
+        <w:rPr>
+          <w:rFonts w:ascii="Times New Roman" w:eastAsia="Times New Roman" w:hAnsi="Times New Roman" w:cs="Times New Roman"/>
+        </w:rPr>
+        <w:t xml:space="preserve">O que defenderemos no </w:t>
       </w:r>
       <w:proofErr w:type="spellStart"/>
       <w:r>
         <w:rPr>
           <w:rFonts w:ascii="Times New Roman" w:eastAsia="Times New Roman" w:hAnsi="Times New Roman" w:cs="Times New Roman"/>
         </w:rPr>
-        <w:t>rightarrow</w:t>
+        <w:t>hackathon</w:t>
       </w:r>
       <w:proofErr w:type="spellEnd"/>
-      <w:r>
-        <w:rPr>
-          <w:rFonts w:ascii="Times New Roman" w:eastAsia="Times New Roman" w:hAnsi="Times New Roman" w:cs="Times New Roman"/>
-        </w:rPr>
-        <w:t xml:space="preserve"> vendas</w:t>
-      </w:r>
-    </w:p>
-    <w:p>
-      <w:pPr>
-        <w:rPr>
-          <w:rFonts w:ascii="Times New Roman" w:eastAsia="Times New Roman" w:hAnsi="Times New Roman" w:cs="Times New Roman"/>
-        </w:rPr>
-      </w:pPr>
-      <w:r>
-        <w:rPr>
-          <w:rFonts w:ascii="Times New Roman" w:eastAsia="Times New Roman" w:hAnsi="Times New Roman" w:cs="Times New Roman"/>
-        </w:rPr>
-        <w:t>\</w:t>
-      </w:r>
-      <w:proofErr w:type="spellStart"/>
-      <w:r>
-        <w:rPr>
-          <w:rFonts w:ascii="Times New Roman" w:eastAsia="Times New Roman" w:hAnsi="Times New Roman" w:cs="Times New Roman"/>
-        </w:rPr>
-        <w:t>rightarrow</w:t>
-      </w:r>
-      <w:proofErr w:type="spellEnd"/>
-      <w:r>
-        <w:rPr>
-          <w:rFonts w:ascii="Times New Roman" w:eastAsia="Times New Roman" w:hAnsi="Times New Roman" w:cs="Times New Roman"/>
-        </w:rPr>
-        <w:t xml:space="preserve"> compromissos cumpridos</w:t>
-      </w:r>
-    </w:p>
-    <w:p>
-      <w:pPr>
-        <w:rPr>
-          <w:rFonts w:ascii="Times New Roman" w:eastAsia="Times New Roman" w:hAnsi="Times New Roman" w:cs="Times New Roman"/>
-        </w:rPr>
-      </w:pPr>
-      <w:r>
-        <w:rPr>
-          <w:rFonts w:ascii="Times New Roman" w:eastAsia="Times New Roman" w:hAnsi="Times New Roman" w:cs="Times New Roman"/>
-        </w:rPr>
-        <w:t>\</w:t>
-      </w:r>
-      <w:proofErr w:type="spellStart"/>
-      <w:r>
-        <w:rPr>
-          <w:rFonts w:ascii="Times New Roman" w:eastAsia="Times New Roman" w:hAnsi="Times New Roman" w:cs="Times New Roman"/>
-        </w:rPr>
-        <w:t>rightarrow</w:t>
-      </w:r>
-      <w:proofErr w:type="spellEnd"/>
-      <w:r>
-        <w:rPr>
-          <w:rFonts w:ascii="Times New Roman" w:eastAsia="Times New Roman" w:hAnsi="Times New Roman" w:cs="Times New Roman"/>
-        </w:rPr>
-        <w:t xml:space="preserve"> histórico verificável</w:t>
-      </w:r>
-    </w:p>
-    <w:p>
-      <w:pPr>
-        <w:rPr>
-          <w:rFonts w:ascii="Times New Roman" w:eastAsia="Times New Roman" w:hAnsi="Times New Roman" w:cs="Times New Roman"/>
-        </w:rPr>
-      </w:pPr>
-      <w:r>
-        <w:rPr>
-          <w:rFonts w:ascii="Times New Roman" w:eastAsia="Times New Roman" w:hAnsi="Times New Roman" w:cs="Times New Roman"/>
-        </w:rPr>
-        <w:t>\</w:t>
-      </w:r>
-      <w:proofErr w:type="spellStart"/>
-      <w:r>
-        <w:rPr>
-          <w:rFonts w:ascii="Times New Roman" w:eastAsia="Times New Roman" w:hAnsi="Times New Roman" w:cs="Times New Roman"/>
-        </w:rPr>
-        <w:t>rightarrow</w:t>
-      </w:r>
-      <w:proofErr w:type="spellEnd"/>
-      <w:r>
-        <w:rPr>
-          <w:rFonts w:ascii="Times New Roman" w:eastAsia="Times New Roman" w:hAnsi="Times New Roman" w:cs="Times New Roman"/>
-        </w:rPr>
-        <w:t xml:space="preserve"> maior confiança em futuras negociações</w:t>
-      </w:r>
-    </w:p>
-    <w:p>
-      <w:pPr>
-        <w:rPr>
-          <w:rFonts w:ascii="Times New Roman" w:eastAsia="Times New Roman" w:hAnsi="Times New Roman" w:cs="Times New Roman"/>
-        </w:rPr>
-      </w:pPr>
-      <w:r>
-        <w:rPr>
-          <w:rFonts w:ascii="Times New Roman" w:eastAsia="Times New Roman" w:hAnsi="Times New Roman" w:cs="Times New Roman"/>
-        </w:rPr>
-        <w:t>\]</w:t>
-      </w:r>
-    </w:p>
-    <w:p>
-      <w:pPr>
-        <w:rPr>
-          <w:rFonts w:ascii="Times New Roman" w:eastAsia="Times New Roman" w:hAnsi="Times New Roman" w:cs="Times New Roman"/>
-        </w:rPr>
-      </w:pPr>
-    </w:p>
-    <w:p>
-      <w:pPr>
-        <w:rPr>
-          <w:rFonts w:ascii="Times New Roman" w:eastAsia="Times New Roman" w:hAnsi="Times New Roman" w:cs="Times New Roman"/>
-        </w:rPr>
-      </w:pPr>
-      <w:r>
-        <w:rPr>
-          <w:rFonts w:ascii="Times New Roman" w:eastAsia="Times New Roman" w:hAnsi="Times New Roman" w:cs="Times New Roman"/>
-        </w:rPr>
-        <w:t>Isso pode reduzir a dependência exclusiva de relações pessoais para demonstrar confiabilidade.</w:t>
-      </w:r>
-    </w:p>
-    <w:p>
-      <w:pPr>
-        <w:rPr>
-          <w:rFonts w:ascii="Times New Roman" w:eastAsia="Times New Roman" w:hAnsi="Times New Roman" w:cs="Times New Roman"/>
-        </w:rPr>
-      </w:pPr>
-    </w:p>
-    <w:p>
-      <w:pPr>
-        <w:rPr>
-          <w:rFonts w:ascii="Times New Roman" w:eastAsia="Times New Roman" w:hAnsi="Times New Roman" w:cs="Times New Roman"/>
-        </w:rPr>
-      </w:pPr>
-      <w:r>
-        <w:rPr>
-          <w:rFonts w:ascii="Times New Roman" w:eastAsia="Times New Roman" w:hAnsi="Times New Roman" w:cs="Times New Roman"/>
-        </w:rPr>
-        <w:t>Também ajuda o pequeno empreendedor a distinguir dinheiro que entrou de dinheiro realmente disponível, reduzindo um problema comum de organização financeira.</w:t>
-      </w:r>
-    </w:p>
-    <w:p>
-      <w:pPr>
-        <w:rPr>
-          <w:rFonts w:ascii="Times New Roman" w:eastAsia="Times New Roman" w:hAnsi="Times New Roman" w:cs="Times New Roman"/>
-        </w:rPr>
-      </w:pPr>
-    </w:p>
-    <w:p>
-      <w:pPr>
-        <w:rPr>
-          <w:rFonts w:ascii="Times New Roman" w:eastAsia="Times New Roman" w:hAnsi="Times New Roman" w:cs="Times New Roman"/>
-        </w:rPr>
-      </w:pPr>
-      <w:r>
-        <w:rPr>
-          <w:rFonts w:ascii="Times New Roman" w:eastAsia="Times New Roman" w:hAnsi="Times New Roman" w:cs="Times New Roman"/>
-        </w:rPr>
-        <w:t>O projeto não promete conceder crédito automaticamente nem substituir a análise do fornecedor. A decisão de vender a prazo continua pertencendo às partes.</w:t>
-      </w:r>
-    </w:p>
-    <w:p>
-      <w:pPr>
-        <w:rPr>
-          <w:rFonts w:ascii="Times New Roman" w:eastAsia="Times New Roman" w:hAnsi="Times New Roman" w:cs="Times New Roman"/>
-        </w:rPr>
-      </w:pPr>
-    </w:p>
-    <w:p>
-      <w:pPr>
-        <w:rPr>
-          <w:rFonts w:ascii="Times New Roman" w:eastAsia="Times New Roman" w:hAnsi="Times New Roman" w:cs="Times New Roman"/>
-        </w:rPr>
-      </w:pPr>
-      <w:r>
-        <w:rPr>
-          <w:rFonts w:ascii="Times New Roman" w:eastAsia="Times New Roman" w:hAnsi="Times New Roman" w:cs="Times New Roman"/>
-        </w:rPr>
-        <w:t>O que o GIRO oferece é informação verificável para que essa decisão seja tomada com mais evidências.</w:t>
-      </w:r>
-    </w:p>
-    <w:p>
-      <w:pPr>
-        <w:rPr>
-          <w:rFonts w:ascii="Times New Roman" w:eastAsia="Times New Roman" w:hAnsi="Times New Roman" w:cs="Times New Roman"/>
-        </w:rPr>
-      </w:pPr>
-    </w:p>
-    <w:p>
-      <w:pPr>
-        <w:rPr>
-          <w:rFonts w:ascii="Times New Roman" w:eastAsia="Times New Roman" w:hAnsi="Times New Roman" w:cs="Times New Roman"/>
-        </w:rPr>
-      </w:pPr>
-    </w:p>
-    <w:p>
-      <w:pPr>
-        <w:rPr>
-          <w:rFonts w:ascii="Times New Roman" w:eastAsia="Times New Roman" w:hAnsi="Times New Roman" w:cs="Times New Roman"/>
-        </w:rPr>
-      </w:pPr>
-      <w:r>
-        <w:rPr>
-          <w:rFonts w:ascii="Times New Roman" w:eastAsia="Times New Roman" w:hAnsi="Times New Roman" w:cs="Times New Roman"/>
-        </w:rPr>
-        <w:t>---</w:t>
-      </w:r>
-    </w:p>
-    <w:p>
-      <w:pPr>
-        <w:rPr>
-          <w:rFonts w:ascii="Times New Roman" w:eastAsia="Times New Roman" w:hAnsi="Times New Roman" w:cs="Times New Roman"/>
-        </w:rPr>
-      </w:pPr>
-    </w:p>
-    <w:p>
-      <w:pPr>
-        <w:rPr>
-          <w:rFonts w:ascii="Times New Roman" w:eastAsia="Times New Roman" w:hAnsi="Times New Roman" w:cs="Times New Roman"/>
-        </w:rPr>
-      </w:pPr>
-      <w:r>
-        <w:rPr>
-          <w:rFonts w:ascii="Times New Roman" w:eastAsia="Times New Roman" w:hAnsi="Times New Roman" w:cs="Times New Roman"/>
-        </w:rPr>
-        <w:t xml:space="preserve">O que defenderemos no </w:t>
-      </w:r>
-      <w:proofErr w:type="spellStart"/>
-      <w:r>
-        <w:rPr>
-          <w:rFonts w:ascii="Times New Roman" w:eastAsia="Times New Roman" w:hAnsi="Times New Roman" w:cs="Times New Roman"/>
-        </w:rPr>
-        <w:t>hackathon</w:t>
-      </w:r>
-      <w:proofErr w:type="spellEnd"/>
     </w:p>
     <w:p>
       <w:pPr>
@@ -2410,7 +2550,7 @@
         <w:rPr>
           <w:rFonts w:ascii="Times New Roman" w:eastAsia="Times New Roman" w:hAnsi="Times New Roman" w:cs="Times New Roman"/>
         </w:rPr>
-        <w:t>&gt; O GIRO transforma receitas em regras programáveis e compromissos cumpridos em confiança verificável.</w:t>
+        <w:t>O GIRO transforma receitas em regras programáveis e compromissos cumpridos em confiança verificável.</w:t>
       </w:r>
     </w:p>
     <w:p>
@@ -2584,7 +2724,7 @@
         <w:rPr>
           <w:rFonts w:ascii="Times New Roman" w:eastAsia="Times New Roman" w:hAnsi="Times New Roman" w:cs="Times New Roman"/>
         </w:rPr>
-        <w:t xml:space="preserve">&gt; Hoje o pequeno vendedor recebe primeiro e tenta organizar o dinheiro depois. No GIRO, ele define as regras </w:t>
+        <w:t xml:space="preserve">Hoje o pequeno vendedor recebe primeiro e tenta organizar o dinheiro depois. No GIRO, ele define as regras </w:t>
       </w:r>
       <w:r>
         <w:rPr>
@@ -2650,7 +2790,7 @@
         <w:rPr>
           <w:rFonts w:ascii="Times New Roman" w:eastAsia="Times New Roman" w:hAnsi="Times New Roman" w:cs="Times New Roman"/>
         </w:rPr>
-        <w:t>&gt; Hoje a confiança comercial fica na memória de quem conhece você. No GIRO, cada compromisso cumprido ajuda a construir um histórico verificável que pode acompanhar o pequeno vendedor para a próxima negociação.</w:t>
+        <w:t>Hoje a confiança comercial fica na memória de quem conhece você. No GIRO, cada compromisso cumprido ajuda a construir um histórico verificável que pode acompanhar o pequeno vendedor para a próxima negociação.</w:t>
       </w:r>
     </w:p>
     <w:p>

</xml_diff>

<commit_message>
Documentação em inglês, documento do projeto completo com o conteúdo do formulário, vídeo do pitch com slides e correção sobre teste simulado e piloto planejado
</commit_message>
<xml_diff>
--- a/Documentacao/GIRO - Receitas programaveis e confianca comercial para pequenos negocios.docx
+++ b/Documentacao/GIRO - Receitas programaveis e confianca comercial para pequenos negocios.docx
@@ -2376,7 +2376,7 @@
           <w:b/>
           <w:bCs/>
         </w:rPr>
-        <w:t>Projeto piloto</w:t>
+        <w:t>Projeto piloto (próxima etapa)</w:t>
       </w:r>
     </w:p>
     <w:p>
@@ -2469,6 +2469,628 @@
           <w:rFonts w:ascii="Times New Roman" w:eastAsia="Times New Roman" w:hAnsi="Times New Roman" w:cs="Times New Roman"/>
         </w:rPr>
         <w:t>Hipótese principal: um fornecedor melhora as condições comerciais com base no histórico do GIRO. Se isso se confirmar, o modelo se sustenta: o fornecedor paga pelo valor que recebe e o feirante ganha acesso a condições melhores.</w:t>
+      </w:r>
+    </w:p>
+    <w:p>
+      <w:pPr>
+        <w:rPr>
+          <w:rFonts w:ascii="Times New Roman" w:eastAsia="Times New Roman" w:hAnsi="Times New Roman" w:cs="Times New Roman"/>
+        </w:rPr>
+      </w:pPr>
+    </w:p>
+    <w:p>
+      <w:pPr>
+        <w:rPr>
+          <w:rFonts w:ascii="Times New Roman" w:eastAsia="Times New Roman" w:hAnsi="Times New Roman" w:cs="Times New Roman"/>
+        </w:rPr>
+      </w:pPr>
+      <w:r>
+        <w:rPr>
+          <w:rFonts w:ascii="Times New Roman" w:eastAsia="Times New Roman" w:hAnsi="Times New Roman" w:cs="Times New Roman"/>
+        </w:rPr>
+        <w:t>O piloto ainda não foi realizado. Até agora, o sistema foi testado pela equipe com colegas simulando os papéis de feirante, fornecedores, ajudante e cliente, com CNPJs fictícios criados para o teste e carteiras próprias na rede de teste da Solana (Devnet). Nenhum dinheiro real foi usado.</w:t>
+      </w:r>
+    </w:p>
+    <w:p>
+      <w:pPr>
+        <w:rPr>
+          <w:rFonts w:ascii="Times New Roman" w:eastAsia="Times New Roman" w:hAnsi="Times New Roman" w:cs="Times New Roman"/>
+        </w:rPr>
+      </w:pPr>
+    </w:p>
+    <w:p>
+      <w:pPr>
+        <w:numPr>
+          <w:ilvl w:val="0"/>
+          <w:numId w:val="2"/>
+        </w:numPr>
+        <w:rPr>
+          <w:rFonts w:ascii="Times New Roman" w:eastAsia="Times New Roman" w:hAnsi="Times New Roman" w:cs="Times New Roman"/>
+          <w:b/>
+          <w:bCs/>
+        </w:rPr>
+      </w:pPr>
+      <w:r>
+        <w:rPr>
+          <w:rFonts w:ascii="Times New Roman" w:eastAsia="Times New Roman" w:hAnsi="Times New Roman" w:cs="Times New Roman"/>
+          <w:b/>
+          <w:bCs/>
+        </w:rPr>
+        <w:t>Por que agora</w:t>
+      </w:r>
+    </w:p>
+    <w:p>
+      <w:pPr>
+        <w:rPr>
+          <w:rFonts w:ascii="Times New Roman" w:eastAsia="Times New Roman" w:hAnsi="Times New Roman" w:cs="Times New Roman"/>
+        </w:rPr>
+      </w:pPr>
+    </w:p>
+    <w:p>
+      <w:pPr>
+        <w:rPr>
+          <w:rFonts w:ascii="Times New Roman" w:eastAsia="Times New Roman" w:hAnsi="Times New Roman" w:cs="Times New Roman"/>
+        </w:rPr>
+      </w:pPr>
+      <w:r>
+        <w:rPr>
+          <w:rFonts w:ascii="Times New Roman" w:eastAsia="Times New Roman" w:hAnsi="Times New Roman" w:cs="Times New Roman"/>
+        </w:rPr>
+        <w:t>•  O Pix tornou o pagamento digital comum para a maioria dos brasileiros, inclusive pequenos vendedores. O dinheiro já é digital; a organização e a confiança ainda não.</w:t>
+      </w:r>
+    </w:p>
+    <w:p>
+      <w:pPr>
+        <w:rPr>
+          <w:rFonts w:ascii="Times New Roman" w:eastAsia="Times New Roman" w:hAnsi="Times New Roman" w:cs="Times New Roman"/>
+        </w:rPr>
+      </w:pPr>
+      <w:r>
+        <w:rPr>
+          <w:rFonts w:ascii="Times New Roman" w:eastAsia="Times New Roman" w:hAnsi="Times New Roman" w:cs="Times New Roman"/>
+        </w:rPr>
+        <w:t>•  Stablecoins pareadas ao real, como a BRZ, permitem liquidar pagamentos na blockchain sem expor o feirante à volatilidade das criptomoedas.</w:t>
+      </w:r>
+    </w:p>
+    <w:p>
+      <w:pPr>
+        <w:rPr>
+          <w:rFonts w:ascii="Times New Roman" w:eastAsia="Times New Roman" w:hAnsi="Times New Roman" w:cs="Times New Roman"/>
+        </w:rPr>
+      </w:pPr>
+      <w:r>
+        <w:rPr>
+          <w:rFonts w:ascii="Times New Roman" w:eastAsia="Times New Roman" w:hAnsi="Times New Roman" w:cs="Times New Roman"/>
+        </w:rPr>
+        <w:t>•  A Solana tornou viáveis as peças que faltavam: taxas de fração de centavo para vendas pequenas, pagamentos programáveis, Solana Pay e o Solana Attestation Service para provas que o feirante leva consigo.</w:t>
+      </w:r>
+    </w:p>
+    <w:p>
+      <w:pPr>
+        <w:rPr>
+          <w:rFonts w:ascii="Times New Roman" w:eastAsia="Times New Roman" w:hAnsi="Times New Roman" w:cs="Times New Roman"/>
+        </w:rPr>
+      </w:pPr>
+      <w:r>
+        <w:rPr>
+          <w:rFonts w:ascii="Times New Roman" w:eastAsia="Times New Roman" w:hAnsi="Times New Roman" w:cs="Times New Roman"/>
+        </w:rPr>
+        <w:t>•  Os fornecedores sofrem com atrasos e procuram formas melhores de decidir em quem confiar.</w:t>
+      </w:r>
+    </w:p>
+    <w:p>
+      <w:pPr>
+        <w:rPr>
+          <w:rFonts w:ascii="Times New Roman" w:eastAsia="Times New Roman" w:hAnsi="Times New Roman" w:cs="Times New Roman"/>
+        </w:rPr>
+      </w:pPr>
+    </w:p>
+    <w:p>
+      <w:pPr>
+        <w:numPr>
+          <w:ilvl w:val="0"/>
+          <w:numId w:val="2"/>
+        </w:numPr>
+        <w:rPr>
+          <w:rFonts w:ascii="Times New Roman" w:eastAsia="Times New Roman" w:hAnsi="Times New Roman" w:cs="Times New Roman"/>
+          <w:b/>
+          <w:bCs/>
+        </w:rPr>
+      </w:pPr>
+      <w:r>
+        <w:rPr>
+          <w:rFonts w:ascii="Times New Roman" w:eastAsia="Times New Roman" w:hAnsi="Times New Roman" w:cs="Times New Roman"/>
+          <w:b/>
+          <w:bCs/>
+        </w:rPr>
+        <w:t>Concorrência e o que falta nas soluções atuais</w:t>
+      </w:r>
+    </w:p>
+    <w:p>
+      <w:pPr>
+        <w:rPr>
+          <w:rFonts w:ascii="Times New Roman" w:eastAsia="Times New Roman" w:hAnsi="Times New Roman" w:cs="Times New Roman"/>
+        </w:rPr>
+      </w:pPr>
+    </w:p>
+    <w:p>
+      <w:pPr>
+        <w:rPr>
+          <w:rFonts w:ascii="Times New Roman" w:eastAsia="Times New Roman" w:hAnsi="Times New Roman" w:cs="Times New Roman"/>
+        </w:rPr>
+      </w:pPr>
+      <w:r>
+        <w:rPr>
+          <w:rFonts w:ascii="Times New Roman" w:eastAsia="Times New Roman" w:hAnsi="Times New Roman" w:cs="Times New Roman"/>
+        </w:rPr>
+        <w:t>•  Apps de pagamento e contas digitais para pequenos negócios (como Mercado Pago, InfinitePay e Nubank PJ) recebem muito bem o dinheiro, mas mostram o que entrou, não o que já está comprometido com fornecedores.</w:t>
+      </w:r>
+    </w:p>
+    <w:p>
+      <w:pPr>
+        <w:rPr>
+          <w:rFonts w:ascii="Times New Roman" w:eastAsia="Times New Roman" w:hAnsi="Times New Roman" w:cs="Times New Roman"/>
+        </w:rPr>
+      </w:pPr>
+      <w:r>
+        <w:rPr>
+          <w:rFonts w:ascii="Times New Roman" w:eastAsia="Times New Roman" w:hAnsi="Times New Roman" w:cs="Times New Roman"/>
+        </w:rPr>
+        <w:t>•  Planilhas e apps de controle financeiro pedem trabalho extra que costuma ser abandonado e não trazem benefício do outro lado do acordo.</w:t>
+      </w:r>
+    </w:p>
+    <w:p>
+      <w:pPr>
+        <w:rPr>
+          <w:rFonts w:ascii="Times New Roman" w:eastAsia="Times New Roman" w:hAnsi="Times New Roman" w:cs="Times New Roman"/>
+        </w:rPr>
+      </w:pPr>
+      <w:r>
+        <w:rPr>
+          <w:rFonts w:ascii="Times New Roman" w:eastAsia="Times New Roman" w:hAnsi="Times New Roman" w:cs="Times New Roman"/>
+        </w:rPr>
+        <w:t>•  Scores de crédito usam dados que o feirante não vê, não controla e não leva consigo. Scores on-chain dependem de atividade em carteiras e DeFi, que feirantes não têm.</w:t>
+      </w:r>
+    </w:p>
+    <w:p>
+      <w:pPr>
+        <w:rPr>
+          <w:rFonts w:ascii="Times New Roman" w:eastAsia="Times New Roman" w:hAnsi="Times New Roman" w:cs="Times New Roman"/>
+        </w:rPr>
+      </w:pPr>
+    </w:p>
+    <w:p>
+      <w:pPr>
+        <w:rPr>
+          <w:rFonts w:ascii="Times New Roman" w:eastAsia="Times New Roman" w:hAnsi="Times New Roman" w:cs="Times New Roman"/>
+        </w:rPr>
+      </w:pPr>
+      <w:r>
+        <w:rPr>
+          <w:rFonts w:ascii="Times New Roman" w:eastAsia="Times New Roman" w:hAnsi="Times New Roman" w:cs="Times New Roman"/>
+        </w:rPr>
+        <w:t>O GIRO trata o acordo entre fornecedor e feirante como o produto: aceito pelos dois lados, acompanhado pelas vendas reais, confirmado com evidências e transformado em um histórico que o feirante controla e escolhe compartilhar.</w:t>
+      </w:r>
+    </w:p>
+    <w:p>
+      <w:pPr>
+        <w:rPr>
+          <w:rFonts w:ascii="Times New Roman" w:eastAsia="Times New Roman" w:hAnsi="Times New Roman" w:cs="Times New Roman"/>
+        </w:rPr>
+      </w:pPr>
+    </w:p>
+    <w:p>
+      <w:pPr>
+        <w:numPr>
+          <w:ilvl w:val="0"/>
+          <w:numId w:val="2"/>
+        </w:numPr>
+        <w:rPr>
+          <w:rFonts w:ascii="Times New Roman" w:eastAsia="Times New Roman" w:hAnsi="Times New Roman" w:cs="Times New Roman"/>
+          <w:b/>
+          <w:bCs/>
+        </w:rPr>
+      </w:pPr>
+      <w:r>
+        <w:rPr>
+          <w:rFonts w:ascii="Times New Roman" w:eastAsia="Times New Roman" w:hAnsi="Times New Roman" w:cs="Times New Roman"/>
+          <w:b/>
+          <w:bCs/>
+        </w:rPr>
+        <w:t>Estado atual do projeto (outubro de 2026)</w:t>
+      </w:r>
+    </w:p>
+    <w:p>
+      <w:pPr>
+        <w:rPr>
+          <w:rFonts w:ascii="Times New Roman" w:eastAsia="Times New Roman" w:hAnsi="Times New Roman" w:cs="Times New Roman"/>
+        </w:rPr>
+      </w:pPr>
+    </w:p>
+    <w:p>
+      <w:pPr>
+        <w:rPr>
+          <w:rFonts w:ascii="Times New Roman" w:eastAsia="Times New Roman" w:hAnsi="Times New Roman" w:cs="Times New Roman"/>
+        </w:rPr>
+      </w:pPr>
+      <w:r>
+        <w:rPr>
+          <w:rFonts w:ascii="Times New Roman" w:eastAsia="Times New Roman" w:hAnsi="Times New Roman" w:cs="Times New Roman"/>
+        </w:rPr>
+        <w:t>Protótipo funcional, ainda sem receita. O GIRO conquistou o 1º lugar no WoHackathon, onde a primeira versão foi criada. Durante o Colosseum (Crypto World’s Fair, trilha Solana) foi construída toda a integração com a Solana:</w:t>
+      </w:r>
+    </w:p>
+    <w:p>
+      <w:pPr>
+        <w:rPr>
+          <w:rFonts w:ascii="Times New Roman" w:eastAsia="Times New Roman" w:hAnsi="Times New Roman" w:cs="Times New Roman"/>
+        </w:rPr>
+      </w:pPr>
+    </w:p>
+    <w:p>
+      <w:pPr>
+        <w:rPr>
+          <w:rFonts w:ascii="Times New Roman" w:eastAsia="Times New Roman" w:hAnsi="Times New Roman" w:cs="Times New Roman"/>
+        </w:rPr>
+      </w:pPr>
+      <w:r>
+        <w:rPr>
+          <w:rFonts w:ascii="Times New Roman" w:eastAsia="Times New Roman" w:hAnsi="Times New Roman" w:cs="Times New Roman"/>
+        </w:rPr>
+        <w:t>•  aplicativo web em português, com tela pensada para celular (ainda não existe app nativo);</w:t>
+      </w:r>
+    </w:p>
+    <w:p>
+      <w:pPr>
+        <w:rPr>
+          <w:rFonts w:ascii="Times New Roman" w:eastAsia="Times New Roman" w:hAnsi="Times New Roman" w:cs="Times New Roman"/>
+        </w:rPr>
+      </w:pPr>
+      <w:r>
+        <w:rPr>
+          <w:rFonts w:ascii="Times New Roman" w:eastAsia="Times New Roman" w:hAnsi="Times New Roman" w:cs="Times New Roman"/>
+        </w:rPr>
+        <w:t>•  programa Anchor (Rust) na Solana Devnet: acordos aceitos pelos dois lados, mudanças só com aceite mútuo, divisão automática da venda e confirmação ou contestação de pagamentos em dinheiro;</w:t>
+      </w:r>
+    </w:p>
+    <w:p>
+      <w:pPr>
+        <w:rPr>
+          <w:rFonts w:ascii="Times New Roman" w:eastAsia="Times New Roman" w:hAnsi="Times New Roman" w:cs="Times New Roman"/>
+        </w:rPr>
+      </w:pPr>
+      <w:r>
+        <w:rPr>
+          <w:rFonts w:ascii="Times New Roman" w:eastAsia="Times New Roman" w:hAnsi="Times New Roman" w:cs="Times New Roman"/>
+        </w:rPr>
+        <w:t>•  Solana Pay com divisão atômica da venda em stablecoin de real (BRZ; token de teste na Devnet);</w:t>
+      </w:r>
+    </w:p>
+    <w:p>
+      <w:pPr>
+        <w:rPr>
+          <w:rFonts w:ascii="Times New Roman" w:eastAsia="Times New Roman" w:hAnsi="Times New Roman" w:cs="Times New Roman"/>
+        </w:rPr>
+      </w:pPr>
+      <w:r>
+        <w:rPr>
+          <w:rFonts w:ascii="Times New Roman" w:eastAsia="Times New Roman" w:hAnsi="Times New Roman" w:cs="Times New Roman"/>
+        </w:rPr>
+        <w:t>•  cada pessoa assina com a própria carteira (Phantom ou Solflare), com o botão “Assinar tudo” em uma única aprovação;</w:t>
+      </w:r>
+    </w:p>
+    <w:p>
+      <w:pPr>
+        <w:rPr>
+          <w:rFonts w:ascii="Times New Roman" w:eastAsia="Times New Roman" w:hAnsi="Times New Roman" w:cs="Times New Roman"/>
+        </w:rPr>
+      </w:pPr>
+      <w:r>
+        <w:rPr>
+          <w:rFonts w:ascii="Times New Roman" w:eastAsia="Times New Roman" w:hAnsi="Times New Roman" w:cs="Times New Roman"/>
+        </w:rPr>
+        <w:t>•  atestações do Solana Attestation Service para acordos concluídos;</w:t>
+      </w:r>
+    </w:p>
+    <w:p>
+      <w:pPr>
+        <w:rPr>
+          <w:rFonts w:ascii="Times New Roman" w:eastAsia="Times New Roman" w:hAnsi="Times New Roman" w:cs="Times New Roman"/>
+        </w:rPr>
+      </w:pPr>
+      <w:r>
+        <w:rPr>
+          <w:rFonts w:ascii="Times New Roman" w:eastAsia="Times New Roman" w:hAnsi="Times New Roman" w:cs="Times New Roman"/>
+        </w:rPr>
+        <w:t>•  entrada por link de convite no WhatsApp, com carteira de teste abastecida automaticamente;</w:t>
+      </w:r>
+    </w:p>
+    <w:p>
+      <w:pPr>
+        <w:rPr>
+          <w:rFonts w:ascii="Times New Roman" w:eastAsia="Times New Roman" w:hAnsi="Times New Roman" w:cs="Times New Roman"/>
+        </w:rPr>
+      </w:pPr>
+      <w:r>
+        <w:rPr>
+          <w:rFonts w:ascii="Times New Roman" w:eastAsia="Times New Roman" w:hAnsi="Times New Roman" w:cs="Times New Roman"/>
+        </w:rPr>
+        <w:t>•  importação de documentos em PDF, CSV e texto, sempre com revisão antes de cadastrar;</w:t>
+      </w:r>
+    </w:p>
+    <w:p>
+      <w:pPr>
+        <w:rPr>
+          <w:rFonts w:ascii="Times New Roman" w:eastAsia="Times New Roman" w:hAnsi="Times New Roman" w:cs="Times New Roman"/>
+        </w:rPr>
+      </w:pPr>
+      <w:r>
+        <w:rPr>
+          <w:rFonts w:ascii="Times New Roman" w:eastAsia="Times New Roman" w:hAnsi="Times New Roman" w:cs="Times New Roman"/>
+        </w:rPr>
+        <w:t>•  288 testes automáticos e 1.165 vetores de paridade que garantem que a regra do app e o programa na blockchain chegam ao mesmo valor, centavo por centavo.</w:t>
+      </w:r>
+    </w:p>
+    <w:p>
+      <w:pPr>
+        <w:rPr>
+          <w:rFonts w:ascii="Times New Roman" w:eastAsia="Times New Roman" w:hAnsi="Times New Roman" w:cs="Times New Roman"/>
+        </w:rPr>
+      </w:pPr>
+    </w:p>
+    <w:p>
+      <w:pPr>
+        <w:rPr>
+          <w:rFonts w:ascii="Times New Roman" w:eastAsia="Times New Roman" w:hAnsi="Times New Roman" w:cs="Times New Roman"/>
+        </w:rPr>
+      </w:pPr>
+      <w:r>
+        <w:rPr>
+          <w:rFonts w:ascii="Times New Roman" w:eastAsia="Times New Roman" w:hAnsi="Times New Roman" w:cs="Times New Roman"/>
+        </w:rPr>
+        <w:t>Demonstração pública: giro-demo-oyy1.onrender.com (usuário dona, senha giro-demo-2026; dados fictícios e rede simulada). Código aberto, licença MIT: github.com/vaz-123ale/giro.</w:t>
+      </w:r>
+    </w:p>
+    <w:p>
+      <w:pPr>
+        <w:rPr>
+          <w:rFonts w:ascii="Times New Roman" w:eastAsia="Times New Roman" w:hAnsi="Times New Roman" w:cs="Times New Roman"/>
+        </w:rPr>
+      </w:pPr>
+    </w:p>
+    <w:p>
+      <w:pPr>
+        <w:numPr>
+          <w:ilvl w:val="0"/>
+          <w:numId w:val="2"/>
+        </w:numPr>
+        <w:rPr>
+          <w:rFonts w:ascii="Times New Roman" w:eastAsia="Times New Roman" w:hAnsi="Times New Roman" w:cs="Times New Roman"/>
+          <w:b/>
+          <w:bCs/>
+        </w:rPr>
+      </w:pPr>
+      <w:r>
+        <w:rPr>
+          <w:rFonts w:ascii="Times New Roman" w:eastAsia="Times New Roman" w:hAnsi="Times New Roman" w:cs="Times New Roman"/>
+          <w:b/>
+          <w:bCs/>
+        </w:rPr>
+        <w:t>Tecnologias</w:t>
+      </w:r>
+    </w:p>
+    <w:p>
+      <w:pPr>
+        <w:rPr>
+          <w:rFonts w:ascii="Times New Roman" w:eastAsia="Times New Roman" w:hAnsi="Times New Roman" w:cs="Times New Roman"/>
+        </w:rPr>
+      </w:pPr>
+    </w:p>
+    <w:p>
+      <w:pPr>
+        <w:rPr>
+          <w:rFonts w:ascii="Times New Roman" w:eastAsia="Times New Roman" w:hAnsi="Times New Roman" w:cs="Times New Roman"/>
+        </w:rPr>
+      </w:pPr>
+      <w:r>
+        <w:rPr>
+          <w:rFonts w:ascii="Times New Roman" w:eastAsia="Times New Roman" w:hAnsi="Times New Roman" w:cs="Times New Roman"/>
+        </w:rPr>
+        <w:t>•  Blockchain: Solana (Devnet), Anchor/Rust, SPL Token (BRZ), Solana Pay, Wallet Standard, Solana Attestation Service, @solana/kit e Codama.</w:t>
+      </w:r>
+    </w:p>
+    <w:p>
+      <w:pPr>
+        <w:rPr>
+          <w:rFonts w:ascii="Times New Roman" w:eastAsia="Times New Roman" w:hAnsi="Times New Roman" w:cs="Times New Roman"/>
+        </w:rPr>
+      </w:pPr>
+      <w:r>
+        <w:rPr>
+          <w:rFonts w:ascii="Times New Roman" w:eastAsia="Times New Roman" w:hAnsi="Times New Roman" w:cs="Times New Roman"/>
+        </w:rPr>
+        <w:t>•  Aplicação: Node.js, TypeScript, React, Vite e SQLite.</w:t>
+      </w:r>
+    </w:p>
+    <w:p>
+      <w:pPr>
+        <w:rPr>
+          <w:rFonts w:ascii="Times New Roman" w:eastAsia="Times New Roman" w:hAnsi="Times New Roman" w:cs="Times New Roman"/>
+        </w:rPr>
+      </w:pPr>
+      <w:r>
+        <w:rPr>
+          <w:rFonts w:ascii="Times New Roman" w:eastAsia="Times New Roman" w:hAnsi="Times New Roman" w:cs="Times New Roman"/>
+        </w:rPr>
+        <w:t>•  Ferramentas de desenvolvimento: WSL/Ubuntu, Git e GitHub, Render (demonstração pública) e Tailscale (teste em grupo).</w:t>
+      </w:r>
+    </w:p>
+    <w:p>
+      <w:pPr>
+        <w:rPr>
+          <w:rFonts w:ascii="Times New Roman" w:eastAsia="Times New Roman" w:hAnsi="Times New Roman" w:cs="Times New Roman"/>
+        </w:rPr>
+      </w:pPr>
+      <w:r>
+        <w:rPr>
+          <w:rFonts w:ascii="Times New Roman" w:eastAsia="Times New Roman" w:hAnsi="Times New Roman" w:cs="Times New Roman"/>
+        </w:rPr>
+        <w:t>•  Ferramentas de IA: Claude Code como assistente de programação, uma ferramenta de geração de imagens para as ilustrações do pitch e o Kokoro (voz por IA de código aberto) para a narração dos vídeos.</w:t>
+      </w:r>
+    </w:p>
+    <w:p>
+      <w:pPr>
+        <w:rPr>
+          <w:rFonts w:ascii="Times New Roman" w:eastAsia="Times New Roman" w:hAnsi="Times New Roman" w:cs="Times New Roman"/>
+        </w:rPr>
+      </w:pPr>
+    </w:p>
+    <w:p>
+      <w:pPr>
+        <w:numPr>
+          <w:ilvl w:val="0"/>
+          <w:numId w:val="2"/>
+        </w:numPr>
+        <w:rPr>
+          <w:rFonts w:ascii="Times New Roman" w:eastAsia="Times New Roman" w:hAnsi="Times New Roman" w:cs="Times New Roman"/>
+          <w:b/>
+          <w:bCs/>
+        </w:rPr>
+      </w:pPr>
+      <w:r>
+        <w:rPr>
+          <w:rFonts w:ascii="Times New Roman" w:eastAsia="Times New Roman" w:hAnsi="Times New Roman" w:cs="Times New Roman"/>
+          <w:b/>
+          <w:bCs/>
+        </w:rPr>
+        <w:t>Equipe</w:t>
+      </w:r>
+    </w:p>
+    <w:p>
+      <w:pPr>
+        <w:rPr>
+          <w:rFonts w:ascii="Times New Roman" w:eastAsia="Times New Roman" w:hAnsi="Times New Roman" w:cs="Times New Roman"/>
+        </w:rPr>
+      </w:pPr>
+    </w:p>
+    <w:p>
+      <w:pPr>
+        <w:rPr>
+          <w:rFonts w:ascii="Times New Roman" w:eastAsia="Times New Roman" w:hAnsi="Times New Roman" w:cs="Times New Roman"/>
+        </w:rPr>
+      </w:pPr>
+      <w:r>
+        <w:rPr>
+          <w:rFonts w:ascii="Times New Roman" w:eastAsia="Times New Roman" w:hAnsi="Times New Roman" w:cs="Times New Roman"/>
+        </w:rPr>
+        <w:t>•  Alessandra Vaz: criadora da ideia e do projeto; produto e desenvolvimento; formação em matemática.</w:t>
+      </w:r>
+    </w:p>
+    <w:p>
+      <w:pPr>
+        <w:rPr>
+          <w:rFonts w:ascii="Times New Roman" w:eastAsia="Times New Roman" w:hAnsi="Times New Roman" w:cs="Times New Roman"/>
+        </w:rPr>
+      </w:pPr>
+      <w:r>
+        <w:rPr>
+          <w:rFonts w:ascii="Times New Roman" w:eastAsia="Times New Roman" w:hAnsi="Times New Roman" w:cs="Times New Roman"/>
+        </w:rPr>
+        <w:t>•  Talita: design gráfico.</w:t>
+      </w:r>
+    </w:p>
+    <w:p>
+      <w:pPr>
+        <w:rPr>
+          <w:rFonts w:ascii="Times New Roman" w:eastAsia="Times New Roman" w:hAnsi="Times New Roman" w:cs="Times New Roman"/>
+        </w:rPr>
+      </w:pPr>
+      <w:r>
+        <w:rPr>
+          <w:rFonts w:ascii="Times New Roman" w:eastAsia="Times New Roman" w:hAnsi="Times New Roman" w:cs="Times New Roman"/>
+        </w:rPr>
+        <w:t>•  Ana Clara Teixeira: revisão e testes do sistema.</w:t>
+      </w:r>
+    </w:p>
+    <w:p>
+      <w:pPr>
+        <w:rPr>
+          <w:rFonts w:ascii="Times New Roman" w:eastAsia="Times New Roman" w:hAnsi="Times New Roman" w:cs="Times New Roman"/>
+        </w:rPr>
+      </w:pPr>
+      <w:r>
+        <w:rPr>
+          <w:rFonts w:ascii="Times New Roman" w:eastAsia="Times New Roman" w:hAnsi="Times New Roman" w:cs="Times New Roman"/>
+        </w:rPr>
+        <w:t>•  Melissa Gameleira: pitch, slides e marketing.</w:t>
+      </w:r>
+    </w:p>
+    <w:p>
+      <w:pPr>
+        <w:rPr>
+          <w:rFonts w:ascii="Times New Roman" w:eastAsia="Times New Roman" w:hAnsi="Times New Roman" w:cs="Times New Roman"/>
+        </w:rPr>
+      </w:pPr>
+    </w:p>
+    <w:p>
+      <w:pPr>
+        <w:rPr>
+          <w:rFonts w:ascii="Times New Roman" w:eastAsia="Times New Roman" w:hAnsi="Times New Roman" w:cs="Times New Roman"/>
+        </w:rPr>
+      </w:pPr>
+      <w:r>
+        <w:rPr>
+          <w:rFonts w:ascii="Times New Roman" w:eastAsia="Times New Roman" w:hAnsi="Times New Roman" w:cs="Times New Roman"/>
+        </w:rPr>
+        <w:t>Somos quatro mulheres brasileiras. Hoje trabalhamos no GIRO em tempo parcial, junto com estudos e trabalho, e pretendemos nos dedicar em tempo integral se houver financiamento.</w:t>
+      </w:r>
+    </w:p>
+    <w:p>
+      <w:pPr>
+        <w:rPr>
+          <w:rFonts w:ascii="Times New Roman" w:eastAsia="Times New Roman" w:hAnsi="Times New Roman" w:cs="Times New Roman"/>
+        </w:rPr>
+      </w:pPr>
+    </w:p>
+    <w:p>
+      <w:pPr>
+        <w:numPr>
+          <w:ilvl w:val="0"/>
+          <w:numId w:val="2"/>
+        </w:numPr>
+        <w:rPr>
+          <w:rFonts w:ascii="Times New Roman" w:eastAsia="Times New Roman" w:hAnsi="Times New Roman" w:cs="Times New Roman"/>
+          <w:b/>
+          <w:bCs/>
+        </w:rPr>
+      </w:pPr>
+      <w:r>
+        <w:rPr>
+          <w:rFonts w:ascii="Times New Roman" w:eastAsia="Times New Roman" w:hAnsi="Times New Roman" w:cs="Times New Roman"/>
+          <w:b/>
+          <w:bCs/>
+        </w:rPr>
+        <w:t>Trabalho anterior ao Colosseum</w:t>
+      </w:r>
+    </w:p>
+    <w:p>
+      <w:pPr>
+        <w:rPr>
+          <w:rFonts w:ascii="Times New Roman" w:eastAsia="Times New Roman" w:hAnsi="Times New Roman" w:cs="Times New Roman"/>
+        </w:rPr>
+      </w:pPr>
+    </w:p>
+    <w:p>
+      <w:pPr>
+        <w:rPr>
+          <w:rFonts w:ascii="Times New Roman" w:eastAsia="Times New Roman" w:hAnsi="Times New Roman" w:cs="Times New Roman"/>
+        </w:rPr>
+      </w:pPr>
+      <w:r>
+        <w:rPr>
+          <w:rFonts w:ascii="Times New Roman" w:eastAsia="Times New Roman" w:hAnsi="Times New Roman" w:cs="Times New Roman"/>
+        </w:rPr>
+        <w:t>O conceito e a primeira versão do aplicativo, ainda sem blockchain, vieram do WoHackathon. Toda a integração com a Solana foi construída durante o período do Colosseum (14/09 a 12/10/2026).</w:t>
       </w:r>
     </w:p>
     <w:p>

</xml_diff>

<commit_message>
Documento do projeto: seção Atualizações de outubro de 2026 com tipos de conta, contas de teste e endereços (Word e PDF)
</commit_message>
<xml_diff>
--- a/Documentacao/GIRO - Receitas programaveis e confianca comercial para pequenos negocios.docx
+++ b/Documentacao/GIRO - Receitas programaveis e confianca comercial para pequenos negocios.docx
@@ -6310,6 +6310,1822 @@
         </w:rPr>
       </w:pPr>
     </w:p>
+    <w:p>
+      <w:pPr>
+        <w:rPr>
+          <w:rFonts w:ascii="Times New Roman" w:eastAsia="Times New Roman" w:hAnsi="Times New Roman" w:cs="Times New Roman"/>
+        </w:rPr>
+      </w:pPr>
+    </w:p>
+    <w:p>
+      <w:pPr>
+        <w:rPr>
+          <w:rFonts w:ascii="Times New Roman" w:eastAsia="Times New Roman" w:hAnsi="Times New Roman" w:cs="Times New Roman"/>
+          <w:b/>
+          <w:bCs/>
+        </w:rPr>
+      </w:pPr>
+      <w:r>
+        <w:rPr>
+          <w:rFonts w:ascii="Times New Roman" w:eastAsia="Times New Roman" w:hAnsi="Times New Roman" w:cs="Times New Roman"/>
+          <w:b/>
+          <w:bCs/>
+        </w:rPr>
+        <w:t>Atualizações de outubro de 2026</w:t>
+      </w:r>
+    </w:p>
+    <w:p>
+      <w:pPr>
+        <w:rPr>
+          <w:rFonts w:ascii="Times New Roman" w:eastAsia="Times New Roman" w:hAnsi="Times New Roman" w:cs="Times New Roman"/>
+        </w:rPr>
+      </w:pPr>
+    </w:p>
+    <w:p>
+      <w:pPr>
+        <w:rPr>
+          <w:rFonts w:ascii="Times New Roman" w:eastAsia="Times New Roman" w:hAnsi="Times New Roman" w:cs="Times New Roman"/>
+        </w:rPr>
+      </w:pPr>
+      <w:r>
+        <w:rPr>
+          <w:rFonts w:ascii="Times New Roman" w:eastAsia="Times New Roman" w:hAnsi="Times New Roman" w:cs="Times New Roman"/>
+        </w:rPr>
+        <w:t>Esta seção reúne tudo o que foi acrescentado ao protótipo desde o QR fixo da barraca e a divisão por tipo de conta. Tudo foi testado apenas com dados fictícios (colegas simulando fornecedores, CNPJs inventados, sem dinheiro real). O projeto piloto continua sendo o próximo passo.</w:t>
+      </w:r>
+    </w:p>
+    <w:p>
+      <w:pPr>
+        <w:rPr>
+          <w:rFonts w:ascii="Times New Roman" w:eastAsia="Times New Roman" w:hAnsi="Times New Roman" w:cs="Times New Roman"/>
+        </w:rPr>
+      </w:pPr>
+    </w:p>
+    <w:p>
+      <w:pPr>
+        <w:rPr>
+          <w:rFonts w:ascii="Times New Roman" w:eastAsia="Times New Roman" w:hAnsi="Times New Roman" w:cs="Times New Roman"/>
+          <w:b/>
+          <w:bCs/>
+        </w:rPr>
+      </w:pPr>
+      <w:r>
+        <w:rPr>
+          <w:rFonts w:ascii="Times New Roman" w:eastAsia="Times New Roman" w:hAnsi="Times New Roman" w:cs="Times New Roman"/>
+          <w:b/>
+          <w:bCs/>
+        </w:rPr>
+        <w:t>Três tipos de conta, cada um com o seu aplicativo</w:t>
+      </w:r>
+    </w:p>
+    <w:p>
+      <w:pPr>
+        <w:rPr>
+          <w:rFonts w:ascii="Times New Roman" w:eastAsia="Times New Roman" w:hAnsi="Times New Roman" w:cs="Times New Roman"/>
+        </w:rPr>
+      </w:pPr>
+    </w:p>
+    <w:p>
+      <w:pPr>
+        <w:rPr>
+          <w:rFonts w:ascii="Times New Roman" w:eastAsia="Times New Roman" w:hAnsi="Times New Roman" w:cs="Times New Roman"/>
+        </w:rPr>
+      </w:pPr>
+      <w:r>
+        <w:rPr>
+          <w:rFonts w:ascii="Times New Roman" w:eastAsia="Times New Roman" w:hAnsi="Times New Roman" w:cs="Times New Roman"/>
+        </w:rPr>
+        <w:t>Na tela Entrar, a pessoa escolhe com qual conta vai entrar. O GIRO confere se a conta é mesmo daquele tipo; se não for, avisa qual opção escolher (por exemplo: “Esta conta é de fornecedor(a). Escolha Fornecedor(a) para entrar”). Cada conta vê só o que é dela.</w:t>
+      </w:r>
+    </w:p>
+    <w:p>
+      <w:pPr>
+        <w:rPr>
+          <w:rFonts w:ascii="Times New Roman" w:eastAsia="Times New Roman" w:hAnsi="Times New Roman" w:cs="Times New Roman"/>
+        </w:rPr>
+      </w:pPr>
+    </w:p>
+    <w:tbl>
+      <w:tblPr>
+        <w:tblW w:type="auto" w:w="0"/>
+        <w:tblLook w:firstColumn="1" w:firstRow="1" w:lastColumn="0" w:lastRow="0" w:noHBand="0" w:noVBand="1" w:val="04A0"/>
+      </w:tblPr>
+      <w:tblGrid>
+        <w:gridCol w:w="2257"/>
+        <w:gridCol w:w="2257"/>
+        <w:gridCol w:w="2257"/>
+        <w:gridCol w:w="2257"/>
+      </w:tblGrid>
+      <w:tr>
+        <w:tc>
+          <w:tcPr>
+            <w:tcW w:type="dxa" w:w="2257"/>
+            <w:tcBorders>
+              <w:top w:val="single" w:sz="6" w:color="9DB8AA"/>
+              <w:left w:val="single" w:sz="6" w:color="9DB8AA"/>
+              <w:bottom w:val="single" w:sz="6" w:color="9DB8AA"/>
+              <w:right w:val="single" w:sz="6" w:color="9DB8AA"/>
+            </w:tcBorders>
+            <w:shd w:val="clear" w:fill="E3F2EA"/>
+          </w:tcPr>
+          <w:p>
+            <w:r/>
+            <w:r>
+              <w:rPr>
+                <w:rFonts w:ascii="Times New Roman" w:hAnsi="Times New Roman"/>
+                <w:b/>
+                <w:sz w:val="22"/>
+              </w:rPr>
+              <w:t>Conta</w:t>
+            </w:r>
+          </w:p>
+        </w:tc>
+        <w:tc>
+          <w:tcPr>
+            <w:tcW w:type="dxa" w:w="2257"/>
+            <w:tcBorders>
+              <w:top w:val="single" w:sz="6" w:color="9DB8AA"/>
+              <w:left w:val="single" w:sz="6" w:color="9DB8AA"/>
+              <w:bottom w:val="single" w:sz="6" w:color="9DB8AA"/>
+              <w:right w:val="single" w:sz="6" w:color="9DB8AA"/>
+            </w:tcBorders>
+            <w:shd w:val="clear" w:fill="E3F2EA"/>
+          </w:tcPr>
+          <w:p>
+            <w:r/>
+            <w:r>
+              <w:rPr>
+                <w:rFonts w:ascii="Times New Roman" w:hAnsi="Times New Roman"/>
+                <w:b/>
+                <w:sz w:val="22"/>
+              </w:rPr>
+              <w:t>Quem é</w:t>
+            </w:r>
+          </w:p>
+        </w:tc>
+        <w:tc>
+          <w:tcPr>
+            <w:tcW w:type="dxa" w:w="2257"/>
+            <w:tcBorders>
+              <w:top w:val="single" w:sz="6" w:color="9DB8AA"/>
+              <w:left w:val="single" w:sz="6" w:color="9DB8AA"/>
+              <w:bottom w:val="single" w:sz="6" w:color="9DB8AA"/>
+              <w:right w:val="single" w:sz="6" w:color="9DB8AA"/>
+            </w:tcBorders>
+            <w:shd w:val="clear" w:fill="E3F2EA"/>
+          </w:tcPr>
+          <w:p>
+            <w:r/>
+            <w:r>
+              <w:rPr>
+                <w:rFonts w:ascii="Times New Roman" w:hAnsi="Times New Roman"/>
+                <w:b/>
+                <w:sz w:val="22"/>
+              </w:rPr>
+              <w:t>Cor</w:t>
+            </w:r>
+          </w:p>
+        </w:tc>
+        <w:tc>
+          <w:tcPr>
+            <w:tcW w:type="dxa" w:w="2257"/>
+            <w:tcBorders>
+              <w:top w:val="single" w:sz="6" w:color="9DB8AA"/>
+              <w:left w:val="single" w:sz="6" w:color="9DB8AA"/>
+              <w:bottom w:val="single" w:sz="6" w:color="9DB8AA"/>
+              <w:right w:val="single" w:sz="6" w:color="9DB8AA"/>
+            </w:tcBorders>
+            <w:shd w:val="clear" w:fill="E3F2EA"/>
+          </w:tcPr>
+          <w:p>
+            <w:r/>
+            <w:r>
+              <w:rPr>
+                <w:rFonts w:ascii="Times New Roman" w:hAnsi="Times New Roman"/>
+                <w:b/>
+                <w:sz w:val="22"/>
+              </w:rPr>
+              <w:t>Menu</w:t>
+            </w:r>
+          </w:p>
+        </w:tc>
+      </w:tr>
+      <w:tr>
+        <w:tc>
+          <w:tcPr>
+            <w:tcW w:type="dxa" w:w="2257"/>
+            <w:tcBorders>
+              <w:top w:val="single" w:sz="6" w:color="9DB8AA"/>
+              <w:left w:val="single" w:sz="6" w:color="9DB8AA"/>
+              <w:bottom w:val="single" w:sz="6" w:color="9DB8AA"/>
+              <w:right w:val="single" w:sz="6" w:color="9DB8AA"/>
+            </w:tcBorders>
+          </w:tcPr>
+          <w:p>
+            <w:r/>
+            <w:r>
+              <w:rPr>
+                <w:rFonts w:ascii="Times New Roman" w:hAnsi="Times New Roman"/>
+                <w:b w:val="0"/>
+                <w:sz w:val="22"/>
+              </w:rPr>
+              <w:t>Minha barraca</w:t>
+            </w:r>
+          </w:p>
+        </w:tc>
+        <w:tc>
+          <w:tcPr>
+            <w:tcW w:type="dxa" w:w="2257"/>
+            <w:tcBorders>
+              <w:top w:val="single" w:sz="6" w:color="9DB8AA"/>
+              <w:left w:val="single" w:sz="6" w:color="9DB8AA"/>
+              <w:bottom w:val="single" w:sz="6" w:color="9DB8AA"/>
+              <w:right w:val="single" w:sz="6" w:color="9DB8AA"/>
+            </w:tcBorders>
+          </w:tcPr>
+          <w:p>
+            <w:r/>
+            <w:r>
+              <w:rPr>
+                <w:rFonts w:ascii="Times New Roman" w:hAnsi="Times New Roman"/>
+                <w:b w:val="0"/>
+                <w:sz w:val="22"/>
+              </w:rPr>
+              <w:t>Quem vende (feirante)</w:t>
+            </w:r>
+          </w:p>
+        </w:tc>
+        <w:tc>
+          <w:tcPr>
+            <w:tcW w:type="dxa" w:w="2257"/>
+            <w:tcBorders>
+              <w:top w:val="single" w:sz="6" w:color="9DB8AA"/>
+              <w:left w:val="single" w:sz="6" w:color="9DB8AA"/>
+              <w:bottom w:val="single" w:sz="6" w:color="9DB8AA"/>
+              <w:right w:val="single" w:sz="6" w:color="9DB8AA"/>
+            </w:tcBorders>
+          </w:tcPr>
+          <w:p>
+            <w:r/>
+            <w:r>
+              <w:rPr>
+                <w:rFonts w:ascii="Times New Roman" w:hAnsi="Times New Roman"/>
+                <w:b w:val="0"/>
+                <w:sz w:val="22"/>
+              </w:rPr>
+              <w:t>Verde</w:t>
+            </w:r>
+          </w:p>
+        </w:tc>
+        <w:tc>
+          <w:tcPr>
+            <w:tcW w:type="dxa" w:w="2257"/>
+            <w:tcBorders>
+              <w:top w:val="single" w:sz="6" w:color="9DB8AA"/>
+              <w:left w:val="single" w:sz="6" w:color="9DB8AA"/>
+              <w:bottom w:val="single" w:sz="6" w:color="9DB8AA"/>
+              <w:right w:val="single" w:sz="6" w:color="9DB8AA"/>
+            </w:tcBorders>
+          </w:tcPr>
+          <w:p>
+            <w:r/>
+            <w:r>
+              <w:rPr>
+                <w:rFonts w:ascii="Times New Roman" w:hAnsi="Times New Roman"/>
+                <w:b w:val="0"/>
+                <w:sz w:val="22"/>
+              </w:rPr>
+              <w:t>Início, Receber, Organizar, Compromissos, Equipe, Confiança</w:t>
+            </w:r>
+          </w:p>
+        </w:tc>
+      </w:tr>
+      <w:tr>
+        <w:tc>
+          <w:tcPr>
+            <w:tcW w:type="dxa" w:w="2257"/>
+            <w:tcBorders>
+              <w:top w:val="single" w:sz="6" w:color="9DB8AA"/>
+              <w:left w:val="single" w:sz="6" w:color="9DB8AA"/>
+              <w:bottom w:val="single" w:sz="6" w:color="9DB8AA"/>
+              <w:right w:val="single" w:sz="6" w:color="9DB8AA"/>
+            </w:tcBorders>
+          </w:tcPr>
+          <w:p>
+            <w:r/>
+            <w:r>
+              <w:rPr>
+                <w:rFonts w:ascii="Times New Roman" w:hAnsi="Times New Roman"/>
+                <w:b w:val="0"/>
+                <w:sz w:val="22"/>
+              </w:rPr>
+              <w:t>Fornecedor(a)</w:t>
+            </w:r>
+          </w:p>
+        </w:tc>
+        <w:tc>
+          <w:tcPr>
+            <w:tcW w:type="dxa" w:w="2257"/>
+            <w:tcBorders>
+              <w:top w:val="single" w:sz="6" w:color="9DB8AA"/>
+              <w:left w:val="single" w:sz="6" w:color="9DB8AA"/>
+              <w:bottom w:val="single" w:sz="6" w:color="9DB8AA"/>
+              <w:right w:val="single" w:sz="6" w:color="9DB8AA"/>
+            </w:tcBorders>
+          </w:tcPr>
+          <w:p>
+            <w:r/>
+            <w:r>
+              <w:rPr>
+                <w:rFonts w:ascii="Times New Roman" w:hAnsi="Times New Roman"/>
+                <w:b w:val="0"/>
+                <w:sz w:val="22"/>
+              </w:rPr>
+              <w:t>Quem vende para a barraca</w:t>
+            </w:r>
+          </w:p>
+        </w:tc>
+        <w:tc>
+          <w:tcPr>
+            <w:tcW w:type="dxa" w:w="2257"/>
+            <w:tcBorders>
+              <w:top w:val="single" w:sz="6" w:color="9DB8AA"/>
+              <w:left w:val="single" w:sz="6" w:color="9DB8AA"/>
+              <w:bottom w:val="single" w:sz="6" w:color="9DB8AA"/>
+              <w:right w:val="single" w:sz="6" w:color="9DB8AA"/>
+            </w:tcBorders>
+          </w:tcPr>
+          <w:p>
+            <w:r/>
+            <w:r>
+              <w:rPr>
+                <w:rFonts w:ascii="Times New Roman" w:hAnsi="Times New Roman"/>
+                <w:b w:val="0"/>
+                <w:sz w:val="22"/>
+              </w:rPr>
+              <w:t>Âmbar</w:t>
+            </w:r>
+          </w:p>
+        </w:tc>
+        <w:tc>
+          <w:tcPr>
+            <w:tcW w:type="dxa" w:w="2257"/>
+            <w:tcBorders>
+              <w:top w:val="single" w:sz="6" w:color="9DB8AA"/>
+              <w:left w:val="single" w:sz="6" w:color="9DB8AA"/>
+              <w:bottom w:val="single" w:sz="6" w:color="9DB8AA"/>
+              <w:right w:val="single" w:sz="6" w:color="9DB8AA"/>
+            </w:tcBorders>
+          </w:tcPr>
+          <w:p>
+            <w:r/>
+            <w:r>
+              <w:rPr>
+                <w:rFonts w:ascii="Times New Roman" w:hAnsi="Times New Roman"/>
+                <w:b w:val="0"/>
+                <w:sz w:val="22"/>
+              </w:rPr>
+              <w:t>Painel, Acordos, Minha confiança, Barracas, Ajudantes, Conta</w:t>
+            </w:r>
+          </w:p>
+        </w:tc>
+      </w:tr>
+      <w:tr>
+        <w:tc>
+          <w:tcPr>
+            <w:tcW w:type="dxa" w:w="2257"/>
+            <w:tcBorders>
+              <w:top w:val="single" w:sz="6" w:color="9DB8AA"/>
+              <w:left w:val="single" w:sz="6" w:color="9DB8AA"/>
+              <w:bottom w:val="single" w:sz="6" w:color="9DB8AA"/>
+              <w:right w:val="single" w:sz="6" w:color="9DB8AA"/>
+            </w:tcBorders>
+          </w:tcPr>
+          <w:p>
+            <w:r/>
+            <w:r>
+              <w:rPr>
+                <w:rFonts w:ascii="Times New Roman" w:hAnsi="Times New Roman"/>
+                <w:b w:val="0"/>
+                <w:sz w:val="22"/>
+              </w:rPr>
+              <w:t>Equipe ou comprador</w:t>
+            </w:r>
+          </w:p>
+        </w:tc>
+        <w:tc>
+          <w:tcPr>
+            <w:tcW w:type="dxa" w:w="2257"/>
+            <w:tcBorders>
+              <w:top w:val="single" w:sz="6" w:color="9DB8AA"/>
+              <w:left w:val="single" w:sz="6" w:color="9DB8AA"/>
+              <w:bottom w:val="single" w:sz="6" w:color="9DB8AA"/>
+              <w:right w:val="single" w:sz="6" w:color="9DB8AA"/>
+            </w:tcBorders>
+          </w:tcPr>
+          <w:p>
+            <w:r/>
+            <w:r>
+              <w:rPr>
+                <w:rFonts w:ascii="Times New Roman" w:hAnsi="Times New Roman"/>
+                <w:b w:val="0"/>
+                <w:sz w:val="22"/>
+              </w:rPr>
+              <w:t>Ajudante ou cliente</w:t>
+            </w:r>
+          </w:p>
+        </w:tc>
+        <w:tc>
+          <w:tcPr>
+            <w:tcW w:type="dxa" w:w="2257"/>
+            <w:tcBorders>
+              <w:top w:val="single" w:sz="6" w:color="9DB8AA"/>
+              <w:left w:val="single" w:sz="6" w:color="9DB8AA"/>
+              <w:bottom w:val="single" w:sz="6" w:color="9DB8AA"/>
+              <w:right w:val="single" w:sz="6" w:color="9DB8AA"/>
+            </w:tcBorders>
+          </w:tcPr>
+          <w:p>
+            <w:r/>
+            <w:r>
+              <w:rPr>
+                <w:rFonts w:ascii="Times New Roman" w:hAnsi="Times New Roman"/>
+                <w:b w:val="0"/>
+                <w:sz w:val="22"/>
+              </w:rPr>
+              <w:t>Azul</w:t>
+            </w:r>
+          </w:p>
+        </w:tc>
+        <w:tc>
+          <w:tcPr>
+            <w:tcW w:type="dxa" w:w="2257"/>
+            <w:tcBorders>
+              <w:top w:val="single" w:sz="6" w:color="9DB8AA"/>
+              <w:left w:val="single" w:sz="6" w:color="9DB8AA"/>
+              <w:bottom w:val="single" w:sz="6" w:color="9DB8AA"/>
+              <w:right w:val="single" w:sz="6" w:color="9DB8AA"/>
+            </w:tcBorders>
+          </w:tcPr>
+          <w:p>
+            <w:r/>
+            <w:r>
+              <w:rPr>
+                <w:rFonts w:ascii="Times New Roman" w:hAnsi="Times New Roman"/>
+                <w:b w:val="0"/>
+                <w:sz w:val="22"/>
+              </w:rPr>
+              <w:t>Vagas, Meu trabalho, Minhas compras, Conta</w:t>
+            </w:r>
+          </w:p>
+        </w:tc>
+      </w:tr>
+    </w:tbl>
+    <w:p>
+      <w:pPr>
+        <w:rPr>
+          <w:rFonts w:ascii="Times New Roman" w:eastAsia="Times New Roman" w:hAnsi="Times New Roman" w:cs="Times New Roman"/>
+        </w:rPr>
+      </w:pPr>
+    </w:p>
+    <w:p>
+      <w:pPr>
+        <w:rPr>
+          <w:rFonts w:ascii="Times New Roman" w:eastAsia="Times New Roman" w:hAnsi="Times New Roman" w:cs="Times New Roman"/>
+          <w:b/>
+          <w:bCs/>
+        </w:rPr>
+      </w:pPr>
+      <w:r>
+        <w:rPr>
+          <w:rFonts w:ascii="Times New Roman" w:eastAsia="Times New Roman" w:hAnsi="Times New Roman" w:cs="Times New Roman"/>
+          <w:b/>
+          <w:bCs/>
+        </w:rPr>
+        <w:t>Contas de teste da demonstração pública</w:t>
+      </w:r>
+    </w:p>
+    <w:p>
+      <w:pPr>
+        <w:rPr>
+          <w:rFonts w:ascii="Times New Roman" w:eastAsia="Times New Roman" w:hAnsi="Times New Roman" w:cs="Times New Roman"/>
+        </w:rPr>
+      </w:pPr>
+    </w:p>
+    <w:p>
+      <w:pPr>
+        <w:rPr>
+          <w:rFonts w:ascii="Times New Roman" w:eastAsia="Times New Roman" w:hAnsi="Times New Roman" w:cs="Times New Roman"/>
+        </w:rPr>
+      </w:pPr>
+      <w:r>
+        <w:rPr>
+          <w:rFonts w:ascii="Times New Roman" w:eastAsia="Times New Roman" w:hAnsi="Times New Roman" w:cs="Times New Roman"/>
+        </w:rPr>
+        <w:t>A demonstração pública usa dados fictícios (Maria, fornecedor João, ajudante Lia) e rede Solana simulada; os dados são recriados a cada início. A tela de entrada mostra as três contas com o botão Preencher. Endereço: https://giro-demo-oyy1.onrender.com</w:t>
+      </w:r>
+    </w:p>
+    <w:p>
+      <w:pPr>
+        <w:rPr>
+          <w:rFonts w:ascii="Times New Roman" w:eastAsia="Times New Roman" w:hAnsi="Times New Roman" w:cs="Times New Roman"/>
+        </w:rPr>
+      </w:pPr>
+    </w:p>
+    <w:tbl>
+      <w:tblPr>
+        <w:tblW w:type="auto" w:w="0"/>
+        <w:tblLook w:firstColumn="1" w:firstRow="1" w:lastColumn="0" w:lastRow="0" w:noHBand="0" w:noVBand="1" w:val="04A0"/>
+      </w:tblPr>
+      <w:tblGrid>
+        <w:gridCol w:w="2257"/>
+        <w:gridCol w:w="2257"/>
+        <w:gridCol w:w="2257"/>
+        <w:gridCol w:w="2257"/>
+      </w:tblGrid>
+      <w:tr>
+        <w:tc>
+          <w:tcPr>
+            <w:tcW w:type="dxa" w:w="2257"/>
+            <w:tcBorders>
+              <w:top w:val="single" w:sz="6" w:color="9DB8AA"/>
+              <w:left w:val="single" w:sz="6" w:color="9DB8AA"/>
+              <w:bottom w:val="single" w:sz="6" w:color="9DB8AA"/>
+              <w:right w:val="single" w:sz="6" w:color="9DB8AA"/>
+            </w:tcBorders>
+            <w:shd w:val="clear" w:fill="E3F2EA"/>
+          </w:tcPr>
+          <w:p>
+            <w:r/>
+            <w:r>
+              <w:rPr>
+                <w:rFonts w:ascii="Times New Roman" w:hAnsi="Times New Roman"/>
+                <w:b/>
+                <w:sz w:val="22"/>
+              </w:rPr>
+              <w:t>Escolher na entrada</w:t>
+            </w:r>
+          </w:p>
+        </w:tc>
+        <w:tc>
+          <w:tcPr>
+            <w:tcW w:type="dxa" w:w="2257"/>
+            <w:tcBorders>
+              <w:top w:val="single" w:sz="6" w:color="9DB8AA"/>
+              <w:left w:val="single" w:sz="6" w:color="9DB8AA"/>
+              <w:bottom w:val="single" w:sz="6" w:color="9DB8AA"/>
+              <w:right w:val="single" w:sz="6" w:color="9DB8AA"/>
+            </w:tcBorders>
+            <w:shd w:val="clear" w:fill="E3F2EA"/>
+          </w:tcPr>
+          <w:p>
+            <w:r/>
+            <w:r>
+              <w:rPr>
+                <w:rFonts w:ascii="Times New Roman" w:hAnsi="Times New Roman"/>
+                <w:b/>
+                <w:sz w:val="22"/>
+              </w:rPr>
+              <w:t>Usuário</w:t>
+            </w:r>
+          </w:p>
+        </w:tc>
+        <w:tc>
+          <w:tcPr>
+            <w:tcW w:type="dxa" w:w="2257"/>
+            <w:tcBorders>
+              <w:top w:val="single" w:sz="6" w:color="9DB8AA"/>
+              <w:left w:val="single" w:sz="6" w:color="9DB8AA"/>
+              <w:bottom w:val="single" w:sz="6" w:color="9DB8AA"/>
+              <w:right w:val="single" w:sz="6" w:color="9DB8AA"/>
+            </w:tcBorders>
+            <w:shd w:val="clear" w:fill="E3F2EA"/>
+          </w:tcPr>
+          <w:p>
+            <w:r/>
+            <w:r>
+              <w:rPr>
+                <w:rFonts w:ascii="Times New Roman" w:hAnsi="Times New Roman"/>
+                <w:b/>
+                <w:sz w:val="22"/>
+              </w:rPr>
+              <w:t>Senha</w:t>
+            </w:r>
+          </w:p>
+        </w:tc>
+        <w:tc>
+          <w:tcPr>
+            <w:tcW w:type="dxa" w:w="2257"/>
+            <w:tcBorders>
+              <w:top w:val="single" w:sz="6" w:color="9DB8AA"/>
+              <w:left w:val="single" w:sz="6" w:color="9DB8AA"/>
+              <w:bottom w:val="single" w:sz="6" w:color="9DB8AA"/>
+              <w:right w:val="single" w:sz="6" w:color="9DB8AA"/>
+            </w:tcBorders>
+            <w:shd w:val="clear" w:fill="E3F2EA"/>
+          </w:tcPr>
+          <w:p>
+            <w:r/>
+            <w:r>
+              <w:rPr>
+                <w:rFonts w:ascii="Times New Roman" w:hAnsi="Times New Roman"/>
+                <w:b/>
+                <w:sz w:val="22"/>
+              </w:rPr>
+              <w:t>O que abre</w:t>
+            </w:r>
+          </w:p>
+        </w:tc>
+      </w:tr>
+      <w:tr>
+        <w:tc>
+          <w:tcPr>
+            <w:tcW w:type="dxa" w:w="2257"/>
+            <w:tcBorders>
+              <w:top w:val="single" w:sz="6" w:color="9DB8AA"/>
+              <w:left w:val="single" w:sz="6" w:color="9DB8AA"/>
+              <w:bottom w:val="single" w:sz="6" w:color="9DB8AA"/>
+              <w:right w:val="single" w:sz="6" w:color="9DB8AA"/>
+            </w:tcBorders>
+          </w:tcPr>
+          <w:p>
+            <w:r/>
+            <w:r>
+              <w:rPr>
+                <w:rFonts w:ascii="Times New Roman" w:hAnsi="Times New Roman"/>
+                <w:b w:val="0"/>
+                <w:sz w:val="22"/>
+              </w:rPr>
+              <w:t>Minha barraca</w:t>
+            </w:r>
+          </w:p>
+        </w:tc>
+        <w:tc>
+          <w:tcPr>
+            <w:tcW w:type="dxa" w:w="2257"/>
+            <w:tcBorders>
+              <w:top w:val="single" w:sz="6" w:color="9DB8AA"/>
+              <w:left w:val="single" w:sz="6" w:color="9DB8AA"/>
+              <w:bottom w:val="single" w:sz="6" w:color="9DB8AA"/>
+              <w:right w:val="single" w:sz="6" w:color="9DB8AA"/>
+            </w:tcBorders>
+          </w:tcPr>
+          <w:p>
+            <w:r/>
+            <w:r>
+              <w:rPr>
+                <w:rFonts w:ascii="Times New Roman" w:hAnsi="Times New Roman"/>
+                <w:b w:val="0"/>
+                <w:sz w:val="22"/>
+              </w:rPr>
+              <w:t>dona</w:t>
+            </w:r>
+          </w:p>
+        </w:tc>
+        <w:tc>
+          <w:tcPr>
+            <w:tcW w:type="dxa" w:w="2257"/>
+            <w:tcBorders>
+              <w:top w:val="single" w:sz="6" w:color="9DB8AA"/>
+              <w:left w:val="single" w:sz="6" w:color="9DB8AA"/>
+              <w:bottom w:val="single" w:sz="6" w:color="9DB8AA"/>
+              <w:right w:val="single" w:sz="6" w:color="9DB8AA"/>
+            </w:tcBorders>
+          </w:tcPr>
+          <w:p>
+            <w:r/>
+            <w:r>
+              <w:rPr>
+                <w:rFonts w:ascii="Times New Roman" w:hAnsi="Times New Roman"/>
+                <w:b w:val="0"/>
+                <w:sz w:val="22"/>
+              </w:rPr>
+              <w:t>giro-demo-2026</w:t>
+            </w:r>
+          </w:p>
+        </w:tc>
+        <w:tc>
+          <w:tcPr>
+            <w:tcW w:type="dxa" w:w="2257"/>
+            <w:tcBorders>
+              <w:top w:val="single" w:sz="6" w:color="9DB8AA"/>
+              <w:left w:val="single" w:sz="6" w:color="9DB8AA"/>
+              <w:bottom w:val="single" w:sz="6" w:color="9DB8AA"/>
+              <w:right w:val="single" w:sz="6" w:color="9DB8AA"/>
+            </w:tcBorders>
+          </w:tcPr>
+          <w:p>
+            <w:r/>
+            <w:r>
+              <w:rPr>
+                <w:rFonts w:ascii="Times New Roman" w:hAnsi="Times New Roman"/>
+                <w:b w:val="0"/>
+                <w:sz w:val="22"/>
+              </w:rPr>
+              <w:t>App da barraca (verde)</w:t>
+            </w:r>
+          </w:p>
+        </w:tc>
+      </w:tr>
+      <w:tr>
+        <w:tc>
+          <w:tcPr>
+            <w:tcW w:type="dxa" w:w="2257"/>
+            <w:tcBorders>
+              <w:top w:val="single" w:sz="6" w:color="9DB8AA"/>
+              <w:left w:val="single" w:sz="6" w:color="9DB8AA"/>
+              <w:bottom w:val="single" w:sz="6" w:color="9DB8AA"/>
+              <w:right w:val="single" w:sz="6" w:color="9DB8AA"/>
+            </w:tcBorders>
+          </w:tcPr>
+          <w:p>
+            <w:r/>
+            <w:r>
+              <w:rPr>
+                <w:rFonts w:ascii="Times New Roman" w:hAnsi="Times New Roman"/>
+                <w:b w:val="0"/>
+                <w:sz w:val="22"/>
+              </w:rPr>
+              <w:t>Fornecedor(a)</w:t>
+            </w:r>
+          </w:p>
+        </w:tc>
+        <w:tc>
+          <w:tcPr>
+            <w:tcW w:type="dxa" w:w="2257"/>
+            <w:tcBorders>
+              <w:top w:val="single" w:sz="6" w:color="9DB8AA"/>
+              <w:left w:val="single" w:sz="6" w:color="9DB8AA"/>
+              <w:bottom w:val="single" w:sz="6" w:color="9DB8AA"/>
+              <w:right w:val="single" w:sz="6" w:color="9DB8AA"/>
+            </w:tcBorders>
+          </w:tcPr>
+          <w:p>
+            <w:r/>
+            <w:r>
+              <w:rPr>
+                <w:rFonts w:ascii="Times New Roman" w:hAnsi="Times New Roman"/>
+                <w:b w:val="0"/>
+                <w:sz w:val="22"/>
+              </w:rPr>
+              <w:t>joao</w:t>
+            </w:r>
+          </w:p>
+        </w:tc>
+        <w:tc>
+          <w:tcPr>
+            <w:tcW w:type="dxa" w:w="2257"/>
+            <w:tcBorders>
+              <w:top w:val="single" w:sz="6" w:color="9DB8AA"/>
+              <w:left w:val="single" w:sz="6" w:color="9DB8AA"/>
+              <w:bottom w:val="single" w:sz="6" w:color="9DB8AA"/>
+              <w:right w:val="single" w:sz="6" w:color="9DB8AA"/>
+            </w:tcBorders>
+          </w:tcPr>
+          <w:p>
+            <w:r/>
+            <w:r>
+              <w:rPr>
+                <w:rFonts w:ascii="Times New Roman" w:hAnsi="Times New Roman"/>
+                <w:b w:val="0"/>
+                <w:sz w:val="22"/>
+              </w:rPr>
+              <w:t>giro-demo-2026</w:t>
+            </w:r>
+          </w:p>
+        </w:tc>
+        <w:tc>
+          <w:tcPr>
+            <w:tcW w:type="dxa" w:w="2257"/>
+            <w:tcBorders>
+              <w:top w:val="single" w:sz="6" w:color="9DB8AA"/>
+              <w:left w:val="single" w:sz="6" w:color="9DB8AA"/>
+              <w:bottom w:val="single" w:sz="6" w:color="9DB8AA"/>
+              <w:right w:val="single" w:sz="6" w:color="9DB8AA"/>
+            </w:tcBorders>
+          </w:tcPr>
+          <w:p>
+            <w:r/>
+            <w:r>
+              <w:rPr>
+                <w:rFonts w:ascii="Times New Roman" w:hAnsi="Times New Roman"/>
+                <w:b w:val="0"/>
+                <w:sz w:val="22"/>
+              </w:rPr>
+              <w:t>App do fornecedor (âmbar), com o acordo de R$ 600 a 20% das vendas</w:t>
+            </w:r>
+          </w:p>
+        </w:tc>
+      </w:tr>
+      <w:tr>
+        <w:tc>
+          <w:tcPr>
+            <w:tcW w:type="dxa" w:w="2257"/>
+            <w:tcBorders>
+              <w:top w:val="single" w:sz="6" w:color="9DB8AA"/>
+              <w:left w:val="single" w:sz="6" w:color="9DB8AA"/>
+              <w:bottom w:val="single" w:sz="6" w:color="9DB8AA"/>
+              <w:right w:val="single" w:sz="6" w:color="9DB8AA"/>
+            </w:tcBorders>
+          </w:tcPr>
+          <w:p>
+            <w:r/>
+            <w:r>
+              <w:rPr>
+                <w:rFonts w:ascii="Times New Roman" w:hAnsi="Times New Roman"/>
+                <w:b w:val="0"/>
+                <w:sz w:val="22"/>
+              </w:rPr>
+              <w:t>Equipe ou comprador</w:t>
+            </w:r>
+          </w:p>
+        </w:tc>
+        <w:tc>
+          <w:tcPr>
+            <w:tcW w:type="dxa" w:w="2257"/>
+            <w:tcBorders>
+              <w:top w:val="single" w:sz="6" w:color="9DB8AA"/>
+              <w:left w:val="single" w:sz="6" w:color="9DB8AA"/>
+              <w:bottom w:val="single" w:sz="6" w:color="9DB8AA"/>
+              <w:right w:val="single" w:sz="6" w:color="9DB8AA"/>
+            </w:tcBorders>
+          </w:tcPr>
+          <w:p>
+            <w:r/>
+            <w:r>
+              <w:rPr>
+                <w:rFonts w:ascii="Times New Roman" w:hAnsi="Times New Roman"/>
+                <w:b w:val="0"/>
+                <w:sz w:val="22"/>
+              </w:rPr>
+              <w:t>lia</w:t>
+            </w:r>
+          </w:p>
+        </w:tc>
+        <w:tc>
+          <w:tcPr>
+            <w:tcW w:type="dxa" w:w="2257"/>
+            <w:tcBorders>
+              <w:top w:val="single" w:sz="6" w:color="9DB8AA"/>
+              <w:left w:val="single" w:sz="6" w:color="9DB8AA"/>
+              <w:bottom w:val="single" w:sz="6" w:color="9DB8AA"/>
+              <w:right w:val="single" w:sz="6" w:color="9DB8AA"/>
+            </w:tcBorders>
+          </w:tcPr>
+          <w:p>
+            <w:r/>
+            <w:r>
+              <w:rPr>
+                <w:rFonts w:ascii="Times New Roman" w:hAnsi="Times New Roman"/>
+                <w:b w:val="0"/>
+                <w:sz w:val="22"/>
+              </w:rPr>
+              <w:t>giro-demo-2026</w:t>
+            </w:r>
+          </w:p>
+        </w:tc>
+        <w:tc>
+          <w:tcPr>
+            <w:tcW w:type="dxa" w:w="2257"/>
+            <w:tcBorders>
+              <w:top w:val="single" w:sz="6" w:color="9DB8AA"/>
+              <w:left w:val="single" w:sz="6" w:color="9DB8AA"/>
+              <w:bottom w:val="single" w:sz="6" w:color="9DB8AA"/>
+              <w:right w:val="single" w:sz="6" w:color="9DB8AA"/>
+            </w:tcBorders>
+          </w:tcPr>
+          <w:p>
+            <w:r/>
+            <w:r>
+              <w:rPr>
+                <w:rFonts w:ascii="Times New Roman" w:hAnsi="Times New Roman"/>
+                <w:b w:val="0"/>
+                <w:sz w:val="22"/>
+              </w:rPr>
+              <w:t>App da equipe/comprador (azul): vagas, trabalho e compras</w:t>
+            </w:r>
+          </w:p>
+        </w:tc>
+      </w:tr>
+    </w:tbl>
+    <w:p>
+      <w:pPr>
+        <w:rPr>
+          <w:rFonts w:ascii="Times New Roman" w:eastAsia="Times New Roman" w:hAnsi="Times New Roman" w:cs="Times New Roman"/>
+        </w:rPr>
+      </w:pPr>
+    </w:p>
+    <w:p>
+      <w:pPr>
+        <w:rPr>
+          <w:rFonts w:ascii="Times New Roman" w:eastAsia="Times New Roman" w:hAnsi="Times New Roman" w:cs="Times New Roman"/>
+        </w:rPr>
+      </w:pPr>
+      <w:r>
+        <w:rPr>
+          <w:rFonts w:ascii="Times New Roman" w:eastAsia="Times New Roman" w:hAnsi="Times New Roman" w:cs="Times New Roman"/>
+        </w:rPr>
+        <w:t>No link fixo do grupo (https://desktop-jg2rfmg.tail00f1d9.ts.net, que precisa do computador ligado) ficam as contas reais criadas pelos colegas, cada uma com a senha que a própria pessoa escolheu.</w:t>
+      </w:r>
+    </w:p>
+    <w:p>
+      <w:pPr>
+        <w:rPr>
+          <w:rFonts w:ascii="Times New Roman" w:eastAsia="Times New Roman" w:hAnsi="Times New Roman" w:cs="Times New Roman"/>
+        </w:rPr>
+      </w:pPr>
+    </w:p>
+    <w:p>
+      <w:pPr>
+        <w:rPr>
+          <w:rFonts w:ascii="Times New Roman" w:eastAsia="Times New Roman" w:hAnsi="Times New Roman" w:cs="Times New Roman"/>
+          <w:b/>
+          <w:bCs/>
+        </w:rPr>
+      </w:pPr>
+      <w:r>
+        <w:rPr>
+          <w:rFonts w:ascii="Times New Roman" w:eastAsia="Times New Roman" w:hAnsi="Times New Roman" w:cs="Times New Roman"/>
+          <w:b/>
+          <w:bCs/>
+        </w:rPr>
+        <w:t>Barraca (quem vende)</w:t>
+      </w:r>
+    </w:p>
+    <w:p>
+      <w:pPr>
+        <w:rPr>
+          <w:rFonts w:ascii="Times New Roman" w:eastAsia="Times New Roman" w:hAnsi="Times New Roman" w:cs="Times New Roman"/>
+        </w:rPr>
+      </w:pPr>
+    </w:p>
+    <w:p>
+      <w:pPr>
+        <w:numPr>
+          <w:ilvl w:val="0"/>
+          <w:numId w:val="4"/>
+        </w:numPr>
+        <w:rPr>
+          <w:rFonts w:ascii="Times New Roman" w:eastAsia="Times New Roman" w:hAnsi="Times New Roman" w:cs="Times New Roman"/>
+        </w:rPr>
+      </w:pPr>
+      <w:r>
+        <w:rPr>
+          <w:rFonts w:ascii="Times New Roman" w:eastAsia="Times New Roman" w:hAnsi="Times New Roman" w:cs="Times New Roman"/>
+          <w:b/>
+        </w:rPr>
+        <w:t xml:space="preserve">QR fixo da barraca: </w:t>
+      </w:r>
+      <w:r>
+        <w:rPr>
+          <w:rFonts w:ascii="Times New Roman" w:eastAsia="Times New Roman" w:hAnsi="Times New Roman" w:cs="Times New Roman"/>
+          <w:b w:val="0"/>
+        </w:rPr>
+        <w:t>impresso uma vez e deixado na barraca. Quem compra aponta a câmera, digita o valor e paga, sem gerar um código novo a cada venda. A divisão combinada com fornecedores e ajudantes vale normalmente; há limite de valor por compra e de tentativas contra abuso.</w:t>
+      </w:r>
+    </w:p>
+    <w:p>
+      <w:pPr>
+        <w:numPr>
+          <w:ilvl w:val="0"/>
+          <w:numId w:val="4"/>
+        </w:numPr>
+        <w:rPr>
+          <w:rFonts w:ascii="Times New Roman" w:eastAsia="Times New Roman" w:hAnsi="Times New Roman" w:cs="Times New Roman"/>
+        </w:rPr>
+      </w:pPr>
+      <w:r>
+        <w:rPr>
+          <w:rFonts w:ascii="Times New Roman" w:eastAsia="Times New Roman" w:hAnsi="Times New Roman" w:cs="Times New Roman"/>
+          <w:b/>
+        </w:rPr>
+        <w:t xml:space="preserve">Importar dívidas: </w:t>
+      </w:r>
+      <w:r>
+        <w:rPr>
+          <w:rFonts w:ascii="Times New Roman" w:eastAsia="Times New Roman" w:hAnsi="Times New Roman" w:cs="Times New Roman"/>
+          <w:b w:val="0"/>
+        </w:rPr>
+        <w:t>por PDF, Excel (.xlsx) ou CSV, com tabela para revisar antes de salvar, caixa de ajuda e modelo CSV para baixar. Cada dívida importada cria o contato e já envia o convite de acordo.</w:t>
+      </w:r>
+    </w:p>
+    <w:p>
+      <w:pPr>
+        <w:numPr>
+          <w:ilvl w:val="0"/>
+          <w:numId w:val="4"/>
+        </w:numPr>
+        <w:rPr>
+          <w:rFonts w:ascii="Times New Roman" w:eastAsia="Times New Roman" w:hAnsi="Times New Roman" w:cs="Times New Roman"/>
+        </w:rPr>
+      </w:pPr>
+      <w:r>
+        <w:rPr>
+          <w:rFonts w:ascii="Times New Roman" w:eastAsia="Times New Roman" w:hAnsi="Times New Roman" w:cs="Times New Roman"/>
+          <w:b/>
+        </w:rPr>
+        <w:t xml:space="preserve">Usuário próprio da barraca: </w:t>
+      </w:r>
+      <w:r>
+        <w:rPr>
+          <w:rFonts w:ascii="Times New Roman" w:eastAsia="Times New Roman" w:hAnsi="Times New Roman" w:cs="Times New Roman"/>
+          <w:b w:val="0"/>
+        </w:rPr>
+        <w:t>definido em Meu perfil (o usuário “dona” continua funcionando).</w:t>
+      </w:r>
+    </w:p>
+    <w:p>
+      <w:pPr>
+        <w:numPr>
+          <w:ilvl w:val="0"/>
+          <w:numId w:val="4"/>
+        </w:numPr>
+        <w:rPr>
+          <w:rFonts w:ascii="Times New Roman" w:eastAsia="Times New Roman" w:hAnsi="Times New Roman" w:cs="Times New Roman"/>
+        </w:rPr>
+      </w:pPr>
+      <w:r>
+        <w:rPr>
+          <w:rFonts w:ascii="Times New Roman" w:eastAsia="Times New Roman" w:hAnsi="Times New Roman" w:cs="Times New Roman"/>
+          <w:b/>
+        </w:rPr>
+        <w:t xml:space="preserve">Meu perfil no topo: </w:t>
+      </w:r>
+      <w:r>
+        <w:rPr>
+          <w:rFonts w:ascii="Times New Roman" w:eastAsia="Times New Roman" w:hAnsi="Times New Roman" w:cs="Times New Roman"/>
+          <w:b w:val="0"/>
+        </w:rPr>
+        <w:t>foto, Alterar perfil, Ver perfil público e Sair; a foto atualiza na hora.</w:t>
+      </w:r>
+    </w:p>
+    <w:p>
+      <w:pPr>
+        <w:numPr>
+          <w:ilvl w:val="0"/>
+          <w:numId w:val="4"/>
+        </w:numPr>
+        <w:rPr>
+          <w:rFonts w:ascii="Times New Roman" w:eastAsia="Times New Roman" w:hAnsi="Times New Roman" w:cs="Times New Roman"/>
+        </w:rPr>
+      </w:pPr>
+      <w:r>
+        <w:rPr>
+          <w:rFonts w:ascii="Times New Roman" w:eastAsia="Times New Roman" w:hAnsi="Times New Roman" w:cs="Times New Roman"/>
+          <w:b/>
+        </w:rPr>
+        <w:t xml:space="preserve">Visual: </w:t>
+      </w:r>
+      <w:r>
+        <w:rPr>
+          <w:rFonts w:ascii="Times New Roman" w:eastAsia="Times New Roman" w:hAnsi="Times New Roman" w:cs="Times New Roman"/>
+          <w:b w:val="0"/>
+        </w:rPr>
+        <w:t>cartões delimitados, letras maiores, ícones novos, botão Voltar sempre visível, confirmações claras, filtros em Compromissos e o logo GIRO levando ao Início.</w:t>
+      </w:r>
+    </w:p>
+    <w:p>
+      <w:pPr>
+        <w:numPr>
+          <w:ilvl w:val="0"/>
+          <w:numId w:val="4"/>
+        </w:numPr>
+        <w:rPr>
+          <w:rFonts w:ascii="Times New Roman" w:eastAsia="Times New Roman" w:hAnsi="Times New Roman" w:cs="Times New Roman"/>
+        </w:rPr>
+      </w:pPr>
+      <w:r>
+        <w:rPr>
+          <w:rFonts w:ascii="Times New Roman" w:eastAsia="Times New Roman" w:hAnsi="Times New Roman" w:cs="Times New Roman"/>
+          <w:b/>
+        </w:rPr>
+        <w:t xml:space="preserve">Confiança: </w:t>
+      </w:r>
+      <w:r>
+        <w:rPr>
+          <w:rFonts w:ascii="Times New Roman" w:eastAsia="Times New Roman" w:hAnsi="Times New Roman" w:cs="Times New Roman"/>
+          <w:b w:val="0"/>
+        </w:rPr>
+        <w:t>página em blocos, com “Minha confiança” no topo e depois fornecedores e equipe.</w:t>
+      </w:r>
+    </w:p>
+    <w:p>
+      <w:pPr>
+        <w:rPr>
+          <w:rFonts w:ascii="Times New Roman" w:eastAsia="Times New Roman" w:hAnsi="Times New Roman" w:cs="Times New Roman"/>
+        </w:rPr>
+      </w:pPr>
+    </w:p>
+    <w:p>
+      <w:pPr>
+        <w:rPr>
+          <w:rFonts w:ascii="Times New Roman" w:eastAsia="Times New Roman" w:hAnsi="Times New Roman" w:cs="Times New Roman"/>
+          <w:b/>
+          <w:bCs/>
+        </w:rPr>
+      </w:pPr>
+      <w:r>
+        <w:rPr>
+          <w:rFonts w:ascii="Times New Roman" w:eastAsia="Times New Roman" w:hAnsi="Times New Roman" w:cs="Times New Roman"/>
+          <w:b/>
+          <w:bCs/>
+        </w:rPr>
+        <w:t>Fornecedor (aplicativo próprio)</w:t>
+      </w:r>
+    </w:p>
+    <w:p>
+      <w:pPr>
+        <w:rPr>
+          <w:rFonts w:ascii="Times New Roman" w:eastAsia="Times New Roman" w:hAnsi="Times New Roman" w:cs="Times New Roman"/>
+        </w:rPr>
+      </w:pPr>
+    </w:p>
+    <w:p>
+      <w:pPr>
+        <w:numPr>
+          <w:ilvl w:val="0"/>
+          <w:numId w:val="4"/>
+        </w:numPr>
+        <w:rPr>
+          <w:rFonts w:ascii="Times New Roman" w:eastAsia="Times New Roman" w:hAnsi="Times New Roman" w:cs="Times New Roman"/>
+        </w:rPr>
+      </w:pPr>
+      <w:r>
+        <w:rPr>
+          <w:rFonts w:ascii="Times New Roman" w:eastAsia="Times New Roman" w:hAnsi="Times New Roman" w:cs="Times New Roman"/>
+          <w:b/>
+        </w:rPr>
+        <w:t xml:space="preserve">Painel: </w:t>
+      </w:r>
+      <w:r>
+        <w:rPr>
+          <w:rFonts w:ascii="Times New Roman" w:eastAsia="Times New Roman" w:hAnsi="Times New Roman" w:cs="Times New Roman"/>
+          <w:b w:val="0"/>
+        </w:rPr>
+        <w:t>a receber, já recebido, acordos ativos, “Precisa de você” (aceitar acordos e confirmar pagamentos em dinheiro) e os acordos mais recentes.</w:t>
+      </w:r>
+    </w:p>
+    <w:p>
+      <w:pPr>
+        <w:numPr>
+          <w:ilvl w:val="0"/>
+          <w:numId w:val="4"/>
+        </w:numPr>
+        <w:rPr>
+          <w:rFonts w:ascii="Times New Roman" w:eastAsia="Times New Roman" w:hAnsi="Times New Roman" w:cs="Times New Roman"/>
+        </w:rPr>
+      </w:pPr>
+      <w:r>
+        <w:rPr>
+          <w:rFonts w:ascii="Times New Roman" w:eastAsia="Times New Roman" w:hAnsi="Times New Roman" w:cs="Times New Roman"/>
+          <w:b/>
+        </w:rPr>
+        <w:t xml:space="preserve">Acordos: </w:t>
+      </w:r>
+      <w:r>
+        <w:rPr>
+          <w:rFonts w:ascii="Times New Roman" w:eastAsia="Times New Roman" w:hAnsi="Times New Roman" w:cs="Times New Roman"/>
+          <w:b w:val="0"/>
+        </w:rPr>
+        <w:t>todos os acordos com barra de progresso, porcentagem das vendas, vencimento e selo “registrado na Solana”.</w:t>
+      </w:r>
+    </w:p>
+    <w:p>
+      <w:pPr>
+        <w:numPr>
+          <w:ilvl w:val="0"/>
+          <w:numId w:val="4"/>
+        </w:numPr>
+        <w:rPr>
+          <w:rFonts w:ascii="Times New Roman" w:eastAsia="Times New Roman" w:hAnsi="Times New Roman" w:cs="Times New Roman"/>
+        </w:rPr>
+      </w:pPr>
+      <w:r>
+        <w:rPr>
+          <w:rFonts w:ascii="Times New Roman" w:eastAsia="Times New Roman" w:hAnsi="Times New Roman" w:cs="Times New Roman"/>
+          <w:b/>
+        </w:rPr>
+        <w:t xml:space="preserve">Minha confiança: </w:t>
+      </w:r>
+      <w:r>
+        <w:rPr>
+          <w:rFonts w:ascii="Times New Roman" w:eastAsia="Times New Roman" w:hAnsi="Times New Roman" w:cs="Times New Roman"/>
+          <w:b w:val="0"/>
+        </w:rPr>
+        <w:t>o cartão GIRO Confiança do próprio fornecedor, com os acordos cumpridos e confirmados pelos dois lados, e botão para compartilhar.</w:t>
+      </w:r>
+    </w:p>
+    <w:p>
+      <w:pPr>
+        <w:numPr>
+          <w:ilvl w:val="0"/>
+          <w:numId w:val="4"/>
+        </w:numPr>
+        <w:rPr>
+          <w:rFonts w:ascii="Times New Roman" w:eastAsia="Times New Roman" w:hAnsi="Times New Roman" w:cs="Times New Roman"/>
+        </w:rPr>
+      </w:pPr>
+      <w:r>
+        <w:rPr>
+          <w:rFonts w:ascii="Times New Roman" w:eastAsia="Times New Roman" w:hAnsi="Times New Roman" w:cs="Times New Roman"/>
+          <w:b/>
+        </w:rPr>
+        <w:t xml:space="preserve">Barracas: </w:t>
+      </w:r>
+      <w:r>
+        <w:rPr>
+          <w:rFonts w:ascii="Times New Roman" w:eastAsia="Times New Roman" w:hAnsi="Times New Roman" w:cs="Times New Roman"/>
+          <w:b w:val="0"/>
+        </w:rPr>
+        <w:t>confiança das barracas antes de vender a prazo e perfis de confiança.</w:t>
+      </w:r>
+    </w:p>
+    <w:p>
+      <w:pPr>
+        <w:numPr>
+          <w:ilvl w:val="0"/>
+          <w:numId w:val="4"/>
+        </w:numPr>
+        <w:rPr>
+          <w:rFonts w:ascii="Times New Roman" w:eastAsia="Times New Roman" w:hAnsi="Times New Roman" w:cs="Times New Roman"/>
+        </w:rPr>
+      </w:pPr>
+      <w:r>
+        <w:rPr>
+          <w:rFonts w:ascii="Times New Roman" w:eastAsia="Times New Roman" w:hAnsi="Times New Roman" w:cs="Times New Roman"/>
+          <w:b/>
+        </w:rPr>
+        <w:t xml:space="preserve">Ajudantes: </w:t>
+      </w:r>
+      <w:r>
+        <w:rPr>
+          <w:rFonts w:ascii="Times New Roman" w:eastAsia="Times New Roman" w:hAnsi="Times New Roman" w:cs="Times New Roman"/>
+          <w:b w:val="0"/>
+        </w:rPr>
+        <w:t>publicar vaga (Procuro ajudante) e ver quem busca trabalho.</w:t>
+      </w:r>
+    </w:p>
+    <w:p>
+      <w:pPr>
+        <w:numPr>
+          <w:ilvl w:val="0"/>
+          <w:numId w:val="4"/>
+        </w:numPr>
+        <w:rPr>
+          <w:rFonts w:ascii="Times New Roman" w:eastAsia="Times New Roman" w:hAnsi="Times New Roman" w:cs="Times New Roman"/>
+        </w:rPr>
+      </w:pPr>
+      <w:r>
+        <w:rPr>
+          <w:rFonts w:ascii="Times New Roman" w:eastAsia="Times New Roman" w:hAnsi="Times New Roman" w:cs="Times New Roman"/>
+          <w:b/>
+        </w:rPr>
+        <w:t xml:space="preserve">Conta: </w:t>
+      </w:r>
+      <w:r>
+        <w:rPr>
+          <w:rFonts w:ascii="Times New Roman" w:eastAsia="Times New Roman" w:hAnsi="Times New Roman" w:cs="Times New Roman"/>
+          <w:b w:val="0"/>
+        </w:rPr>
+        <w:t>foto, perfil público, senha, carteira Solana e código de convite para outras barracas.</w:t>
+      </w:r>
+    </w:p>
+    <w:p>
+      <w:pPr>
+        <w:rPr>
+          <w:rFonts w:ascii="Times New Roman" w:eastAsia="Times New Roman" w:hAnsi="Times New Roman" w:cs="Times New Roman"/>
+        </w:rPr>
+      </w:pPr>
+    </w:p>
+    <w:p>
+      <w:pPr>
+        <w:rPr>
+          <w:rFonts w:ascii="Times New Roman" w:eastAsia="Times New Roman" w:hAnsi="Times New Roman" w:cs="Times New Roman"/>
+          <w:b/>
+          <w:bCs/>
+        </w:rPr>
+      </w:pPr>
+      <w:r>
+        <w:rPr>
+          <w:rFonts w:ascii="Times New Roman" w:eastAsia="Times New Roman" w:hAnsi="Times New Roman" w:cs="Times New Roman"/>
+          <w:b/>
+          <w:bCs/>
+        </w:rPr>
+        <w:t>Equipe ou comprador (aplicativo próprio)</w:t>
+      </w:r>
+    </w:p>
+    <w:p>
+      <w:pPr>
+        <w:rPr>
+          <w:rFonts w:ascii="Times New Roman" w:eastAsia="Times New Roman" w:hAnsi="Times New Roman" w:cs="Times New Roman"/>
+        </w:rPr>
+      </w:pPr>
+    </w:p>
+    <w:p>
+      <w:pPr>
+        <w:numPr>
+          <w:ilvl w:val="0"/>
+          <w:numId w:val="4"/>
+        </w:numPr>
+        <w:rPr>
+          <w:rFonts w:ascii="Times New Roman" w:eastAsia="Times New Roman" w:hAnsi="Times New Roman" w:cs="Times New Roman"/>
+        </w:rPr>
+      </w:pPr>
+      <w:r>
+        <w:rPr>
+          <w:rFonts w:ascii="Times New Roman" w:eastAsia="Times New Roman" w:hAnsi="Times New Roman" w:cs="Times New Roman"/>
+          <w:b/>
+        </w:rPr>
+        <w:t xml:space="preserve">Vagas (tela inicial): </w:t>
+      </w:r>
+      <w:r>
+        <w:rPr>
+          <w:rFonts w:ascii="Times New Roman" w:eastAsia="Times New Roman" w:hAnsi="Times New Roman" w:cs="Times New Roman"/>
+          <w:b w:val="0"/>
+        </w:rPr>
+        <w:t>vagas de ajudante com a experiência da pessoa conferida pelo GIRO, Tenho interesse e Busco trabalho.</w:t>
+      </w:r>
+    </w:p>
+    <w:p>
+      <w:pPr>
+        <w:numPr>
+          <w:ilvl w:val="0"/>
+          <w:numId w:val="4"/>
+        </w:numPr>
+        <w:rPr>
+          <w:rFonts w:ascii="Times New Roman" w:eastAsia="Times New Roman" w:hAnsi="Times New Roman" w:cs="Times New Roman"/>
+        </w:rPr>
+      </w:pPr>
+      <w:r>
+        <w:rPr>
+          <w:rFonts w:ascii="Times New Roman" w:eastAsia="Times New Roman" w:hAnsi="Times New Roman" w:cs="Times New Roman"/>
+          <w:b/>
+        </w:rPr>
+        <w:t xml:space="preserve">Meu trabalho: </w:t>
+      </w:r>
+      <w:r>
+        <w:rPr>
+          <w:rFonts w:ascii="Times New Roman" w:eastAsia="Times New Roman" w:hAnsi="Times New Roman" w:cs="Times New Roman"/>
+          <w:b w:val="0"/>
+        </w:rPr>
+        <w:t>turno, comissão, quanto já recebeu, pagamentos em dinheiro para confirmar e acordos.</w:t>
+      </w:r>
+    </w:p>
+    <w:p>
+      <w:pPr>
+        <w:numPr>
+          <w:ilvl w:val="0"/>
+          <w:numId w:val="4"/>
+        </w:numPr>
+        <w:rPr>
+          <w:rFonts w:ascii="Times New Roman" w:eastAsia="Times New Roman" w:hAnsi="Times New Roman" w:cs="Times New Roman"/>
+        </w:rPr>
+      </w:pPr>
+      <w:r>
+        <w:rPr>
+          <w:rFonts w:ascii="Times New Roman" w:eastAsia="Times New Roman" w:hAnsi="Times New Roman" w:cs="Times New Roman"/>
+          <w:b/>
+        </w:rPr>
+        <w:t xml:space="preserve">Minhas compras: </w:t>
+      </w:r>
+      <w:r>
+        <w:rPr>
+          <w:rFonts w:ascii="Times New Roman" w:eastAsia="Times New Roman" w:hAnsi="Times New Roman" w:cs="Times New Roman"/>
+          <w:b w:val="0"/>
+        </w:rPr>
+        <w:t>compras pagas pelo QR da barraca com a conta aberta, total gasto e confiança das barracas.</w:t>
+      </w:r>
+    </w:p>
+    <w:p>
+      <w:pPr>
+        <w:numPr>
+          <w:ilvl w:val="0"/>
+          <w:numId w:val="4"/>
+        </w:numPr>
+        <w:rPr>
+          <w:rFonts w:ascii="Times New Roman" w:eastAsia="Times New Roman" w:hAnsi="Times New Roman" w:cs="Times New Roman"/>
+        </w:rPr>
+      </w:pPr>
+      <w:r>
+        <w:rPr>
+          <w:rFonts w:ascii="Times New Roman" w:eastAsia="Times New Roman" w:hAnsi="Times New Roman" w:cs="Times New Roman"/>
+          <w:b/>
+        </w:rPr>
+        <w:t xml:space="preserve">Conta: </w:t>
+      </w:r>
+      <w:r>
+        <w:rPr>
+          <w:rFonts w:ascii="Times New Roman" w:eastAsia="Times New Roman" w:hAnsi="Times New Roman" w:cs="Times New Roman"/>
+          <w:b w:val="0"/>
+        </w:rPr>
+        <w:t>foto, perfil público, senha, carteira e convite para amigos.</w:t>
+      </w:r>
+    </w:p>
+    <w:p>
+      <w:pPr>
+        <w:rPr>
+          <w:rFonts w:ascii="Times New Roman" w:eastAsia="Times New Roman" w:hAnsi="Times New Roman" w:cs="Times New Roman"/>
+        </w:rPr>
+      </w:pPr>
+    </w:p>
+    <w:p>
+      <w:pPr>
+        <w:rPr>
+          <w:rFonts w:ascii="Times New Roman" w:eastAsia="Times New Roman" w:hAnsi="Times New Roman" w:cs="Times New Roman"/>
+          <w:b/>
+          <w:bCs/>
+        </w:rPr>
+      </w:pPr>
+      <w:r>
+        <w:rPr>
+          <w:rFonts w:ascii="Times New Roman" w:eastAsia="Times New Roman" w:hAnsi="Times New Roman" w:cs="Times New Roman"/>
+          <w:b/>
+          <w:bCs/>
+        </w:rPr>
+        <w:t>Vagas de ajudante com experiência verificada</w:t>
+      </w:r>
+    </w:p>
+    <w:p>
+      <w:pPr>
+        <w:rPr>
+          <w:rFonts w:ascii="Times New Roman" w:eastAsia="Times New Roman" w:hAnsi="Times New Roman" w:cs="Times New Roman"/>
+        </w:rPr>
+      </w:pPr>
+    </w:p>
+    <w:p>
+      <w:pPr>
+        <w:rPr>
+          <w:rFonts w:ascii="Times New Roman" w:eastAsia="Times New Roman" w:hAnsi="Times New Roman" w:cs="Times New Roman"/>
+        </w:rPr>
+      </w:pPr>
+      <w:r>
+        <w:rPr>
+          <w:rFonts w:ascii="Times New Roman" w:eastAsia="Times New Roman" w:hAnsi="Times New Roman" w:cs="Times New Roman"/>
+        </w:rPr>
+        <w:t>A barraca e o fornecedor publicam “Procuro ajudante” com regras: experiência mínima em meses e mínimo de dias trabalhados. Quem é da equipe ou comprador clica em “Tenho interesse”. O GIRO confere a experiência pelo histórico de comissões recebidas (dias trabalhados, meses e total recebido) e mostra “Atende às regras” ou “Ainda não atende”: a experiência não é declarada, ela vem do histórico. Também existe a lista “Busco trabalho”, com resumo, contato, link do perfil de confiança e botão de WhatsApp.</w:t>
+      </w:r>
+    </w:p>
+    <w:p>
+      <w:pPr>
+        <w:rPr>
+          <w:rFonts w:ascii="Times New Roman" w:eastAsia="Times New Roman" w:hAnsi="Times New Roman" w:cs="Times New Roman"/>
+        </w:rPr>
+      </w:pPr>
+    </w:p>
+    <w:p>
+      <w:pPr>
+        <w:rPr>
+          <w:rFonts w:ascii="Times New Roman" w:eastAsia="Times New Roman" w:hAnsi="Times New Roman" w:cs="Times New Roman"/>
+          <w:b/>
+          <w:bCs/>
+        </w:rPr>
+      </w:pPr>
+      <w:r>
+        <w:rPr>
+          <w:rFonts w:ascii="Times New Roman" w:eastAsia="Times New Roman" w:hAnsi="Times New Roman" w:cs="Times New Roman"/>
+          <w:b/>
+          <w:bCs/>
+        </w:rPr>
+        <w:t>Site em inglês</w:t>
+      </w:r>
+    </w:p>
+    <w:p>
+      <w:pPr>
+        <w:rPr>
+          <w:rFonts w:ascii="Times New Roman" w:eastAsia="Times New Roman" w:hAnsi="Times New Roman" w:cs="Times New Roman"/>
+        </w:rPr>
+      </w:pPr>
+    </w:p>
+    <w:p>
+      <w:pPr>
+        <w:rPr>
+          <w:rFonts w:ascii="Times New Roman" w:eastAsia="Times New Roman" w:hAnsi="Times New Roman" w:cs="Times New Roman"/>
+        </w:rPr>
+      </w:pPr>
+      <w:r>
+        <w:rPr>
+          <w:rFonts w:ascii="Times New Roman" w:eastAsia="Times New Roman" w:hAnsi="Times New Roman" w:cs="Times New Roman"/>
+        </w:rPr>
+        <w:t>Seletor PT / EN no topo de todas as telas e na entrada (a escolha fica salva no navegador). Também é possível abrir direto em inglês acrescentando ?lang=en ao endereço. “GIRO” e “GIRO Confiança” continuam em português, e os valores aparecem no formato americano quando o site está em inglês.</w:t>
+      </w:r>
+    </w:p>
+    <w:p>
+      <w:pPr>
+        <w:rPr>
+          <w:rFonts w:ascii="Times New Roman" w:eastAsia="Times New Roman" w:hAnsi="Times New Roman" w:cs="Times New Roman"/>
+        </w:rPr>
+      </w:pPr>
+    </w:p>
+    <w:p>
+      <w:pPr>
+        <w:rPr>
+          <w:rFonts w:ascii="Times New Roman" w:eastAsia="Times New Roman" w:hAnsi="Times New Roman" w:cs="Times New Roman"/>
+          <w:b/>
+          <w:bCs/>
+        </w:rPr>
+      </w:pPr>
+      <w:r>
+        <w:rPr>
+          <w:rFonts w:ascii="Times New Roman" w:eastAsia="Times New Roman" w:hAnsi="Times New Roman" w:cs="Times New Roman"/>
+          <w:b/>
+          <w:bCs/>
+        </w:rPr>
+        <w:t>Endereços</w:t>
+      </w:r>
+    </w:p>
+    <w:p>
+      <w:pPr>
+        <w:rPr>
+          <w:rFonts w:ascii="Times New Roman" w:eastAsia="Times New Roman" w:hAnsi="Times New Roman" w:cs="Times New Roman"/>
+        </w:rPr>
+      </w:pPr>
+    </w:p>
+    <w:tbl>
+      <w:tblPr>
+        <w:tblW w:type="auto" w:w="0"/>
+        <w:tblLook w:firstColumn="1" w:firstRow="1" w:lastColumn="0" w:lastRow="0" w:noHBand="0" w:noVBand="1" w:val="04A0"/>
+      </w:tblPr>
+      <w:tblGrid>
+        <w:gridCol w:w="3010"/>
+        <w:gridCol w:w="3010"/>
+        <w:gridCol w:w="3010"/>
+      </w:tblGrid>
+      <w:tr>
+        <w:tc>
+          <w:tcPr>
+            <w:tcW w:type="dxa" w:w="3010"/>
+            <w:tcBorders>
+              <w:top w:val="single" w:sz="6" w:color="9DB8AA"/>
+              <w:left w:val="single" w:sz="6" w:color="9DB8AA"/>
+              <w:bottom w:val="single" w:sz="6" w:color="9DB8AA"/>
+              <w:right w:val="single" w:sz="6" w:color="9DB8AA"/>
+            </w:tcBorders>
+            <w:shd w:val="clear" w:fill="E3F2EA"/>
+          </w:tcPr>
+          <w:p>
+            <w:r/>
+            <w:r>
+              <w:rPr>
+                <w:rFonts w:ascii="Times New Roman" w:hAnsi="Times New Roman"/>
+                <w:b/>
+                <w:sz w:val="22"/>
+              </w:rPr>
+              <w:t>Endereço</w:t>
+            </w:r>
+          </w:p>
+        </w:tc>
+        <w:tc>
+          <w:tcPr>
+            <w:tcW w:type="dxa" w:w="3010"/>
+            <w:tcBorders>
+              <w:top w:val="single" w:sz="6" w:color="9DB8AA"/>
+              <w:left w:val="single" w:sz="6" w:color="9DB8AA"/>
+              <w:bottom w:val="single" w:sz="6" w:color="9DB8AA"/>
+              <w:right w:val="single" w:sz="6" w:color="9DB8AA"/>
+            </w:tcBorders>
+            <w:shd w:val="clear" w:fill="E3F2EA"/>
+          </w:tcPr>
+          <w:p>
+            <w:r/>
+            <w:r>
+              <w:rPr>
+                <w:rFonts w:ascii="Times New Roman" w:hAnsi="Times New Roman"/>
+                <w:b/>
+                <w:sz w:val="22"/>
+              </w:rPr>
+              <w:t>Para quê</w:t>
+            </w:r>
+          </w:p>
+        </w:tc>
+        <w:tc>
+          <w:tcPr>
+            <w:tcW w:type="dxa" w:w="3010"/>
+            <w:tcBorders>
+              <w:top w:val="single" w:sz="6" w:color="9DB8AA"/>
+              <w:left w:val="single" w:sz="6" w:color="9DB8AA"/>
+              <w:bottom w:val="single" w:sz="6" w:color="9DB8AA"/>
+              <w:right w:val="single" w:sz="6" w:color="9DB8AA"/>
+            </w:tcBorders>
+            <w:shd w:val="clear" w:fill="E3F2EA"/>
+          </w:tcPr>
+          <w:p>
+            <w:r/>
+            <w:r>
+              <w:rPr>
+                <w:rFonts w:ascii="Times New Roman" w:hAnsi="Times New Roman"/>
+                <w:b/>
+                <w:sz w:val="22"/>
+              </w:rPr>
+              <w:t>Observação</w:t>
+            </w:r>
+          </w:p>
+        </w:tc>
+      </w:tr>
+      <w:tr>
+        <w:tc>
+          <w:tcPr>
+            <w:tcW w:type="dxa" w:w="3010"/>
+            <w:tcBorders>
+              <w:top w:val="single" w:sz="6" w:color="9DB8AA"/>
+              <w:left w:val="single" w:sz="6" w:color="9DB8AA"/>
+              <w:bottom w:val="single" w:sz="6" w:color="9DB8AA"/>
+              <w:right w:val="single" w:sz="6" w:color="9DB8AA"/>
+            </w:tcBorders>
+          </w:tcPr>
+          <w:p>
+            <w:r/>
+            <w:r>
+              <w:rPr>
+                <w:rFonts w:ascii="Times New Roman" w:hAnsi="Times New Roman"/>
+                <w:b w:val="0"/>
+                <w:sz w:val="22"/>
+              </w:rPr>
+              <w:t>https://giro-demo-oyy1.onrender.com</w:t>
+            </w:r>
+          </w:p>
+        </w:tc>
+        <w:tc>
+          <w:tcPr>
+            <w:tcW w:type="dxa" w:w="3010"/>
+            <w:tcBorders>
+              <w:top w:val="single" w:sz="6" w:color="9DB8AA"/>
+              <w:left w:val="single" w:sz="6" w:color="9DB8AA"/>
+              <w:bottom w:val="single" w:sz="6" w:color="9DB8AA"/>
+              <w:right w:val="single" w:sz="6" w:color="9DB8AA"/>
+            </w:tcBorders>
+          </w:tcPr>
+          <w:p>
+            <w:r/>
+            <w:r>
+              <w:rPr>
+                <w:rFonts w:ascii="Times New Roman" w:hAnsi="Times New Roman"/>
+                <w:b w:val="0"/>
+                <w:sz w:val="22"/>
+              </w:rPr>
+              <w:t>Demonstração pública</w:t>
+            </w:r>
+          </w:p>
+        </w:tc>
+        <w:tc>
+          <w:tcPr>
+            <w:tcW w:type="dxa" w:w="3010"/>
+            <w:tcBorders>
+              <w:top w:val="single" w:sz="6" w:color="9DB8AA"/>
+              <w:left w:val="single" w:sz="6" w:color="9DB8AA"/>
+              <w:bottom w:val="single" w:sz="6" w:color="9DB8AA"/>
+              <w:right w:val="single" w:sz="6" w:color="9DB8AA"/>
+            </w:tcBorders>
+          </w:tcPr>
+          <w:p>
+            <w:r/>
+            <w:r>
+              <w:rPr>
+                <w:rFonts w:ascii="Times New Roman" w:hAnsi="Times New Roman"/>
+                <w:b w:val="0"/>
+                <w:sz w:val="22"/>
+              </w:rPr>
+              <w:t>Fica no ar sem o computador ligado; dados fictícios</w:t>
+            </w:r>
+          </w:p>
+        </w:tc>
+      </w:tr>
+      <w:tr>
+        <w:tc>
+          <w:tcPr>
+            <w:tcW w:type="dxa" w:w="3010"/>
+            <w:tcBorders>
+              <w:top w:val="single" w:sz="6" w:color="9DB8AA"/>
+              <w:left w:val="single" w:sz="6" w:color="9DB8AA"/>
+              <w:bottom w:val="single" w:sz="6" w:color="9DB8AA"/>
+              <w:right w:val="single" w:sz="6" w:color="9DB8AA"/>
+            </w:tcBorders>
+          </w:tcPr>
+          <w:p>
+            <w:r/>
+            <w:r>
+              <w:rPr>
+                <w:rFonts w:ascii="Times New Roman" w:hAnsi="Times New Roman"/>
+                <w:b w:val="0"/>
+                <w:sz w:val="22"/>
+              </w:rPr>
+              <w:t>https://desktop-jg2rfmg.tail00f1d9.ts.net</w:t>
+            </w:r>
+          </w:p>
+        </w:tc>
+        <w:tc>
+          <w:tcPr>
+            <w:tcW w:type="dxa" w:w="3010"/>
+            <w:tcBorders>
+              <w:top w:val="single" w:sz="6" w:color="9DB8AA"/>
+              <w:left w:val="single" w:sz="6" w:color="9DB8AA"/>
+              <w:bottom w:val="single" w:sz="6" w:color="9DB8AA"/>
+              <w:right w:val="single" w:sz="6" w:color="9DB8AA"/>
+            </w:tcBorders>
+          </w:tcPr>
+          <w:p>
+            <w:r/>
+            <w:r>
+              <w:rPr>
+                <w:rFonts w:ascii="Times New Roman" w:hAnsi="Times New Roman"/>
+                <w:b w:val="0"/>
+                <w:sz w:val="22"/>
+              </w:rPr>
+              <w:t>Link fixo do grupo</w:t>
+            </w:r>
+          </w:p>
+        </w:tc>
+        <w:tc>
+          <w:tcPr>
+            <w:tcW w:type="dxa" w:w="3010"/>
+            <w:tcBorders>
+              <w:top w:val="single" w:sz="6" w:color="9DB8AA"/>
+              <w:left w:val="single" w:sz="6" w:color="9DB8AA"/>
+              <w:bottom w:val="single" w:sz="6" w:color="9DB8AA"/>
+              <w:right w:val="single" w:sz="6" w:color="9DB8AA"/>
+            </w:tcBorders>
+          </w:tcPr>
+          <w:p>
+            <w:r/>
+            <w:r>
+              <w:rPr>
+                <w:rFonts w:ascii="Times New Roman" w:hAnsi="Times New Roman"/>
+                <w:b w:val="0"/>
+                <w:sz w:val="22"/>
+              </w:rPr>
+              <w:t>Precisa do computador ligado com npm run publico</w:t>
+            </w:r>
+          </w:p>
+        </w:tc>
+      </w:tr>
+      <w:tr>
+        <w:tc>
+          <w:tcPr>
+            <w:tcW w:type="dxa" w:w="3010"/>
+            <w:tcBorders>
+              <w:top w:val="single" w:sz="6" w:color="9DB8AA"/>
+              <w:left w:val="single" w:sz="6" w:color="9DB8AA"/>
+              <w:bottom w:val="single" w:sz="6" w:color="9DB8AA"/>
+              <w:right w:val="single" w:sz="6" w:color="9DB8AA"/>
+            </w:tcBorders>
+          </w:tcPr>
+          <w:p>
+            <w:r/>
+            <w:r>
+              <w:rPr>
+                <w:rFonts w:ascii="Times New Roman" w:hAnsi="Times New Roman"/>
+                <w:b w:val="0"/>
+                <w:sz w:val="22"/>
+              </w:rPr>
+              <w:t>https://github.com/vaz-123ale/giro</w:t>
+            </w:r>
+          </w:p>
+        </w:tc>
+        <w:tc>
+          <w:tcPr>
+            <w:tcW w:type="dxa" w:w="3010"/>
+            <w:tcBorders>
+              <w:top w:val="single" w:sz="6" w:color="9DB8AA"/>
+              <w:left w:val="single" w:sz="6" w:color="9DB8AA"/>
+              <w:bottom w:val="single" w:sz="6" w:color="9DB8AA"/>
+              <w:right w:val="single" w:sz="6" w:color="9DB8AA"/>
+            </w:tcBorders>
+          </w:tcPr>
+          <w:p>
+            <w:r/>
+            <w:r>
+              <w:rPr>
+                <w:rFonts w:ascii="Times New Roman" w:hAnsi="Times New Roman"/>
+                <w:b w:val="0"/>
+                <w:sz w:val="22"/>
+              </w:rPr>
+              <w:t>Código-fonte</w:t>
+            </w:r>
+          </w:p>
+        </w:tc>
+        <w:tc>
+          <w:tcPr>
+            <w:tcW w:type="dxa" w:w="3010"/>
+            <w:tcBorders>
+              <w:top w:val="single" w:sz="6" w:color="9DB8AA"/>
+              <w:left w:val="single" w:sz="6" w:color="9DB8AA"/>
+              <w:bottom w:val="single" w:sz="6" w:color="9DB8AA"/>
+              <w:right w:val="single" w:sz="6" w:color="9DB8AA"/>
+            </w:tcBorders>
+          </w:tcPr>
+          <w:p>
+            <w:r/>
+            <w:r>
+              <w:rPr>
+                <w:rFonts w:ascii="Times New Roman" w:hAnsi="Times New Roman"/>
+                <w:b w:val="0"/>
+                <w:sz w:val="22"/>
+              </w:rPr>
+              <w:t>Licença MIT</w:t>
+            </w:r>
+          </w:p>
+        </w:tc>
+      </w:tr>
+    </w:tbl>
     <w:sectPr>
       <w:footerReference w:type="default" r:id="rId10"/>
       <w:pgSz w:w="11909" w:h="16834"/>

</xml_diff>

<commit_message>
Atualizações de outubro no documento do projeto em inglês (seção 12, com tabelas de contas e contas de teste); documento em português volta ao original
</commit_message>
<xml_diff>
--- a/Documentacao/GIRO - Receitas programaveis e confianca comercial para pequenos negocios.docx
+++ b/Documentacao/GIRO - Receitas programaveis e confianca comercial para pequenos negocios.docx
@@ -6310,1822 +6310,6 @@
         </w:rPr>
       </w:pPr>
     </w:p>
-    <w:p>
-      <w:pPr>
-        <w:rPr>
-          <w:rFonts w:ascii="Times New Roman" w:eastAsia="Times New Roman" w:hAnsi="Times New Roman" w:cs="Times New Roman"/>
-        </w:rPr>
-      </w:pPr>
-    </w:p>
-    <w:p>
-      <w:pPr>
-        <w:rPr>
-          <w:rFonts w:ascii="Times New Roman" w:eastAsia="Times New Roman" w:hAnsi="Times New Roman" w:cs="Times New Roman"/>
-          <w:b/>
-          <w:bCs/>
-        </w:rPr>
-      </w:pPr>
-      <w:r>
-        <w:rPr>
-          <w:rFonts w:ascii="Times New Roman" w:eastAsia="Times New Roman" w:hAnsi="Times New Roman" w:cs="Times New Roman"/>
-          <w:b/>
-          <w:bCs/>
-        </w:rPr>
-        <w:t>Atualizações de outubro de 2026</w:t>
-      </w:r>
-    </w:p>
-    <w:p>
-      <w:pPr>
-        <w:rPr>
-          <w:rFonts w:ascii="Times New Roman" w:eastAsia="Times New Roman" w:hAnsi="Times New Roman" w:cs="Times New Roman"/>
-        </w:rPr>
-      </w:pPr>
-    </w:p>
-    <w:p>
-      <w:pPr>
-        <w:rPr>
-          <w:rFonts w:ascii="Times New Roman" w:eastAsia="Times New Roman" w:hAnsi="Times New Roman" w:cs="Times New Roman"/>
-        </w:rPr>
-      </w:pPr>
-      <w:r>
-        <w:rPr>
-          <w:rFonts w:ascii="Times New Roman" w:eastAsia="Times New Roman" w:hAnsi="Times New Roman" w:cs="Times New Roman"/>
-        </w:rPr>
-        <w:t>Esta seção reúne tudo o que foi acrescentado ao protótipo desde o QR fixo da barraca e a divisão por tipo de conta. Tudo foi testado apenas com dados fictícios (colegas simulando fornecedores, CNPJs inventados, sem dinheiro real). O projeto piloto continua sendo o próximo passo.</w:t>
-      </w:r>
-    </w:p>
-    <w:p>
-      <w:pPr>
-        <w:rPr>
-          <w:rFonts w:ascii="Times New Roman" w:eastAsia="Times New Roman" w:hAnsi="Times New Roman" w:cs="Times New Roman"/>
-        </w:rPr>
-      </w:pPr>
-    </w:p>
-    <w:p>
-      <w:pPr>
-        <w:rPr>
-          <w:rFonts w:ascii="Times New Roman" w:eastAsia="Times New Roman" w:hAnsi="Times New Roman" w:cs="Times New Roman"/>
-          <w:b/>
-          <w:bCs/>
-        </w:rPr>
-      </w:pPr>
-      <w:r>
-        <w:rPr>
-          <w:rFonts w:ascii="Times New Roman" w:eastAsia="Times New Roman" w:hAnsi="Times New Roman" w:cs="Times New Roman"/>
-          <w:b/>
-          <w:bCs/>
-        </w:rPr>
-        <w:t>Três tipos de conta, cada um com o seu aplicativo</w:t>
-      </w:r>
-    </w:p>
-    <w:p>
-      <w:pPr>
-        <w:rPr>
-          <w:rFonts w:ascii="Times New Roman" w:eastAsia="Times New Roman" w:hAnsi="Times New Roman" w:cs="Times New Roman"/>
-        </w:rPr>
-      </w:pPr>
-    </w:p>
-    <w:p>
-      <w:pPr>
-        <w:rPr>
-          <w:rFonts w:ascii="Times New Roman" w:eastAsia="Times New Roman" w:hAnsi="Times New Roman" w:cs="Times New Roman"/>
-        </w:rPr>
-      </w:pPr>
-      <w:r>
-        <w:rPr>
-          <w:rFonts w:ascii="Times New Roman" w:eastAsia="Times New Roman" w:hAnsi="Times New Roman" w:cs="Times New Roman"/>
-        </w:rPr>
-        <w:t>Na tela Entrar, a pessoa escolhe com qual conta vai entrar. O GIRO confere se a conta é mesmo daquele tipo; se não for, avisa qual opção escolher (por exemplo: “Esta conta é de fornecedor(a). Escolha Fornecedor(a) para entrar”). Cada conta vê só o que é dela.</w:t>
-      </w:r>
-    </w:p>
-    <w:p>
-      <w:pPr>
-        <w:rPr>
-          <w:rFonts w:ascii="Times New Roman" w:eastAsia="Times New Roman" w:hAnsi="Times New Roman" w:cs="Times New Roman"/>
-        </w:rPr>
-      </w:pPr>
-    </w:p>
-    <w:tbl>
-      <w:tblPr>
-        <w:tblW w:type="auto" w:w="0"/>
-        <w:tblLook w:firstColumn="1" w:firstRow="1" w:lastColumn="0" w:lastRow="0" w:noHBand="0" w:noVBand="1" w:val="04A0"/>
-      </w:tblPr>
-      <w:tblGrid>
-        <w:gridCol w:w="2257"/>
-        <w:gridCol w:w="2257"/>
-        <w:gridCol w:w="2257"/>
-        <w:gridCol w:w="2257"/>
-      </w:tblGrid>
-      <w:tr>
-        <w:tc>
-          <w:tcPr>
-            <w:tcW w:type="dxa" w:w="2257"/>
-            <w:tcBorders>
-              <w:top w:val="single" w:sz="6" w:color="9DB8AA"/>
-              <w:left w:val="single" w:sz="6" w:color="9DB8AA"/>
-              <w:bottom w:val="single" w:sz="6" w:color="9DB8AA"/>
-              <w:right w:val="single" w:sz="6" w:color="9DB8AA"/>
-            </w:tcBorders>
-            <w:shd w:val="clear" w:fill="E3F2EA"/>
-          </w:tcPr>
-          <w:p>
-            <w:r/>
-            <w:r>
-              <w:rPr>
-                <w:rFonts w:ascii="Times New Roman" w:hAnsi="Times New Roman"/>
-                <w:b/>
-                <w:sz w:val="22"/>
-              </w:rPr>
-              <w:t>Conta</w:t>
-            </w:r>
-          </w:p>
-        </w:tc>
-        <w:tc>
-          <w:tcPr>
-            <w:tcW w:type="dxa" w:w="2257"/>
-            <w:tcBorders>
-              <w:top w:val="single" w:sz="6" w:color="9DB8AA"/>
-              <w:left w:val="single" w:sz="6" w:color="9DB8AA"/>
-              <w:bottom w:val="single" w:sz="6" w:color="9DB8AA"/>
-              <w:right w:val="single" w:sz="6" w:color="9DB8AA"/>
-            </w:tcBorders>
-            <w:shd w:val="clear" w:fill="E3F2EA"/>
-          </w:tcPr>
-          <w:p>
-            <w:r/>
-            <w:r>
-              <w:rPr>
-                <w:rFonts w:ascii="Times New Roman" w:hAnsi="Times New Roman"/>
-                <w:b/>
-                <w:sz w:val="22"/>
-              </w:rPr>
-              <w:t>Quem é</w:t>
-            </w:r>
-          </w:p>
-        </w:tc>
-        <w:tc>
-          <w:tcPr>
-            <w:tcW w:type="dxa" w:w="2257"/>
-            <w:tcBorders>
-              <w:top w:val="single" w:sz="6" w:color="9DB8AA"/>
-              <w:left w:val="single" w:sz="6" w:color="9DB8AA"/>
-              <w:bottom w:val="single" w:sz="6" w:color="9DB8AA"/>
-              <w:right w:val="single" w:sz="6" w:color="9DB8AA"/>
-            </w:tcBorders>
-            <w:shd w:val="clear" w:fill="E3F2EA"/>
-          </w:tcPr>
-          <w:p>
-            <w:r/>
-            <w:r>
-              <w:rPr>
-                <w:rFonts w:ascii="Times New Roman" w:hAnsi="Times New Roman"/>
-                <w:b/>
-                <w:sz w:val="22"/>
-              </w:rPr>
-              <w:t>Cor</w:t>
-            </w:r>
-          </w:p>
-        </w:tc>
-        <w:tc>
-          <w:tcPr>
-            <w:tcW w:type="dxa" w:w="2257"/>
-            <w:tcBorders>
-              <w:top w:val="single" w:sz="6" w:color="9DB8AA"/>
-              <w:left w:val="single" w:sz="6" w:color="9DB8AA"/>
-              <w:bottom w:val="single" w:sz="6" w:color="9DB8AA"/>
-              <w:right w:val="single" w:sz="6" w:color="9DB8AA"/>
-            </w:tcBorders>
-            <w:shd w:val="clear" w:fill="E3F2EA"/>
-          </w:tcPr>
-          <w:p>
-            <w:r/>
-            <w:r>
-              <w:rPr>
-                <w:rFonts w:ascii="Times New Roman" w:hAnsi="Times New Roman"/>
-                <w:b/>
-                <w:sz w:val="22"/>
-              </w:rPr>
-              <w:t>Menu</w:t>
-            </w:r>
-          </w:p>
-        </w:tc>
-      </w:tr>
-      <w:tr>
-        <w:tc>
-          <w:tcPr>
-            <w:tcW w:type="dxa" w:w="2257"/>
-            <w:tcBorders>
-              <w:top w:val="single" w:sz="6" w:color="9DB8AA"/>
-              <w:left w:val="single" w:sz="6" w:color="9DB8AA"/>
-              <w:bottom w:val="single" w:sz="6" w:color="9DB8AA"/>
-              <w:right w:val="single" w:sz="6" w:color="9DB8AA"/>
-            </w:tcBorders>
-          </w:tcPr>
-          <w:p>
-            <w:r/>
-            <w:r>
-              <w:rPr>
-                <w:rFonts w:ascii="Times New Roman" w:hAnsi="Times New Roman"/>
-                <w:b w:val="0"/>
-                <w:sz w:val="22"/>
-              </w:rPr>
-              <w:t>Minha barraca</w:t>
-            </w:r>
-          </w:p>
-        </w:tc>
-        <w:tc>
-          <w:tcPr>
-            <w:tcW w:type="dxa" w:w="2257"/>
-            <w:tcBorders>
-              <w:top w:val="single" w:sz="6" w:color="9DB8AA"/>
-              <w:left w:val="single" w:sz="6" w:color="9DB8AA"/>
-              <w:bottom w:val="single" w:sz="6" w:color="9DB8AA"/>
-              <w:right w:val="single" w:sz="6" w:color="9DB8AA"/>
-            </w:tcBorders>
-          </w:tcPr>
-          <w:p>
-            <w:r/>
-            <w:r>
-              <w:rPr>
-                <w:rFonts w:ascii="Times New Roman" w:hAnsi="Times New Roman"/>
-                <w:b w:val="0"/>
-                <w:sz w:val="22"/>
-              </w:rPr>
-              <w:t>Quem vende (feirante)</w:t>
-            </w:r>
-          </w:p>
-        </w:tc>
-        <w:tc>
-          <w:tcPr>
-            <w:tcW w:type="dxa" w:w="2257"/>
-            <w:tcBorders>
-              <w:top w:val="single" w:sz="6" w:color="9DB8AA"/>
-              <w:left w:val="single" w:sz="6" w:color="9DB8AA"/>
-              <w:bottom w:val="single" w:sz="6" w:color="9DB8AA"/>
-              <w:right w:val="single" w:sz="6" w:color="9DB8AA"/>
-            </w:tcBorders>
-          </w:tcPr>
-          <w:p>
-            <w:r/>
-            <w:r>
-              <w:rPr>
-                <w:rFonts w:ascii="Times New Roman" w:hAnsi="Times New Roman"/>
-                <w:b w:val="0"/>
-                <w:sz w:val="22"/>
-              </w:rPr>
-              <w:t>Verde</w:t>
-            </w:r>
-          </w:p>
-        </w:tc>
-        <w:tc>
-          <w:tcPr>
-            <w:tcW w:type="dxa" w:w="2257"/>
-            <w:tcBorders>
-              <w:top w:val="single" w:sz="6" w:color="9DB8AA"/>
-              <w:left w:val="single" w:sz="6" w:color="9DB8AA"/>
-              <w:bottom w:val="single" w:sz="6" w:color="9DB8AA"/>
-              <w:right w:val="single" w:sz="6" w:color="9DB8AA"/>
-            </w:tcBorders>
-          </w:tcPr>
-          <w:p>
-            <w:r/>
-            <w:r>
-              <w:rPr>
-                <w:rFonts w:ascii="Times New Roman" w:hAnsi="Times New Roman"/>
-                <w:b w:val="0"/>
-                <w:sz w:val="22"/>
-              </w:rPr>
-              <w:t>Início, Receber, Organizar, Compromissos, Equipe, Confiança</w:t>
-            </w:r>
-          </w:p>
-        </w:tc>
-      </w:tr>
-      <w:tr>
-        <w:tc>
-          <w:tcPr>
-            <w:tcW w:type="dxa" w:w="2257"/>
-            <w:tcBorders>
-              <w:top w:val="single" w:sz="6" w:color="9DB8AA"/>
-              <w:left w:val="single" w:sz="6" w:color="9DB8AA"/>
-              <w:bottom w:val="single" w:sz="6" w:color="9DB8AA"/>
-              <w:right w:val="single" w:sz="6" w:color="9DB8AA"/>
-            </w:tcBorders>
-          </w:tcPr>
-          <w:p>
-            <w:r/>
-            <w:r>
-              <w:rPr>
-                <w:rFonts w:ascii="Times New Roman" w:hAnsi="Times New Roman"/>
-                <w:b w:val="0"/>
-                <w:sz w:val="22"/>
-              </w:rPr>
-              <w:t>Fornecedor(a)</w:t>
-            </w:r>
-          </w:p>
-        </w:tc>
-        <w:tc>
-          <w:tcPr>
-            <w:tcW w:type="dxa" w:w="2257"/>
-            <w:tcBorders>
-              <w:top w:val="single" w:sz="6" w:color="9DB8AA"/>
-              <w:left w:val="single" w:sz="6" w:color="9DB8AA"/>
-              <w:bottom w:val="single" w:sz="6" w:color="9DB8AA"/>
-              <w:right w:val="single" w:sz="6" w:color="9DB8AA"/>
-            </w:tcBorders>
-          </w:tcPr>
-          <w:p>
-            <w:r/>
-            <w:r>
-              <w:rPr>
-                <w:rFonts w:ascii="Times New Roman" w:hAnsi="Times New Roman"/>
-                <w:b w:val="0"/>
-                <w:sz w:val="22"/>
-              </w:rPr>
-              <w:t>Quem vende para a barraca</w:t>
-            </w:r>
-          </w:p>
-        </w:tc>
-        <w:tc>
-          <w:tcPr>
-            <w:tcW w:type="dxa" w:w="2257"/>
-            <w:tcBorders>
-              <w:top w:val="single" w:sz="6" w:color="9DB8AA"/>
-              <w:left w:val="single" w:sz="6" w:color="9DB8AA"/>
-              <w:bottom w:val="single" w:sz="6" w:color="9DB8AA"/>
-              <w:right w:val="single" w:sz="6" w:color="9DB8AA"/>
-            </w:tcBorders>
-          </w:tcPr>
-          <w:p>
-            <w:r/>
-            <w:r>
-              <w:rPr>
-                <w:rFonts w:ascii="Times New Roman" w:hAnsi="Times New Roman"/>
-                <w:b w:val="0"/>
-                <w:sz w:val="22"/>
-              </w:rPr>
-              <w:t>Âmbar</w:t>
-            </w:r>
-          </w:p>
-        </w:tc>
-        <w:tc>
-          <w:tcPr>
-            <w:tcW w:type="dxa" w:w="2257"/>
-            <w:tcBorders>
-              <w:top w:val="single" w:sz="6" w:color="9DB8AA"/>
-              <w:left w:val="single" w:sz="6" w:color="9DB8AA"/>
-              <w:bottom w:val="single" w:sz="6" w:color="9DB8AA"/>
-              <w:right w:val="single" w:sz="6" w:color="9DB8AA"/>
-            </w:tcBorders>
-          </w:tcPr>
-          <w:p>
-            <w:r/>
-            <w:r>
-              <w:rPr>
-                <w:rFonts w:ascii="Times New Roman" w:hAnsi="Times New Roman"/>
-                <w:b w:val="0"/>
-                <w:sz w:val="22"/>
-              </w:rPr>
-              <w:t>Painel, Acordos, Minha confiança, Barracas, Ajudantes, Conta</w:t>
-            </w:r>
-          </w:p>
-        </w:tc>
-      </w:tr>
-      <w:tr>
-        <w:tc>
-          <w:tcPr>
-            <w:tcW w:type="dxa" w:w="2257"/>
-            <w:tcBorders>
-              <w:top w:val="single" w:sz="6" w:color="9DB8AA"/>
-              <w:left w:val="single" w:sz="6" w:color="9DB8AA"/>
-              <w:bottom w:val="single" w:sz="6" w:color="9DB8AA"/>
-              <w:right w:val="single" w:sz="6" w:color="9DB8AA"/>
-            </w:tcBorders>
-          </w:tcPr>
-          <w:p>
-            <w:r/>
-            <w:r>
-              <w:rPr>
-                <w:rFonts w:ascii="Times New Roman" w:hAnsi="Times New Roman"/>
-                <w:b w:val="0"/>
-                <w:sz w:val="22"/>
-              </w:rPr>
-              <w:t>Equipe ou comprador</w:t>
-            </w:r>
-          </w:p>
-        </w:tc>
-        <w:tc>
-          <w:tcPr>
-            <w:tcW w:type="dxa" w:w="2257"/>
-            <w:tcBorders>
-              <w:top w:val="single" w:sz="6" w:color="9DB8AA"/>
-              <w:left w:val="single" w:sz="6" w:color="9DB8AA"/>
-              <w:bottom w:val="single" w:sz="6" w:color="9DB8AA"/>
-              <w:right w:val="single" w:sz="6" w:color="9DB8AA"/>
-            </w:tcBorders>
-          </w:tcPr>
-          <w:p>
-            <w:r/>
-            <w:r>
-              <w:rPr>
-                <w:rFonts w:ascii="Times New Roman" w:hAnsi="Times New Roman"/>
-                <w:b w:val="0"/>
-                <w:sz w:val="22"/>
-              </w:rPr>
-              <w:t>Ajudante ou cliente</w:t>
-            </w:r>
-          </w:p>
-        </w:tc>
-        <w:tc>
-          <w:tcPr>
-            <w:tcW w:type="dxa" w:w="2257"/>
-            <w:tcBorders>
-              <w:top w:val="single" w:sz="6" w:color="9DB8AA"/>
-              <w:left w:val="single" w:sz="6" w:color="9DB8AA"/>
-              <w:bottom w:val="single" w:sz="6" w:color="9DB8AA"/>
-              <w:right w:val="single" w:sz="6" w:color="9DB8AA"/>
-            </w:tcBorders>
-          </w:tcPr>
-          <w:p>
-            <w:r/>
-            <w:r>
-              <w:rPr>
-                <w:rFonts w:ascii="Times New Roman" w:hAnsi="Times New Roman"/>
-                <w:b w:val="0"/>
-                <w:sz w:val="22"/>
-              </w:rPr>
-              <w:t>Azul</w:t>
-            </w:r>
-          </w:p>
-        </w:tc>
-        <w:tc>
-          <w:tcPr>
-            <w:tcW w:type="dxa" w:w="2257"/>
-            <w:tcBorders>
-              <w:top w:val="single" w:sz="6" w:color="9DB8AA"/>
-              <w:left w:val="single" w:sz="6" w:color="9DB8AA"/>
-              <w:bottom w:val="single" w:sz="6" w:color="9DB8AA"/>
-              <w:right w:val="single" w:sz="6" w:color="9DB8AA"/>
-            </w:tcBorders>
-          </w:tcPr>
-          <w:p>
-            <w:r/>
-            <w:r>
-              <w:rPr>
-                <w:rFonts w:ascii="Times New Roman" w:hAnsi="Times New Roman"/>
-                <w:b w:val="0"/>
-                <w:sz w:val="22"/>
-              </w:rPr>
-              <w:t>Vagas, Meu trabalho, Minhas compras, Conta</w:t>
-            </w:r>
-          </w:p>
-        </w:tc>
-      </w:tr>
-    </w:tbl>
-    <w:p>
-      <w:pPr>
-        <w:rPr>
-          <w:rFonts w:ascii="Times New Roman" w:eastAsia="Times New Roman" w:hAnsi="Times New Roman" w:cs="Times New Roman"/>
-        </w:rPr>
-      </w:pPr>
-    </w:p>
-    <w:p>
-      <w:pPr>
-        <w:rPr>
-          <w:rFonts w:ascii="Times New Roman" w:eastAsia="Times New Roman" w:hAnsi="Times New Roman" w:cs="Times New Roman"/>
-          <w:b/>
-          <w:bCs/>
-        </w:rPr>
-      </w:pPr>
-      <w:r>
-        <w:rPr>
-          <w:rFonts w:ascii="Times New Roman" w:eastAsia="Times New Roman" w:hAnsi="Times New Roman" w:cs="Times New Roman"/>
-          <w:b/>
-          <w:bCs/>
-        </w:rPr>
-        <w:t>Contas de teste da demonstração pública</w:t>
-      </w:r>
-    </w:p>
-    <w:p>
-      <w:pPr>
-        <w:rPr>
-          <w:rFonts w:ascii="Times New Roman" w:eastAsia="Times New Roman" w:hAnsi="Times New Roman" w:cs="Times New Roman"/>
-        </w:rPr>
-      </w:pPr>
-    </w:p>
-    <w:p>
-      <w:pPr>
-        <w:rPr>
-          <w:rFonts w:ascii="Times New Roman" w:eastAsia="Times New Roman" w:hAnsi="Times New Roman" w:cs="Times New Roman"/>
-        </w:rPr>
-      </w:pPr>
-      <w:r>
-        <w:rPr>
-          <w:rFonts w:ascii="Times New Roman" w:eastAsia="Times New Roman" w:hAnsi="Times New Roman" w:cs="Times New Roman"/>
-        </w:rPr>
-        <w:t>A demonstração pública usa dados fictícios (Maria, fornecedor João, ajudante Lia) e rede Solana simulada; os dados são recriados a cada início. A tela de entrada mostra as três contas com o botão Preencher. Endereço: https://giro-demo-oyy1.onrender.com</w:t>
-      </w:r>
-    </w:p>
-    <w:p>
-      <w:pPr>
-        <w:rPr>
-          <w:rFonts w:ascii="Times New Roman" w:eastAsia="Times New Roman" w:hAnsi="Times New Roman" w:cs="Times New Roman"/>
-        </w:rPr>
-      </w:pPr>
-    </w:p>
-    <w:tbl>
-      <w:tblPr>
-        <w:tblW w:type="auto" w:w="0"/>
-        <w:tblLook w:firstColumn="1" w:firstRow="1" w:lastColumn="0" w:lastRow="0" w:noHBand="0" w:noVBand="1" w:val="04A0"/>
-      </w:tblPr>
-      <w:tblGrid>
-        <w:gridCol w:w="2257"/>
-        <w:gridCol w:w="2257"/>
-        <w:gridCol w:w="2257"/>
-        <w:gridCol w:w="2257"/>
-      </w:tblGrid>
-      <w:tr>
-        <w:tc>
-          <w:tcPr>
-            <w:tcW w:type="dxa" w:w="2257"/>
-            <w:tcBorders>
-              <w:top w:val="single" w:sz="6" w:color="9DB8AA"/>
-              <w:left w:val="single" w:sz="6" w:color="9DB8AA"/>
-              <w:bottom w:val="single" w:sz="6" w:color="9DB8AA"/>
-              <w:right w:val="single" w:sz="6" w:color="9DB8AA"/>
-            </w:tcBorders>
-            <w:shd w:val="clear" w:fill="E3F2EA"/>
-          </w:tcPr>
-          <w:p>
-            <w:r/>
-            <w:r>
-              <w:rPr>
-                <w:rFonts w:ascii="Times New Roman" w:hAnsi="Times New Roman"/>
-                <w:b/>
-                <w:sz w:val="22"/>
-              </w:rPr>
-              <w:t>Escolher na entrada</w:t>
-            </w:r>
-          </w:p>
-        </w:tc>
-        <w:tc>
-          <w:tcPr>
-            <w:tcW w:type="dxa" w:w="2257"/>
-            <w:tcBorders>
-              <w:top w:val="single" w:sz="6" w:color="9DB8AA"/>
-              <w:left w:val="single" w:sz="6" w:color="9DB8AA"/>
-              <w:bottom w:val="single" w:sz="6" w:color="9DB8AA"/>
-              <w:right w:val="single" w:sz="6" w:color="9DB8AA"/>
-            </w:tcBorders>
-            <w:shd w:val="clear" w:fill="E3F2EA"/>
-          </w:tcPr>
-          <w:p>
-            <w:r/>
-            <w:r>
-              <w:rPr>
-                <w:rFonts w:ascii="Times New Roman" w:hAnsi="Times New Roman"/>
-                <w:b/>
-                <w:sz w:val="22"/>
-              </w:rPr>
-              <w:t>Usuário</w:t>
-            </w:r>
-          </w:p>
-        </w:tc>
-        <w:tc>
-          <w:tcPr>
-            <w:tcW w:type="dxa" w:w="2257"/>
-            <w:tcBorders>
-              <w:top w:val="single" w:sz="6" w:color="9DB8AA"/>
-              <w:left w:val="single" w:sz="6" w:color="9DB8AA"/>
-              <w:bottom w:val="single" w:sz="6" w:color="9DB8AA"/>
-              <w:right w:val="single" w:sz="6" w:color="9DB8AA"/>
-            </w:tcBorders>
-            <w:shd w:val="clear" w:fill="E3F2EA"/>
-          </w:tcPr>
-          <w:p>
-            <w:r/>
-            <w:r>
-              <w:rPr>
-                <w:rFonts w:ascii="Times New Roman" w:hAnsi="Times New Roman"/>
-                <w:b/>
-                <w:sz w:val="22"/>
-              </w:rPr>
-              <w:t>Senha</w:t>
-            </w:r>
-          </w:p>
-        </w:tc>
-        <w:tc>
-          <w:tcPr>
-            <w:tcW w:type="dxa" w:w="2257"/>
-            <w:tcBorders>
-              <w:top w:val="single" w:sz="6" w:color="9DB8AA"/>
-              <w:left w:val="single" w:sz="6" w:color="9DB8AA"/>
-              <w:bottom w:val="single" w:sz="6" w:color="9DB8AA"/>
-              <w:right w:val="single" w:sz="6" w:color="9DB8AA"/>
-            </w:tcBorders>
-            <w:shd w:val="clear" w:fill="E3F2EA"/>
-          </w:tcPr>
-          <w:p>
-            <w:r/>
-            <w:r>
-              <w:rPr>
-                <w:rFonts w:ascii="Times New Roman" w:hAnsi="Times New Roman"/>
-                <w:b/>
-                <w:sz w:val="22"/>
-              </w:rPr>
-              <w:t>O que abre</w:t>
-            </w:r>
-          </w:p>
-        </w:tc>
-      </w:tr>
-      <w:tr>
-        <w:tc>
-          <w:tcPr>
-            <w:tcW w:type="dxa" w:w="2257"/>
-            <w:tcBorders>
-              <w:top w:val="single" w:sz="6" w:color="9DB8AA"/>
-              <w:left w:val="single" w:sz="6" w:color="9DB8AA"/>
-              <w:bottom w:val="single" w:sz="6" w:color="9DB8AA"/>
-              <w:right w:val="single" w:sz="6" w:color="9DB8AA"/>
-            </w:tcBorders>
-          </w:tcPr>
-          <w:p>
-            <w:r/>
-            <w:r>
-              <w:rPr>
-                <w:rFonts w:ascii="Times New Roman" w:hAnsi="Times New Roman"/>
-                <w:b w:val="0"/>
-                <w:sz w:val="22"/>
-              </w:rPr>
-              <w:t>Minha barraca</w:t>
-            </w:r>
-          </w:p>
-        </w:tc>
-        <w:tc>
-          <w:tcPr>
-            <w:tcW w:type="dxa" w:w="2257"/>
-            <w:tcBorders>
-              <w:top w:val="single" w:sz="6" w:color="9DB8AA"/>
-              <w:left w:val="single" w:sz="6" w:color="9DB8AA"/>
-              <w:bottom w:val="single" w:sz="6" w:color="9DB8AA"/>
-              <w:right w:val="single" w:sz="6" w:color="9DB8AA"/>
-            </w:tcBorders>
-          </w:tcPr>
-          <w:p>
-            <w:r/>
-            <w:r>
-              <w:rPr>
-                <w:rFonts w:ascii="Times New Roman" w:hAnsi="Times New Roman"/>
-                <w:b w:val="0"/>
-                <w:sz w:val="22"/>
-              </w:rPr>
-              <w:t>dona</w:t>
-            </w:r>
-          </w:p>
-        </w:tc>
-        <w:tc>
-          <w:tcPr>
-            <w:tcW w:type="dxa" w:w="2257"/>
-            <w:tcBorders>
-              <w:top w:val="single" w:sz="6" w:color="9DB8AA"/>
-              <w:left w:val="single" w:sz="6" w:color="9DB8AA"/>
-              <w:bottom w:val="single" w:sz="6" w:color="9DB8AA"/>
-              <w:right w:val="single" w:sz="6" w:color="9DB8AA"/>
-            </w:tcBorders>
-          </w:tcPr>
-          <w:p>
-            <w:r/>
-            <w:r>
-              <w:rPr>
-                <w:rFonts w:ascii="Times New Roman" w:hAnsi="Times New Roman"/>
-                <w:b w:val="0"/>
-                <w:sz w:val="22"/>
-              </w:rPr>
-              <w:t>giro-demo-2026</w:t>
-            </w:r>
-          </w:p>
-        </w:tc>
-        <w:tc>
-          <w:tcPr>
-            <w:tcW w:type="dxa" w:w="2257"/>
-            <w:tcBorders>
-              <w:top w:val="single" w:sz="6" w:color="9DB8AA"/>
-              <w:left w:val="single" w:sz="6" w:color="9DB8AA"/>
-              <w:bottom w:val="single" w:sz="6" w:color="9DB8AA"/>
-              <w:right w:val="single" w:sz="6" w:color="9DB8AA"/>
-            </w:tcBorders>
-          </w:tcPr>
-          <w:p>
-            <w:r/>
-            <w:r>
-              <w:rPr>
-                <w:rFonts w:ascii="Times New Roman" w:hAnsi="Times New Roman"/>
-                <w:b w:val="0"/>
-                <w:sz w:val="22"/>
-              </w:rPr>
-              <w:t>App da barraca (verde)</w:t>
-            </w:r>
-          </w:p>
-        </w:tc>
-      </w:tr>
-      <w:tr>
-        <w:tc>
-          <w:tcPr>
-            <w:tcW w:type="dxa" w:w="2257"/>
-            <w:tcBorders>
-              <w:top w:val="single" w:sz="6" w:color="9DB8AA"/>
-              <w:left w:val="single" w:sz="6" w:color="9DB8AA"/>
-              <w:bottom w:val="single" w:sz="6" w:color="9DB8AA"/>
-              <w:right w:val="single" w:sz="6" w:color="9DB8AA"/>
-            </w:tcBorders>
-          </w:tcPr>
-          <w:p>
-            <w:r/>
-            <w:r>
-              <w:rPr>
-                <w:rFonts w:ascii="Times New Roman" w:hAnsi="Times New Roman"/>
-                <w:b w:val="0"/>
-                <w:sz w:val="22"/>
-              </w:rPr>
-              <w:t>Fornecedor(a)</w:t>
-            </w:r>
-          </w:p>
-        </w:tc>
-        <w:tc>
-          <w:tcPr>
-            <w:tcW w:type="dxa" w:w="2257"/>
-            <w:tcBorders>
-              <w:top w:val="single" w:sz="6" w:color="9DB8AA"/>
-              <w:left w:val="single" w:sz="6" w:color="9DB8AA"/>
-              <w:bottom w:val="single" w:sz="6" w:color="9DB8AA"/>
-              <w:right w:val="single" w:sz="6" w:color="9DB8AA"/>
-            </w:tcBorders>
-          </w:tcPr>
-          <w:p>
-            <w:r/>
-            <w:r>
-              <w:rPr>
-                <w:rFonts w:ascii="Times New Roman" w:hAnsi="Times New Roman"/>
-                <w:b w:val="0"/>
-                <w:sz w:val="22"/>
-              </w:rPr>
-              <w:t>joao</w:t>
-            </w:r>
-          </w:p>
-        </w:tc>
-        <w:tc>
-          <w:tcPr>
-            <w:tcW w:type="dxa" w:w="2257"/>
-            <w:tcBorders>
-              <w:top w:val="single" w:sz="6" w:color="9DB8AA"/>
-              <w:left w:val="single" w:sz="6" w:color="9DB8AA"/>
-              <w:bottom w:val="single" w:sz="6" w:color="9DB8AA"/>
-              <w:right w:val="single" w:sz="6" w:color="9DB8AA"/>
-            </w:tcBorders>
-          </w:tcPr>
-          <w:p>
-            <w:r/>
-            <w:r>
-              <w:rPr>
-                <w:rFonts w:ascii="Times New Roman" w:hAnsi="Times New Roman"/>
-                <w:b w:val="0"/>
-                <w:sz w:val="22"/>
-              </w:rPr>
-              <w:t>giro-demo-2026</w:t>
-            </w:r>
-          </w:p>
-        </w:tc>
-        <w:tc>
-          <w:tcPr>
-            <w:tcW w:type="dxa" w:w="2257"/>
-            <w:tcBorders>
-              <w:top w:val="single" w:sz="6" w:color="9DB8AA"/>
-              <w:left w:val="single" w:sz="6" w:color="9DB8AA"/>
-              <w:bottom w:val="single" w:sz="6" w:color="9DB8AA"/>
-              <w:right w:val="single" w:sz="6" w:color="9DB8AA"/>
-            </w:tcBorders>
-          </w:tcPr>
-          <w:p>
-            <w:r/>
-            <w:r>
-              <w:rPr>
-                <w:rFonts w:ascii="Times New Roman" w:hAnsi="Times New Roman"/>
-                <w:b w:val="0"/>
-                <w:sz w:val="22"/>
-              </w:rPr>
-              <w:t>App do fornecedor (âmbar), com o acordo de R$ 600 a 20% das vendas</w:t>
-            </w:r>
-          </w:p>
-        </w:tc>
-      </w:tr>
-      <w:tr>
-        <w:tc>
-          <w:tcPr>
-            <w:tcW w:type="dxa" w:w="2257"/>
-            <w:tcBorders>
-              <w:top w:val="single" w:sz="6" w:color="9DB8AA"/>
-              <w:left w:val="single" w:sz="6" w:color="9DB8AA"/>
-              <w:bottom w:val="single" w:sz="6" w:color="9DB8AA"/>
-              <w:right w:val="single" w:sz="6" w:color="9DB8AA"/>
-            </w:tcBorders>
-          </w:tcPr>
-          <w:p>
-            <w:r/>
-            <w:r>
-              <w:rPr>
-                <w:rFonts w:ascii="Times New Roman" w:hAnsi="Times New Roman"/>
-                <w:b w:val="0"/>
-                <w:sz w:val="22"/>
-              </w:rPr>
-              <w:t>Equipe ou comprador</w:t>
-            </w:r>
-          </w:p>
-        </w:tc>
-        <w:tc>
-          <w:tcPr>
-            <w:tcW w:type="dxa" w:w="2257"/>
-            <w:tcBorders>
-              <w:top w:val="single" w:sz="6" w:color="9DB8AA"/>
-              <w:left w:val="single" w:sz="6" w:color="9DB8AA"/>
-              <w:bottom w:val="single" w:sz="6" w:color="9DB8AA"/>
-              <w:right w:val="single" w:sz="6" w:color="9DB8AA"/>
-            </w:tcBorders>
-          </w:tcPr>
-          <w:p>
-            <w:r/>
-            <w:r>
-              <w:rPr>
-                <w:rFonts w:ascii="Times New Roman" w:hAnsi="Times New Roman"/>
-                <w:b w:val="0"/>
-                <w:sz w:val="22"/>
-              </w:rPr>
-              <w:t>lia</w:t>
-            </w:r>
-          </w:p>
-        </w:tc>
-        <w:tc>
-          <w:tcPr>
-            <w:tcW w:type="dxa" w:w="2257"/>
-            <w:tcBorders>
-              <w:top w:val="single" w:sz="6" w:color="9DB8AA"/>
-              <w:left w:val="single" w:sz="6" w:color="9DB8AA"/>
-              <w:bottom w:val="single" w:sz="6" w:color="9DB8AA"/>
-              <w:right w:val="single" w:sz="6" w:color="9DB8AA"/>
-            </w:tcBorders>
-          </w:tcPr>
-          <w:p>
-            <w:r/>
-            <w:r>
-              <w:rPr>
-                <w:rFonts w:ascii="Times New Roman" w:hAnsi="Times New Roman"/>
-                <w:b w:val="0"/>
-                <w:sz w:val="22"/>
-              </w:rPr>
-              <w:t>giro-demo-2026</w:t>
-            </w:r>
-          </w:p>
-        </w:tc>
-        <w:tc>
-          <w:tcPr>
-            <w:tcW w:type="dxa" w:w="2257"/>
-            <w:tcBorders>
-              <w:top w:val="single" w:sz="6" w:color="9DB8AA"/>
-              <w:left w:val="single" w:sz="6" w:color="9DB8AA"/>
-              <w:bottom w:val="single" w:sz="6" w:color="9DB8AA"/>
-              <w:right w:val="single" w:sz="6" w:color="9DB8AA"/>
-            </w:tcBorders>
-          </w:tcPr>
-          <w:p>
-            <w:r/>
-            <w:r>
-              <w:rPr>
-                <w:rFonts w:ascii="Times New Roman" w:hAnsi="Times New Roman"/>
-                <w:b w:val="0"/>
-                <w:sz w:val="22"/>
-              </w:rPr>
-              <w:t>App da equipe/comprador (azul): vagas, trabalho e compras</w:t>
-            </w:r>
-          </w:p>
-        </w:tc>
-      </w:tr>
-    </w:tbl>
-    <w:p>
-      <w:pPr>
-        <w:rPr>
-          <w:rFonts w:ascii="Times New Roman" w:eastAsia="Times New Roman" w:hAnsi="Times New Roman" w:cs="Times New Roman"/>
-        </w:rPr>
-      </w:pPr>
-    </w:p>
-    <w:p>
-      <w:pPr>
-        <w:rPr>
-          <w:rFonts w:ascii="Times New Roman" w:eastAsia="Times New Roman" w:hAnsi="Times New Roman" w:cs="Times New Roman"/>
-        </w:rPr>
-      </w:pPr>
-      <w:r>
-        <w:rPr>
-          <w:rFonts w:ascii="Times New Roman" w:eastAsia="Times New Roman" w:hAnsi="Times New Roman" w:cs="Times New Roman"/>
-        </w:rPr>
-        <w:t>No link fixo do grupo (https://desktop-jg2rfmg.tail00f1d9.ts.net, que precisa do computador ligado) ficam as contas reais criadas pelos colegas, cada uma com a senha que a própria pessoa escolheu.</w:t>
-      </w:r>
-    </w:p>
-    <w:p>
-      <w:pPr>
-        <w:rPr>
-          <w:rFonts w:ascii="Times New Roman" w:eastAsia="Times New Roman" w:hAnsi="Times New Roman" w:cs="Times New Roman"/>
-        </w:rPr>
-      </w:pPr>
-    </w:p>
-    <w:p>
-      <w:pPr>
-        <w:rPr>
-          <w:rFonts w:ascii="Times New Roman" w:eastAsia="Times New Roman" w:hAnsi="Times New Roman" w:cs="Times New Roman"/>
-          <w:b/>
-          <w:bCs/>
-        </w:rPr>
-      </w:pPr>
-      <w:r>
-        <w:rPr>
-          <w:rFonts w:ascii="Times New Roman" w:eastAsia="Times New Roman" w:hAnsi="Times New Roman" w:cs="Times New Roman"/>
-          <w:b/>
-          <w:bCs/>
-        </w:rPr>
-        <w:t>Barraca (quem vende)</w:t>
-      </w:r>
-    </w:p>
-    <w:p>
-      <w:pPr>
-        <w:rPr>
-          <w:rFonts w:ascii="Times New Roman" w:eastAsia="Times New Roman" w:hAnsi="Times New Roman" w:cs="Times New Roman"/>
-        </w:rPr>
-      </w:pPr>
-    </w:p>
-    <w:p>
-      <w:pPr>
-        <w:numPr>
-          <w:ilvl w:val="0"/>
-          <w:numId w:val="4"/>
-        </w:numPr>
-        <w:rPr>
-          <w:rFonts w:ascii="Times New Roman" w:eastAsia="Times New Roman" w:hAnsi="Times New Roman" w:cs="Times New Roman"/>
-        </w:rPr>
-      </w:pPr>
-      <w:r>
-        <w:rPr>
-          <w:rFonts w:ascii="Times New Roman" w:eastAsia="Times New Roman" w:hAnsi="Times New Roman" w:cs="Times New Roman"/>
-          <w:b/>
-        </w:rPr>
-        <w:t xml:space="preserve">QR fixo da barraca: </w:t>
-      </w:r>
-      <w:r>
-        <w:rPr>
-          <w:rFonts w:ascii="Times New Roman" w:eastAsia="Times New Roman" w:hAnsi="Times New Roman" w:cs="Times New Roman"/>
-          <w:b w:val="0"/>
-        </w:rPr>
-        <w:t>impresso uma vez e deixado na barraca. Quem compra aponta a câmera, digita o valor e paga, sem gerar um código novo a cada venda. A divisão combinada com fornecedores e ajudantes vale normalmente; há limite de valor por compra e de tentativas contra abuso.</w:t>
-      </w:r>
-    </w:p>
-    <w:p>
-      <w:pPr>
-        <w:numPr>
-          <w:ilvl w:val="0"/>
-          <w:numId w:val="4"/>
-        </w:numPr>
-        <w:rPr>
-          <w:rFonts w:ascii="Times New Roman" w:eastAsia="Times New Roman" w:hAnsi="Times New Roman" w:cs="Times New Roman"/>
-        </w:rPr>
-      </w:pPr>
-      <w:r>
-        <w:rPr>
-          <w:rFonts w:ascii="Times New Roman" w:eastAsia="Times New Roman" w:hAnsi="Times New Roman" w:cs="Times New Roman"/>
-          <w:b/>
-        </w:rPr>
-        <w:t xml:space="preserve">Importar dívidas: </w:t>
-      </w:r>
-      <w:r>
-        <w:rPr>
-          <w:rFonts w:ascii="Times New Roman" w:eastAsia="Times New Roman" w:hAnsi="Times New Roman" w:cs="Times New Roman"/>
-          <w:b w:val="0"/>
-        </w:rPr>
-        <w:t>por PDF, Excel (.xlsx) ou CSV, com tabela para revisar antes de salvar, caixa de ajuda e modelo CSV para baixar. Cada dívida importada cria o contato e já envia o convite de acordo.</w:t>
-      </w:r>
-    </w:p>
-    <w:p>
-      <w:pPr>
-        <w:numPr>
-          <w:ilvl w:val="0"/>
-          <w:numId w:val="4"/>
-        </w:numPr>
-        <w:rPr>
-          <w:rFonts w:ascii="Times New Roman" w:eastAsia="Times New Roman" w:hAnsi="Times New Roman" w:cs="Times New Roman"/>
-        </w:rPr>
-      </w:pPr>
-      <w:r>
-        <w:rPr>
-          <w:rFonts w:ascii="Times New Roman" w:eastAsia="Times New Roman" w:hAnsi="Times New Roman" w:cs="Times New Roman"/>
-          <w:b/>
-        </w:rPr>
-        <w:t xml:space="preserve">Usuário próprio da barraca: </w:t>
-      </w:r>
-      <w:r>
-        <w:rPr>
-          <w:rFonts w:ascii="Times New Roman" w:eastAsia="Times New Roman" w:hAnsi="Times New Roman" w:cs="Times New Roman"/>
-          <w:b w:val="0"/>
-        </w:rPr>
-        <w:t>definido em Meu perfil (o usuário “dona” continua funcionando).</w:t>
-      </w:r>
-    </w:p>
-    <w:p>
-      <w:pPr>
-        <w:numPr>
-          <w:ilvl w:val="0"/>
-          <w:numId w:val="4"/>
-        </w:numPr>
-        <w:rPr>
-          <w:rFonts w:ascii="Times New Roman" w:eastAsia="Times New Roman" w:hAnsi="Times New Roman" w:cs="Times New Roman"/>
-        </w:rPr>
-      </w:pPr>
-      <w:r>
-        <w:rPr>
-          <w:rFonts w:ascii="Times New Roman" w:eastAsia="Times New Roman" w:hAnsi="Times New Roman" w:cs="Times New Roman"/>
-          <w:b/>
-        </w:rPr>
-        <w:t xml:space="preserve">Meu perfil no topo: </w:t>
-      </w:r>
-      <w:r>
-        <w:rPr>
-          <w:rFonts w:ascii="Times New Roman" w:eastAsia="Times New Roman" w:hAnsi="Times New Roman" w:cs="Times New Roman"/>
-          <w:b w:val="0"/>
-        </w:rPr>
-        <w:t>foto, Alterar perfil, Ver perfil público e Sair; a foto atualiza na hora.</w:t>
-      </w:r>
-    </w:p>
-    <w:p>
-      <w:pPr>
-        <w:numPr>
-          <w:ilvl w:val="0"/>
-          <w:numId w:val="4"/>
-        </w:numPr>
-        <w:rPr>
-          <w:rFonts w:ascii="Times New Roman" w:eastAsia="Times New Roman" w:hAnsi="Times New Roman" w:cs="Times New Roman"/>
-        </w:rPr>
-      </w:pPr>
-      <w:r>
-        <w:rPr>
-          <w:rFonts w:ascii="Times New Roman" w:eastAsia="Times New Roman" w:hAnsi="Times New Roman" w:cs="Times New Roman"/>
-          <w:b/>
-        </w:rPr>
-        <w:t xml:space="preserve">Visual: </w:t>
-      </w:r>
-      <w:r>
-        <w:rPr>
-          <w:rFonts w:ascii="Times New Roman" w:eastAsia="Times New Roman" w:hAnsi="Times New Roman" w:cs="Times New Roman"/>
-          <w:b w:val="0"/>
-        </w:rPr>
-        <w:t>cartões delimitados, letras maiores, ícones novos, botão Voltar sempre visível, confirmações claras, filtros em Compromissos e o logo GIRO levando ao Início.</w:t>
-      </w:r>
-    </w:p>
-    <w:p>
-      <w:pPr>
-        <w:numPr>
-          <w:ilvl w:val="0"/>
-          <w:numId w:val="4"/>
-        </w:numPr>
-        <w:rPr>
-          <w:rFonts w:ascii="Times New Roman" w:eastAsia="Times New Roman" w:hAnsi="Times New Roman" w:cs="Times New Roman"/>
-        </w:rPr>
-      </w:pPr>
-      <w:r>
-        <w:rPr>
-          <w:rFonts w:ascii="Times New Roman" w:eastAsia="Times New Roman" w:hAnsi="Times New Roman" w:cs="Times New Roman"/>
-          <w:b/>
-        </w:rPr>
-        <w:t xml:space="preserve">Confiança: </w:t>
-      </w:r>
-      <w:r>
-        <w:rPr>
-          <w:rFonts w:ascii="Times New Roman" w:eastAsia="Times New Roman" w:hAnsi="Times New Roman" w:cs="Times New Roman"/>
-          <w:b w:val="0"/>
-        </w:rPr>
-        <w:t>página em blocos, com “Minha confiança” no topo e depois fornecedores e equipe.</w:t>
-      </w:r>
-    </w:p>
-    <w:p>
-      <w:pPr>
-        <w:rPr>
-          <w:rFonts w:ascii="Times New Roman" w:eastAsia="Times New Roman" w:hAnsi="Times New Roman" w:cs="Times New Roman"/>
-        </w:rPr>
-      </w:pPr>
-    </w:p>
-    <w:p>
-      <w:pPr>
-        <w:rPr>
-          <w:rFonts w:ascii="Times New Roman" w:eastAsia="Times New Roman" w:hAnsi="Times New Roman" w:cs="Times New Roman"/>
-          <w:b/>
-          <w:bCs/>
-        </w:rPr>
-      </w:pPr>
-      <w:r>
-        <w:rPr>
-          <w:rFonts w:ascii="Times New Roman" w:eastAsia="Times New Roman" w:hAnsi="Times New Roman" w:cs="Times New Roman"/>
-          <w:b/>
-          <w:bCs/>
-        </w:rPr>
-        <w:t>Fornecedor (aplicativo próprio)</w:t>
-      </w:r>
-    </w:p>
-    <w:p>
-      <w:pPr>
-        <w:rPr>
-          <w:rFonts w:ascii="Times New Roman" w:eastAsia="Times New Roman" w:hAnsi="Times New Roman" w:cs="Times New Roman"/>
-        </w:rPr>
-      </w:pPr>
-    </w:p>
-    <w:p>
-      <w:pPr>
-        <w:numPr>
-          <w:ilvl w:val="0"/>
-          <w:numId w:val="4"/>
-        </w:numPr>
-        <w:rPr>
-          <w:rFonts w:ascii="Times New Roman" w:eastAsia="Times New Roman" w:hAnsi="Times New Roman" w:cs="Times New Roman"/>
-        </w:rPr>
-      </w:pPr>
-      <w:r>
-        <w:rPr>
-          <w:rFonts w:ascii="Times New Roman" w:eastAsia="Times New Roman" w:hAnsi="Times New Roman" w:cs="Times New Roman"/>
-          <w:b/>
-        </w:rPr>
-        <w:t xml:space="preserve">Painel: </w:t>
-      </w:r>
-      <w:r>
-        <w:rPr>
-          <w:rFonts w:ascii="Times New Roman" w:eastAsia="Times New Roman" w:hAnsi="Times New Roman" w:cs="Times New Roman"/>
-          <w:b w:val="0"/>
-        </w:rPr>
-        <w:t>a receber, já recebido, acordos ativos, “Precisa de você” (aceitar acordos e confirmar pagamentos em dinheiro) e os acordos mais recentes.</w:t>
-      </w:r>
-    </w:p>
-    <w:p>
-      <w:pPr>
-        <w:numPr>
-          <w:ilvl w:val="0"/>
-          <w:numId w:val="4"/>
-        </w:numPr>
-        <w:rPr>
-          <w:rFonts w:ascii="Times New Roman" w:eastAsia="Times New Roman" w:hAnsi="Times New Roman" w:cs="Times New Roman"/>
-        </w:rPr>
-      </w:pPr>
-      <w:r>
-        <w:rPr>
-          <w:rFonts w:ascii="Times New Roman" w:eastAsia="Times New Roman" w:hAnsi="Times New Roman" w:cs="Times New Roman"/>
-          <w:b/>
-        </w:rPr>
-        <w:t xml:space="preserve">Acordos: </w:t>
-      </w:r>
-      <w:r>
-        <w:rPr>
-          <w:rFonts w:ascii="Times New Roman" w:eastAsia="Times New Roman" w:hAnsi="Times New Roman" w:cs="Times New Roman"/>
-          <w:b w:val="0"/>
-        </w:rPr>
-        <w:t>todos os acordos com barra de progresso, porcentagem das vendas, vencimento e selo “registrado na Solana”.</w:t>
-      </w:r>
-    </w:p>
-    <w:p>
-      <w:pPr>
-        <w:numPr>
-          <w:ilvl w:val="0"/>
-          <w:numId w:val="4"/>
-        </w:numPr>
-        <w:rPr>
-          <w:rFonts w:ascii="Times New Roman" w:eastAsia="Times New Roman" w:hAnsi="Times New Roman" w:cs="Times New Roman"/>
-        </w:rPr>
-      </w:pPr>
-      <w:r>
-        <w:rPr>
-          <w:rFonts w:ascii="Times New Roman" w:eastAsia="Times New Roman" w:hAnsi="Times New Roman" w:cs="Times New Roman"/>
-          <w:b/>
-        </w:rPr>
-        <w:t xml:space="preserve">Minha confiança: </w:t>
-      </w:r>
-      <w:r>
-        <w:rPr>
-          <w:rFonts w:ascii="Times New Roman" w:eastAsia="Times New Roman" w:hAnsi="Times New Roman" w:cs="Times New Roman"/>
-          <w:b w:val="0"/>
-        </w:rPr>
-        <w:t>o cartão GIRO Confiança do próprio fornecedor, com os acordos cumpridos e confirmados pelos dois lados, e botão para compartilhar.</w:t>
-      </w:r>
-    </w:p>
-    <w:p>
-      <w:pPr>
-        <w:numPr>
-          <w:ilvl w:val="0"/>
-          <w:numId w:val="4"/>
-        </w:numPr>
-        <w:rPr>
-          <w:rFonts w:ascii="Times New Roman" w:eastAsia="Times New Roman" w:hAnsi="Times New Roman" w:cs="Times New Roman"/>
-        </w:rPr>
-      </w:pPr>
-      <w:r>
-        <w:rPr>
-          <w:rFonts w:ascii="Times New Roman" w:eastAsia="Times New Roman" w:hAnsi="Times New Roman" w:cs="Times New Roman"/>
-          <w:b/>
-        </w:rPr>
-        <w:t xml:space="preserve">Barracas: </w:t>
-      </w:r>
-      <w:r>
-        <w:rPr>
-          <w:rFonts w:ascii="Times New Roman" w:eastAsia="Times New Roman" w:hAnsi="Times New Roman" w:cs="Times New Roman"/>
-          <w:b w:val="0"/>
-        </w:rPr>
-        <w:t>confiança das barracas antes de vender a prazo e perfis de confiança.</w:t>
-      </w:r>
-    </w:p>
-    <w:p>
-      <w:pPr>
-        <w:numPr>
-          <w:ilvl w:val="0"/>
-          <w:numId w:val="4"/>
-        </w:numPr>
-        <w:rPr>
-          <w:rFonts w:ascii="Times New Roman" w:eastAsia="Times New Roman" w:hAnsi="Times New Roman" w:cs="Times New Roman"/>
-        </w:rPr>
-      </w:pPr>
-      <w:r>
-        <w:rPr>
-          <w:rFonts w:ascii="Times New Roman" w:eastAsia="Times New Roman" w:hAnsi="Times New Roman" w:cs="Times New Roman"/>
-          <w:b/>
-        </w:rPr>
-        <w:t xml:space="preserve">Ajudantes: </w:t>
-      </w:r>
-      <w:r>
-        <w:rPr>
-          <w:rFonts w:ascii="Times New Roman" w:eastAsia="Times New Roman" w:hAnsi="Times New Roman" w:cs="Times New Roman"/>
-          <w:b w:val="0"/>
-        </w:rPr>
-        <w:t>publicar vaga (Procuro ajudante) e ver quem busca trabalho.</w:t>
-      </w:r>
-    </w:p>
-    <w:p>
-      <w:pPr>
-        <w:numPr>
-          <w:ilvl w:val="0"/>
-          <w:numId w:val="4"/>
-        </w:numPr>
-        <w:rPr>
-          <w:rFonts w:ascii="Times New Roman" w:eastAsia="Times New Roman" w:hAnsi="Times New Roman" w:cs="Times New Roman"/>
-        </w:rPr>
-      </w:pPr>
-      <w:r>
-        <w:rPr>
-          <w:rFonts w:ascii="Times New Roman" w:eastAsia="Times New Roman" w:hAnsi="Times New Roman" w:cs="Times New Roman"/>
-          <w:b/>
-        </w:rPr>
-        <w:t xml:space="preserve">Conta: </w:t>
-      </w:r>
-      <w:r>
-        <w:rPr>
-          <w:rFonts w:ascii="Times New Roman" w:eastAsia="Times New Roman" w:hAnsi="Times New Roman" w:cs="Times New Roman"/>
-          <w:b w:val="0"/>
-        </w:rPr>
-        <w:t>foto, perfil público, senha, carteira Solana e código de convite para outras barracas.</w:t>
-      </w:r>
-    </w:p>
-    <w:p>
-      <w:pPr>
-        <w:rPr>
-          <w:rFonts w:ascii="Times New Roman" w:eastAsia="Times New Roman" w:hAnsi="Times New Roman" w:cs="Times New Roman"/>
-        </w:rPr>
-      </w:pPr>
-    </w:p>
-    <w:p>
-      <w:pPr>
-        <w:rPr>
-          <w:rFonts w:ascii="Times New Roman" w:eastAsia="Times New Roman" w:hAnsi="Times New Roman" w:cs="Times New Roman"/>
-          <w:b/>
-          <w:bCs/>
-        </w:rPr>
-      </w:pPr>
-      <w:r>
-        <w:rPr>
-          <w:rFonts w:ascii="Times New Roman" w:eastAsia="Times New Roman" w:hAnsi="Times New Roman" w:cs="Times New Roman"/>
-          <w:b/>
-          <w:bCs/>
-        </w:rPr>
-        <w:t>Equipe ou comprador (aplicativo próprio)</w:t>
-      </w:r>
-    </w:p>
-    <w:p>
-      <w:pPr>
-        <w:rPr>
-          <w:rFonts w:ascii="Times New Roman" w:eastAsia="Times New Roman" w:hAnsi="Times New Roman" w:cs="Times New Roman"/>
-        </w:rPr>
-      </w:pPr>
-    </w:p>
-    <w:p>
-      <w:pPr>
-        <w:numPr>
-          <w:ilvl w:val="0"/>
-          <w:numId w:val="4"/>
-        </w:numPr>
-        <w:rPr>
-          <w:rFonts w:ascii="Times New Roman" w:eastAsia="Times New Roman" w:hAnsi="Times New Roman" w:cs="Times New Roman"/>
-        </w:rPr>
-      </w:pPr>
-      <w:r>
-        <w:rPr>
-          <w:rFonts w:ascii="Times New Roman" w:eastAsia="Times New Roman" w:hAnsi="Times New Roman" w:cs="Times New Roman"/>
-          <w:b/>
-        </w:rPr>
-        <w:t xml:space="preserve">Vagas (tela inicial): </w:t>
-      </w:r>
-      <w:r>
-        <w:rPr>
-          <w:rFonts w:ascii="Times New Roman" w:eastAsia="Times New Roman" w:hAnsi="Times New Roman" w:cs="Times New Roman"/>
-          <w:b w:val="0"/>
-        </w:rPr>
-        <w:t>vagas de ajudante com a experiência da pessoa conferida pelo GIRO, Tenho interesse e Busco trabalho.</w:t>
-      </w:r>
-    </w:p>
-    <w:p>
-      <w:pPr>
-        <w:numPr>
-          <w:ilvl w:val="0"/>
-          <w:numId w:val="4"/>
-        </w:numPr>
-        <w:rPr>
-          <w:rFonts w:ascii="Times New Roman" w:eastAsia="Times New Roman" w:hAnsi="Times New Roman" w:cs="Times New Roman"/>
-        </w:rPr>
-      </w:pPr>
-      <w:r>
-        <w:rPr>
-          <w:rFonts w:ascii="Times New Roman" w:eastAsia="Times New Roman" w:hAnsi="Times New Roman" w:cs="Times New Roman"/>
-          <w:b/>
-        </w:rPr>
-        <w:t xml:space="preserve">Meu trabalho: </w:t>
-      </w:r>
-      <w:r>
-        <w:rPr>
-          <w:rFonts w:ascii="Times New Roman" w:eastAsia="Times New Roman" w:hAnsi="Times New Roman" w:cs="Times New Roman"/>
-          <w:b w:val="0"/>
-        </w:rPr>
-        <w:t>turno, comissão, quanto já recebeu, pagamentos em dinheiro para confirmar e acordos.</w:t>
-      </w:r>
-    </w:p>
-    <w:p>
-      <w:pPr>
-        <w:numPr>
-          <w:ilvl w:val="0"/>
-          <w:numId w:val="4"/>
-        </w:numPr>
-        <w:rPr>
-          <w:rFonts w:ascii="Times New Roman" w:eastAsia="Times New Roman" w:hAnsi="Times New Roman" w:cs="Times New Roman"/>
-        </w:rPr>
-      </w:pPr>
-      <w:r>
-        <w:rPr>
-          <w:rFonts w:ascii="Times New Roman" w:eastAsia="Times New Roman" w:hAnsi="Times New Roman" w:cs="Times New Roman"/>
-          <w:b/>
-        </w:rPr>
-        <w:t xml:space="preserve">Minhas compras: </w:t>
-      </w:r>
-      <w:r>
-        <w:rPr>
-          <w:rFonts w:ascii="Times New Roman" w:eastAsia="Times New Roman" w:hAnsi="Times New Roman" w:cs="Times New Roman"/>
-          <w:b w:val="0"/>
-        </w:rPr>
-        <w:t>compras pagas pelo QR da barraca com a conta aberta, total gasto e confiança das barracas.</w:t>
-      </w:r>
-    </w:p>
-    <w:p>
-      <w:pPr>
-        <w:numPr>
-          <w:ilvl w:val="0"/>
-          <w:numId w:val="4"/>
-        </w:numPr>
-        <w:rPr>
-          <w:rFonts w:ascii="Times New Roman" w:eastAsia="Times New Roman" w:hAnsi="Times New Roman" w:cs="Times New Roman"/>
-        </w:rPr>
-      </w:pPr>
-      <w:r>
-        <w:rPr>
-          <w:rFonts w:ascii="Times New Roman" w:eastAsia="Times New Roman" w:hAnsi="Times New Roman" w:cs="Times New Roman"/>
-          <w:b/>
-        </w:rPr>
-        <w:t xml:space="preserve">Conta: </w:t>
-      </w:r>
-      <w:r>
-        <w:rPr>
-          <w:rFonts w:ascii="Times New Roman" w:eastAsia="Times New Roman" w:hAnsi="Times New Roman" w:cs="Times New Roman"/>
-          <w:b w:val="0"/>
-        </w:rPr>
-        <w:t>foto, perfil público, senha, carteira e convite para amigos.</w:t>
-      </w:r>
-    </w:p>
-    <w:p>
-      <w:pPr>
-        <w:rPr>
-          <w:rFonts w:ascii="Times New Roman" w:eastAsia="Times New Roman" w:hAnsi="Times New Roman" w:cs="Times New Roman"/>
-        </w:rPr>
-      </w:pPr>
-    </w:p>
-    <w:p>
-      <w:pPr>
-        <w:rPr>
-          <w:rFonts w:ascii="Times New Roman" w:eastAsia="Times New Roman" w:hAnsi="Times New Roman" w:cs="Times New Roman"/>
-          <w:b/>
-          <w:bCs/>
-        </w:rPr>
-      </w:pPr>
-      <w:r>
-        <w:rPr>
-          <w:rFonts w:ascii="Times New Roman" w:eastAsia="Times New Roman" w:hAnsi="Times New Roman" w:cs="Times New Roman"/>
-          <w:b/>
-          <w:bCs/>
-        </w:rPr>
-        <w:t>Vagas de ajudante com experiência verificada</w:t>
-      </w:r>
-    </w:p>
-    <w:p>
-      <w:pPr>
-        <w:rPr>
-          <w:rFonts w:ascii="Times New Roman" w:eastAsia="Times New Roman" w:hAnsi="Times New Roman" w:cs="Times New Roman"/>
-        </w:rPr>
-      </w:pPr>
-    </w:p>
-    <w:p>
-      <w:pPr>
-        <w:rPr>
-          <w:rFonts w:ascii="Times New Roman" w:eastAsia="Times New Roman" w:hAnsi="Times New Roman" w:cs="Times New Roman"/>
-        </w:rPr>
-      </w:pPr>
-      <w:r>
-        <w:rPr>
-          <w:rFonts w:ascii="Times New Roman" w:eastAsia="Times New Roman" w:hAnsi="Times New Roman" w:cs="Times New Roman"/>
-        </w:rPr>
-        <w:t>A barraca e o fornecedor publicam “Procuro ajudante” com regras: experiência mínima em meses e mínimo de dias trabalhados. Quem é da equipe ou comprador clica em “Tenho interesse”. O GIRO confere a experiência pelo histórico de comissões recebidas (dias trabalhados, meses e total recebido) e mostra “Atende às regras” ou “Ainda não atende”: a experiência não é declarada, ela vem do histórico. Também existe a lista “Busco trabalho”, com resumo, contato, link do perfil de confiança e botão de WhatsApp.</w:t>
-      </w:r>
-    </w:p>
-    <w:p>
-      <w:pPr>
-        <w:rPr>
-          <w:rFonts w:ascii="Times New Roman" w:eastAsia="Times New Roman" w:hAnsi="Times New Roman" w:cs="Times New Roman"/>
-        </w:rPr>
-      </w:pPr>
-    </w:p>
-    <w:p>
-      <w:pPr>
-        <w:rPr>
-          <w:rFonts w:ascii="Times New Roman" w:eastAsia="Times New Roman" w:hAnsi="Times New Roman" w:cs="Times New Roman"/>
-          <w:b/>
-          <w:bCs/>
-        </w:rPr>
-      </w:pPr>
-      <w:r>
-        <w:rPr>
-          <w:rFonts w:ascii="Times New Roman" w:eastAsia="Times New Roman" w:hAnsi="Times New Roman" w:cs="Times New Roman"/>
-          <w:b/>
-          <w:bCs/>
-        </w:rPr>
-        <w:t>Site em inglês</w:t>
-      </w:r>
-    </w:p>
-    <w:p>
-      <w:pPr>
-        <w:rPr>
-          <w:rFonts w:ascii="Times New Roman" w:eastAsia="Times New Roman" w:hAnsi="Times New Roman" w:cs="Times New Roman"/>
-        </w:rPr>
-      </w:pPr>
-    </w:p>
-    <w:p>
-      <w:pPr>
-        <w:rPr>
-          <w:rFonts w:ascii="Times New Roman" w:eastAsia="Times New Roman" w:hAnsi="Times New Roman" w:cs="Times New Roman"/>
-        </w:rPr>
-      </w:pPr>
-      <w:r>
-        <w:rPr>
-          <w:rFonts w:ascii="Times New Roman" w:eastAsia="Times New Roman" w:hAnsi="Times New Roman" w:cs="Times New Roman"/>
-        </w:rPr>
-        <w:t>Seletor PT / EN no topo de todas as telas e na entrada (a escolha fica salva no navegador). Também é possível abrir direto em inglês acrescentando ?lang=en ao endereço. “GIRO” e “GIRO Confiança” continuam em português, e os valores aparecem no formato americano quando o site está em inglês.</w:t>
-      </w:r>
-    </w:p>
-    <w:p>
-      <w:pPr>
-        <w:rPr>
-          <w:rFonts w:ascii="Times New Roman" w:eastAsia="Times New Roman" w:hAnsi="Times New Roman" w:cs="Times New Roman"/>
-        </w:rPr>
-      </w:pPr>
-    </w:p>
-    <w:p>
-      <w:pPr>
-        <w:rPr>
-          <w:rFonts w:ascii="Times New Roman" w:eastAsia="Times New Roman" w:hAnsi="Times New Roman" w:cs="Times New Roman"/>
-          <w:b/>
-          <w:bCs/>
-        </w:rPr>
-      </w:pPr>
-      <w:r>
-        <w:rPr>
-          <w:rFonts w:ascii="Times New Roman" w:eastAsia="Times New Roman" w:hAnsi="Times New Roman" w:cs="Times New Roman"/>
-          <w:b/>
-          <w:bCs/>
-        </w:rPr>
-        <w:t>Endereços</w:t>
-      </w:r>
-    </w:p>
-    <w:p>
-      <w:pPr>
-        <w:rPr>
-          <w:rFonts w:ascii="Times New Roman" w:eastAsia="Times New Roman" w:hAnsi="Times New Roman" w:cs="Times New Roman"/>
-        </w:rPr>
-      </w:pPr>
-    </w:p>
-    <w:tbl>
-      <w:tblPr>
-        <w:tblW w:type="auto" w:w="0"/>
-        <w:tblLook w:firstColumn="1" w:firstRow="1" w:lastColumn="0" w:lastRow="0" w:noHBand="0" w:noVBand="1" w:val="04A0"/>
-      </w:tblPr>
-      <w:tblGrid>
-        <w:gridCol w:w="3010"/>
-        <w:gridCol w:w="3010"/>
-        <w:gridCol w:w="3010"/>
-      </w:tblGrid>
-      <w:tr>
-        <w:tc>
-          <w:tcPr>
-            <w:tcW w:type="dxa" w:w="3010"/>
-            <w:tcBorders>
-              <w:top w:val="single" w:sz="6" w:color="9DB8AA"/>
-              <w:left w:val="single" w:sz="6" w:color="9DB8AA"/>
-              <w:bottom w:val="single" w:sz="6" w:color="9DB8AA"/>
-              <w:right w:val="single" w:sz="6" w:color="9DB8AA"/>
-            </w:tcBorders>
-            <w:shd w:val="clear" w:fill="E3F2EA"/>
-          </w:tcPr>
-          <w:p>
-            <w:r/>
-            <w:r>
-              <w:rPr>
-                <w:rFonts w:ascii="Times New Roman" w:hAnsi="Times New Roman"/>
-                <w:b/>
-                <w:sz w:val="22"/>
-              </w:rPr>
-              <w:t>Endereço</w:t>
-            </w:r>
-          </w:p>
-        </w:tc>
-        <w:tc>
-          <w:tcPr>
-            <w:tcW w:type="dxa" w:w="3010"/>
-            <w:tcBorders>
-              <w:top w:val="single" w:sz="6" w:color="9DB8AA"/>
-              <w:left w:val="single" w:sz="6" w:color="9DB8AA"/>
-              <w:bottom w:val="single" w:sz="6" w:color="9DB8AA"/>
-              <w:right w:val="single" w:sz="6" w:color="9DB8AA"/>
-            </w:tcBorders>
-            <w:shd w:val="clear" w:fill="E3F2EA"/>
-          </w:tcPr>
-          <w:p>
-            <w:r/>
-            <w:r>
-              <w:rPr>
-                <w:rFonts w:ascii="Times New Roman" w:hAnsi="Times New Roman"/>
-                <w:b/>
-                <w:sz w:val="22"/>
-              </w:rPr>
-              <w:t>Para quê</w:t>
-            </w:r>
-          </w:p>
-        </w:tc>
-        <w:tc>
-          <w:tcPr>
-            <w:tcW w:type="dxa" w:w="3010"/>
-            <w:tcBorders>
-              <w:top w:val="single" w:sz="6" w:color="9DB8AA"/>
-              <w:left w:val="single" w:sz="6" w:color="9DB8AA"/>
-              <w:bottom w:val="single" w:sz="6" w:color="9DB8AA"/>
-              <w:right w:val="single" w:sz="6" w:color="9DB8AA"/>
-            </w:tcBorders>
-            <w:shd w:val="clear" w:fill="E3F2EA"/>
-          </w:tcPr>
-          <w:p>
-            <w:r/>
-            <w:r>
-              <w:rPr>
-                <w:rFonts w:ascii="Times New Roman" w:hAnsi="Times New Roman"/>
-                <w:b/>
-                <w:sz w:val="22"/>
-              </w:rPr>
-              <w:t>Observação</w:t>
-            </w:r>
-          </w:p>
-        </w:tc>
-      </w:tr>
-      <w:tr>
-        <w:tc>
-          <w:tcPr>
-            <w:tcW w:type="dxa" w:w="3010"/>
-            <w:tcBorders>
-              <w:top w:val="single" w:sz="6" w:color="9DB8AA"/>
-              <w:left w:val="single" w:sz="6" w:color="9DB8AA"/>
-              <w:bottom w:val="single" w:sz="6" w:color="9DB8AA"/>
-              <w:right w:val="single" w:sz="6" w:color="9DB8AA"/>
-            </w:tcBorders>
-          </w:tcPr>
-          <w:p>
-            <w:r/>
-            <w:r>
-              <w:rPr>
-                <w:rFonts w:ascii="Times New Roman" w:hAnsi="Times New Roman"/>
-                <w:b w:val="0"/>
-                <w:sz w:val="22"/>
-              </w:rPr>
-              <w:t>https://giro-demo-oyy1.onrender.com</w:t>
-            </w:r>
-          </w:p>
-        </w:tc>
-        <w:tc>
-          <w:tcPr>
-            <w:tcW w:type="dxa" w:w="3010"/>
-            <w:tcBorders>
-              <w:top w:val="single" w:sz="6" w:color="9DB8AA"/>
-              <w:left w:val="single" w:sz="6" w:color="9DB8AA"/>
-              <w:bottom w:val="single" w:sz="6" w:color="9DB8AA"/>
-              <w:right w:val="single" w:sz="6" w:color="9DB8AA"/>
-            </w:tcBorders>
-          </w:tcPr>
-          <w:p>
-            <w:r/>
-            <w:r>
-              <w:rPr>
-                <w:rFonts w:ascii="Times New Roman" w:hAnsi="Times New Roman"/>
-                <w:b w:val="0"/>
-                <w:sz w:val="22"/>
-              </w:rPr>
-              <w:t>Demonstração pública</w:t>
-            </w:r>
-          </w:p>
-        </w:tc>
-        <w:tc>
-          <w:tcPr>
-            <w:tcW w:type="dxa" w:w="3010"/>
-            <w:tcBorders>
-              <w:top w:val="single" w:sz="6" w:color="9DB8AA"/>
-              <w:left w:val="single" w:sz="6" w:color="9DB8AA"/>
-              <w:bottom w:val="single" w:sz="6" w:color="9DB8AA"/>
-              <w:right w:val="single" w:sz="6" w:color="9DB8AA"/>
-            </w:tcBorders>
-          </w:tcPr>
-          <w:p>
-            <w:r/>
-            <w:r>
-              <w:rPr>
-                <w:rFonts w:ascii="Times New Roman" w:hAnsi="Times New Roman"/>
-                <w:b w:val="0"/>
-                <w:sz w:val="22"/>
-              </w:rPr>
-              <w:t>Fica no ar sem o computador ligado; dados fictícios</w:t>
-            </w:r>
-          </w:p>
-        </w:tc>
-      </w:tr>
-      <w:tr>
-        <w:tc>
-          <w:tcPr>
-            <w:tcW w:type="dxa" w:w="3010"/>
-            <w:tcBorders>
-              <w:top w:val="single" w:sz="6" w:color="9DB8AA"/>
-              <w:left w:val="single" w:sz="6" w:color="9DB8AA"/>
-              <w:bottom w:val="single" w:sz="6" w:color="9DB8AA"/>
-              <w:right w:val="single" w:sz="6" w:color="9DB8AA"/>
-            </w:tcBorders>
-          </w:tcPr>
-          <w:p>
-            <w:r/>
-            <w:r>
-              <w:rPr>
-                <w:rFonts w:ascii="Times New Roman" w:hAnsi="Times New Roman"/>
-                <w:b w:val="0"/>
-                <w:sz w:val="22"/>
-              </w:rPr>
-              <w:t>https://desktop-jg2rfmg.tail00f1d9.ts.net</w:t>
-            </w:r>
-          </w:p>
-        </w:tc>
-        <w:tc>
-          <w:tcPr>
-            <w:tcW w:type="dxa" w:w="3010"/>
-            <w:tcBorders>
-              <w:top w:val="single" w:sz="6" w:color="9DB8AA"/>
-              <w:left w:val="single" w:sz="6" w:color="9DB8AA"/>
-              <w:bottom w:val="single" w:sz="6" w:color="9DB8AA"/>
-              <w:right w:val="single" w:sz="6" w:color="9DB8AA"/>
-            </w:tcBorders>
-          </w:tcPr>
-          <w:p>
-            <w:r/>
-            <w:r>
-              <w:rPr>
-                <w:rFonts w:ascii="Times New Roman" w:hAnsi="Times New Roman"/>
-                <w:b w:val="0"/>
-                <w:sz w:val="22"/>
-              </w:rPr>
-              <w:t>Link fixo do grupo</w:t>
-            </w:r>
-          </w:p>
-        </w:tc>
-        <w:tc>
-          <w:tcPr>
-            <w:tcW w:type="dxa" w:w="3010"/>
-            <w:tcBorders>
-              <w:top w:val="single" w:sz="6" w:color="9DB8AA"/>
-              <w:left w:val="single" w:sz="6" w:color="9DB8AA"/>
-              <w:bottom w:val="single" w:sz="6" w:color="9DB8AA"/>
-              <w:right w:val="single" w:sz="6" w:color="9DB8AA"/>
-            </w:tcBorders>
-          </w:tcPr>
-          <w:p>
-            <w:r/>
-            <w:r>
-              <w:rPr>
-                <w:rFonts w:ascii="Times New Roman" w:hAnsi="Times New Roman"/>
-                <w:b w:val="0"/>
-                <w:sz w:val="22"/>
-              </w:rPr>
-              <w:t>Precisa do computador ligado com npm run publico</w:t>
-            </w:r>
-          </w:p>
-        </w:tc>
-      </w:tr>
-      <w:tr>
-        <w:tc>
-          <w:tcPr>
-            <w:tcW w:type="dxa" w:w="3010"/>
-            <w:tcBorders>
-              <w:top w:val="single" w:sz="6" w:color="9DB8AA"/>
-              <w:left w:val="single" w:sz="6" w:color="9DB8AA"/>
-              <w:bottom w:val="single" w:sz="6" w:color="9DB8AA"/>
-              <w:right w:val="single" w:sz="6" w:color="9DB8AA"/>
-            </w:tcBorders>
-          </w:tcPr>
-          <w:p>
-            <w:r/>
-            <w:r>
-              <w:rPr>
-                <w:rFonts w:ascii="Times New Roman" w:hAnsi="Times New Roman"/>
-                <w:b w:val="0"/>
-                <w:sz w:val="22"/>
-              </w:rPr>
-              <w:t>https://github.com/vaz-123ale/giro</w:t>
-            </w:r>
-          </w:p>
-        </w:tc>
-        <w:tc>
-          <w:tcPr>
-            <w:tcW w:type="dxa" w:w="3010"/>
-            <w:tcBorders>
-              <w:top w:val="single" w:sz="6" w:color="9DB8AA"/>
-              <w:left w:val="single" w:sz="6" w:color="9DB8AA"/>
-              <w:bottom w:val="single" w:sz="6" w:color="9DB8AA"/>
-              <w:right w:val="single" w:sz="6" w:color="9DB8AA"/>
-            </w:tcBorders>
-          </w:tcPr>
-          <w:p>
-            <w:r/>
-            <w:r>
-              <w:rPr>
-                <w:rFonts w:ascii="Times New Roman" w:hAnsi="Times New Roman"/>
-                <w:b w:val="0"/>
-                <w:sz w:val="22"/>
-              </w:rPr>
-              <w:t>Código-fonte</w:t>
-            </w:r>
-          </w:p>
-        </w:tc>
-        <w:tc>
-          <w:tcPr>
-            <w:tcW w:type="dxa" w:w="3010"/>
-            <w:tcBorders>
-              <w:top w:val="single" w:sz="6" w:color="9DB8AA"/>
-              <w:left w:val="single" w:sz="6" w:color="9DB8AA"/>
-              <w:bottom w:val="single" w:sz="6" w:color="9DB8AA"/>
-              <w:right w:val="single" w:sz="6" w:color="9DB8AA"/>
-            </w:tcBorders>
-          </w:tcPr>
-          <w:p>
-            <w:r/>
-            <w:r>
-              <w:rPr>
-                <w:rFonts w:ascii="Times New Roman" w:hAnsi="Times New Roman"/>
-                <w:b w:val="0"/>
-                <w:sz w:val="22"/>
-              </w:rPr>
-              <w:t>Licença MIT</w:t>
-            </w:r>
-          </w:p>
-        </w:tc>
-      </w:tr>
-    </w:tbl>
     <w:sectPr>
       <w:footerReference w:type="default" r:id="rId10"/>
       <w:pgSz w:w="11909" w:h="16834"/>

</xml_diff>